<commit_message>
Tara, een Hondenleven: story bible v4
Tara kiest Lode met een kwispel en haar liedje, het ochtendlied met iets
in de mond als doorlopende draad tot de ochtend van de operatie, elke
avond iets mee naar de mand, epiloog in Lodes stem, GAS-boete via de
gemeente na vaststelling door de boswachter, namen definitief.

Co-Authored-By: Claude Opus 5.5 <noreply@anthropic.com>
Claude-Session: https://claude.ai/code/session_011xXeHb7kuJsamVtPUp8TTz
</commit_message>
<xml_diff>
--- a/tara-een-hondenleven/story-bible/Story_Bible_Tara_een_Hondenleven.docx
+++ b/tara-een-hondenleven/story-bible/Story_Bible_Tara_een_Hondenleven.docx
@@ -45,7 +45,7 @@
         <w:t xml:space="preserve"> </w:t>
       </w:r>
       <w:r>
-        <w:t xml:space="preserve">3</w:t>
+        <w:t xml:space="preserve">4</w:t>
       </w:r>
       <w:r>
         <w:t xml:space="preserve"> </w:t>
@@ -344,6 +344,144 @@
         <w:pStyle w:val="FirstParagraph"/>
       </w:pPr>
       <w:r>
+        <w:rPr>
+          <w:bCs/>
+          <w:b/>
+        </w:rPr>
+        <w:t xml:space="preserve">Nieuw in versie 4,</w:t>
+      </w:r>
+      <w:r>
+        <w:t xml:space="preserve"> </w:t>
+      </w:r>
+      <w:r>
+        <w:t xml:space="preserve">op aanwijzing van de auteur:</w:t>
+      </w:r>
+    </w:p>
+    <w:p>
+      <w:pPr>
+        <w:numPr>
+          <w:ilvl w:val="0"/>
+          <w:numId w:val="1003"/>
+        </w:numPr>
+        <w:pStyle w:val="Compact"/>
+      </w:pPr>
+      <w:r>
+        <w:rPr>
+          <w:bCs/>
+          <w:b/>
+        </w:rPr>
+        <w:t xml:space="preserve">Tara kiest Lode,</w:t>
+      </w:r>
+      <w:r>
+        <w:t xml:space="preserve"> </w:t>
+      </w:r>
+      <w:r>
+        <w:t xml:space="preserve">niet omgekeerd. Bij de fokker kwispelt ze en zingt ze haar eigen liedje.</w:t>
+      </w:r>
+    </w:p>
+    <w:p>
+      <w:pPr>
+        <w:numPr>
+          <w:ilvl w:val="0"/>
+          <w:numId w:val="1003"/>
+        </w:numPr>
+        <w:pStyle w:val="Compact"/>
+      </w:pPr>
+      <w:r>
+        <w:rPr>
+          <w:bCs/>
+          <w:b/>
+        </w:rPr>
+        <w:t xml:space="preserve">Het liedje.</w:t>
+      </w:r>
+      <w:r>
+        <w:t xml:space="preserve"> </w:t>
+      </w:r>
+      <w:r>
+        <w:t xml:space="preserve">Ze blijft het haar hele leven zingen, elke ochtend, omdat ze weet dat er eten komt. Later ontdekt Lode dat ze altijd iets in haar mond heeft als ze zingt. Neem je het uit haar mond, dan stopt het lied.</w:t>
+      </w:r>
+    </w:p>
+    <w:p>
+      <w:pPr>
+        <w:numPr>
+          <w:ilvl w:val="0"/>
+          <w:numId w:val="1003"/>
+        </w:numPr>
+        <w:pStyle w:val="Compact"/>
+      </w:pPr>
+      <w:r>
+        <w:rPr>
+          <w:bCs/>
+          <w:b/>
+        </w:rPr>
+        <w:t xml:space="preserve">Iets mee naar bed.</w:t>
+      </w:r>
+      <w:r>
+        <w:t xml:space="preserve"> </w:t>
+      </w:r>
+      <w:r>
+        <w:t xml:space="preserve">Tara neemt elke avond iets mee naar haar mand.</w:t>
+      </w:r>
+    </w:p>
+    <w:p>
+      <w:pPr>
+        <w:numPr>
+          <w:ilvl w:val="0"/>
+          <w:numId w:val="1003"/>
+        </w:numPr>
+        <w:pStyle w:val="Compact"/>
+      </w:pPr>
+      <w:r>
+        <w:rPr>
+          <w:bCs/>
+          <w:b/>
+        </w:rPr>
+        <w:t xml:space="preserve">De namen zijn definitief.</w:t>
+      </w:r>
+    </w:p>
+    <w:p>
+      <w:pPr>
+        <w:numPr>
+          <w:ilvl w:val="0"/>
+          <w:numId w:val="1003"/>
+        </w:numPr>
+        <w:pStyle w:val="Compact"/>
+      </w:pPr>
+      <w:r>
+        <w:rPr>
+          <w:bCs/>
+          <w:b/>
+        </w:rPr>
+        <w:t xml:space="preserve">De epiloog staat in Lodes stem.</w:t>
+      </w:r>
+    </w:p>
+    <w:p>
+      <w:pPr>
+        <w:numPr>
+          <w:ilvl w:val="0"/>
+          <w:numId w:val="1003"/>
+        </w:numPr>
+        <w:pStyle w:val="Compact"/>
+      </w:pPr>
+      <w:r>
+        <w:rPr>
+          <w:bCs/>
+          <w:b/>
+        </w:rPr>
+        <w:t xml:space="preserve">De boswachter stelt de overtreding vast;</w:t>
+      </w:r>
+      <w:r>
+        <w:t xml:space="preserve"> </w:t>
+      </w:r>
+      <w:r>
+        <w:t xml:space="preserve">via de gemeente volgt een GAS-boete.</w:t>
+      </w:r>
+    </w:p>
+    <w:p>
+      <w:pPr>
+        <w:pStyle w:val="FirstParagraph"/>
+      </w:pPr>
+      <w:r>
         <w:t xml:space="preserve">Sectie 18 geeft een volledig overzicht van de wijzigingen.</w:t>
       </w:r>
     </w:p>
@@ -378,7 +516,7 @@
       <w:pPr>
         <w:numPr>
           <w:ilvl w:val="0"/>
-          <w:numId w:val="1003"/>
+          <w:numId w:val="1004"/>
         </w:numPr>
         <w:pStyle w:val="Compact"/>
       </w:pPr>
@@ -397,7 +535,7 @@
       <w:pPr>
         <w:numPr>
           <w:ilvl w:val="0"/>
-          <w:numId w:val="1003"/>
+          <w:numId w:val="1004"/>
         </w:numPr>
         <w:pStyle w:val="Compact"/>
       </w:pPr>
@@ -426,7 +564,7 @@
       <w:pPr>
         <w:numPr>
           <w:ilvl w:val="0"/>
-          <w:numId w:val="1004"/>
+          <w:numId w:val="1005"/>
         </w:numPr>
         <w:pStyle w:val="Compact"/>
       </w:pPr>
@@ -452,7 +590,7 @@
       <w:pPr>
         <w:numPr>
           <w:ilvl w:val="0"/>
-          <w:numId w:val="1004"/>
+          <w:numId w:val="1005"/>
         </w:numPr>
         <w:pStyle w:val="Compact"/>
       </w:pPr>
@@ -478,7 +616,7 @@
       <w:pPr>
         <w:numPr>
           <w:ilvl w:val="0"/>
-          <w:numId w:val="1004"/>
+          <w:numId w:val="1005"/>
         </w:numPr>
         <w:pStyle w:val="Compact"/>
       </w:pPr>
@@ -1479,7 +1617,7 @@
       <w:pPr>
         <w:numPr>
           <w:ilvl w:val="0"/>
-          <w:numId w:val="1005"/>
+          <w:numId w:val="1006"/>
         </w:numPr>
         <w:pStyle w:val="Compact"/>
       </w:pPr>
@@ -1516,7 +1654,7 @@
       <w:pPr>
         <w:numPr>
           <w:ilvl w:val="0"/>
-          <w:numId w:val="1005"/>
+          <w:numId w:val="1006"/>
         </w:numPr>
         <w:pStyle w:val="Compact"/>
       </w:pPr>
@@ -1685,7 +1823,7 @@
       <w:pPr>
         <w:numPr>
           <w:ilvl w:val="0"/>
-          <w:numId w:val="1006"/>
+          <w:numId w:val="1007"/>
         </w:numPr>
         <w:pStyle w:val="Compact"/>
       </w:pPr>
@@ -1697,7 +1835,7 @@
       <w:pPr>
         <w:numPr>
           <w:ilvl w:val="0"/>
-          <w:numId w:val="1006"/>
+          <w:numId w:val="1007"/>
         </w:numPr>
         <w:pStyle w:val="Compact"/>
       </w:pPr>
@@ -1709,7 +1847,7 @@
       <w:pPr>
         <w:numPr>
           <w:ilvl w:val="0"/>
-          <w:numId w:val="1006"/>
+          <w:numId w:val="1007"/>
         </w:numPr>
         <w:pStyle w:val="Compact"/>
       </w:pPr>
@@ -1721,7 +1859,7 @@
       <w:pPr>
         <w:numPr>
           <w:ilvl w:val="0"/>
-          <w:numId w:val="1006"/>
+          <w:numId w:val="1007"/>
         </w:numPr>
         <w:pStyle w:val="Compact"/>
       </w:pPr>
@@ -1733,7 +1871,7 @@
       <w:pPr>
         <w:numPr>
           <w:ilvl w:val="0"/>
-          <w:numId w:val="1006"/>
+          <w:numId w:val="1007"/>
         </w:numPr>
         <w:pStyle w:val="Compact"/>
       </w:pPr>
@@ -1745,7 +1883,7 @@
       <w:pPr>
         <w:numPr>
           <w:ilvl w:val="0"/>
-          <w:numId w:val="1006"/>
+          <w:numId w:val="1007"/>
         </w:numPr>
         <w:pStyle w:val="Compact"/>
       </w:pPr>
@@ -2162,7 +2300,7 @@
       <w:pPr>
         <w:numPr>
           <w:ilvl w:val="0"/>
-          <w:numId w:val="1007"/>
+          <w:numId w:val="1008"/>
         </w:numPr>
         <w:pStyle w:val="Compact"/>
       </w:pPr>
@@ -2184,7 +2322,7 @@
       <w:pPr>
         <w:numPr>
           <w:ilvl w:val="0"/>
-          <w:numId w:val="1007"/>
+          <w:numId w:val="1008"/>
         </w:numPr>
         <w:pStyle w:val="Compact"/>
       </w:pPr>
@@ -2206,7 +2344,7 @@
       <w:pPr>
         <w:numPr>
           <w:ilvl w:val="0"/>
-          <w:numId w:val="1007"/>
+          <w:numId w:val="1008"/>
         </w:numPr>
         <w:pStyle w:val="Compact"/>
       </w:pPr>
@@ -2228,7 +2366,7 @@
       <w:pPr>
         <w:numPr>
           <w:ilvl w:val="0"/>
-          <w:numId w:val="1007"/>
+          <w:numId w:val="1008"/>
         </w:numPr>
         <w:pStyle w:val="Compact"/>
       </w:pPr>
@@ -2244,6 +2382,90 @@
       </w:r>
       <w:r>
         <w:t xml:space="preserve">is haar wereld en haar wetenschap. Daarom is het einde zo wreed: precies dat instrument wordt ziek.</w:t>
+      </w:r>
+    </w:p>
+    <w:p>
+      <w:pPr>
+        <w:numPr>
+          <w:ilvl w:val="0"/>
+          <w:numId w:val="1008"/>
+        </w:numPr>
+        <w:pStyle w:val="Compact"/>
+      </w:pPr>
+      <w:r>
+        <w:rPr>
+          <w:bCs/>
+          <w:b/>
+        </w:rPr>
+        <w:t xml:space="preserve">Haar liedje.</w:t>
+      </w:r>
+      <w:r>
+        <w:t xml:space="preserve"> </w:t>
+      </w:r>
+      <w:r>
+        <w:t xml:space="preserve">Als ze blij is, zingt ze: een hoog, golvend gejodel uit haar keel, half gejank en half gezang. Niemand anders doet het zo. Ze zong het al bij de fokker, toen ze Lode koos. Daarna zingt ze het elke ochtend, wanneer ze Lode op de trap hoort en weet dat het ontbijt komt. Ze zingt alleen met iets in haar mond: een stro, een sok, een pantoffel, later de rode bal. Neem je het uit haar mond, dan stopt het lied. Geef je het terug, dan begint het weer. Dat is echt Labradorgedrag: retrievers zijn gefokt om iets zacht in de bek te dragen, en veel van hen begroeten hun mens met een</w:t>
+      </w:r>
+      <w:r>
+        <w:t xml:space="preserve"> </w:t>
+      </w:r>
+      <w:r>
+        <w:t xml:space="preserve">“</w:t>
+      </w:r>
+      <w:r>
+        <w:t xml:space="preserve">buit</w:t>
+      </w:r>
+      <w:r>
+        <w:t xml:space="preserve">”</w:t>
+      </w:r>
+      <w:r>
+        <w:t xml:space="preserve"> </w:t>
+      </w:r>
+      <w:r>
+        <w:t xml:space="preserve">in de mond.</w:t>
+      </w:r>
+    </w:p>
+    <w:p>
+      <w:pPr>
+        <w:numPr>
+          <w:ilvl w:val="0"/>
+          <w:numId w:val="1008"/>
+        </w:numPr>
+        <w:pStyle w:val="Compact"/>
+      </w:pPr>
+      <w:r>
+        <w:rPr>
+          <w:bCs/>
+          <w:b/>
+        </w:rPr>
+        <w:t xml:space="preserve">Iets mee naar bed.</w:t>
+      </w:r>
+      <w:r>
+        <w:t xml:space="preserve"> </w:t>
+      </w:r>
+      <w:r>
+        <w:t xml:space="preserve">Elke avond neemt ze iets mee naar haar mand: eerst het dekentje uit de auto, later Lodes pantoffel, nog later de rode bal. Ze slaapt er met haar kin op.</w:t>
+      </w:r>
+    </w:p>
+    <w:p>
+      <w:pPr>
+        <w:numPr>
+          <w:ilvl w:val="0"/>
+          <w:numId w:val="1008"/>
+        </w:numPr>
+        <w:pStyle w:val="Compact"/>
+      </w:pPr>
+      <w:r>
+        <w:rPr>
+          <w:bCs/>
+          <w:b/>
+        </w:rPr>
+        <w:t xml:space="preserve">Tara onderzoekt zichzelf, en begrijpt zichzelf niet.</w:t>
+      </w:r>
+      <w:r>
+        <w:t xml:space="preserve"> </w:t>
+      </w:r>
+      <w:r>
+        <w:t xml:space="preserve">Het liedje is het enige gedrag dat ze nooit kan verklaren (dossier 2). Dat maakt haar een feilbare en ontroerende onderzoeker.</w:t>
       </w:r>
     </w:p>
     <w:bookmarkEnd w:id="29"/>
@@ -2425,31 +2647,31 @@
               <w:jc w:val="left"/>
             </w:pPr>
             <w:r>
-              <w:t xml:space="preserve">4</w:t>
-            </w:r>
-          </w:p>
-        </w:tc>
-        <w:tc>
-          <w:tcPr/>
-          <w:p>
-            <w:pPr>
-              <w:pStyle w:val="Compact"/>
-              <w:jc w:val="left"/>
-            </w:pPr>
-            <w:r>
-              <w:t xml:space="preserve">Doet iets wat hij zelf niet begrijpt</w:t>
-            </w:r>
-          </w:p>
-        </w:tc>
-        <w:tc>
-          <w:tcPr/>
-          <w:p>
-            <w:pPr>
-              <w:pStyle w:val="Compact"/>
-              <w:jc w:val="left"/>
-            </w:pPr>
-            <w:r>
-              <w:t xml:space="preserve">De pup piept in de bench. Hij legt zich met zijn deken op de keukenvloer, met een hand door de spijlen. Later maakt hij er een principe van:</w:t>
+              <w:t xml:space="preserve">3</w:t>
+            </w:r>
+          </w:p>
+        </w:tc>
+        <w:tc>
+          <w:tcPr/>
+          <w:p>
+            <w:pPr>
+              <w:pStyle w:val="Compact"/>
+              <w:jc w:val="left"/>
+            </w:pPr>
+            <w:r>
+              <w:t xml:space="preserve">Hij wordt gekozen</w:t>
+            </w:r>
+          </w:p>
+        </w:tc>
+        <w:tc>
+          <w:tcPr/>
+          <w:p>
+            <w:pPr>
+              <w:pStyle w:val="Compact"/>
+              <w:jc w:val="left"/>
+            </w:pPr>
+            <w:r>
+              <w:t xml:space="preserve">Hij komt</w:t>
             </w:r>
             <w:r>
               <w:t xml:space="preserve"> </w:t>
@@ -2458,7 +2680,25 @@
               <w:t xml:space="preserve">“</w:t>
             </w:r>
             <w:r>
-              <w:t xml:space="preserve">De eerste nacht slaapt ge bij uw pup. Ze heeft net haar hele roedel verloren.</w:t>
+              <w:t xml:space="preserve">een pup uitkiezen</w:t>
+            </w:r>
+            <w:r>
+              <w:t xml:space="preserve">”</w:t>
+            </w:r>
+            <w:r>
+              <w:t xml:space="preserve"> </w:t>
+            </w:r>
+            <w:r>
+              <w:t xml:space="preserve">en heeft een lijstje met vragen. Eén pup komt naar hem toe, kwispelend, met een strootje in de bek, en zingt. Hij scheurt het lijstje niet, maar hij gebruikt het ook niet meer. In de auto zegt hij tegen niemand:</w:t>
+            </w:r>
+            <w:r>
+              <w:t xml:space="preserve"> </w:t>
+            </w:r>
+            <w:r>
+              <w:t xml:space="preserve">“</w:t>
+            </w:r>
+            <w:r>
+              <w:t xml:space="preserve">Zij heeft mij gekozen.</w:t>
             </w:r>
             <w:r>
               <w:t xml:space="preserve">”</w:t>
@@ -2475,31 +2715,31 @@
               <w:jc w:val="left"/>
             </w:pPr>
             <w:r>
-              <w:t xml:space="preserve">5</w:t>
-            </w:r>
-          </w:p>
-        </w:tc>
-        <w:tc>
-          <w:tcPr/>
-          <w:p>
-            <w:pPr>
-              <w:pStyle w:val="Compact"/>
-              <w:jc w:val="left"/>
-            </w:pPr>
-            <w:r>
-              <w:t xml:space="preserve">Ongeduld</w:t>
-            </w:r>
-          </w:p>
-        </w:tc>
-        <w:tc>
-          <w:tcPr/>
-          <w:p>
-            <w:pPr>
-              <w:pStyle w:val="Compact"/>
-              <w:jc w:val="left"/>
-            </w:pPr>
-            <w:r>
-              <w:t xml:space="preserve">Hij roept</w:t>
+              <w:t xml:space="preserve">4</w:t>
+            </w:r>
+          </w:p>
+        </w:tc>
+        <w:tc>
+          <w:tcPr/>
+          <w:p>
+            <w:pPr>
+              <w:pStyle w:val="Compact"/>
+              <w:jc w:val="left"/>
+            </w:pPr>
+            <w:r>
+              <w:t xml:space="preserve">Doet iets wat hij zelf niet begrijpt</w:t>
+            </w:r>
+          </w:p>
+        </w:tc>
+        <w:tc>
+          <w:tcPr/>
+          <w:p>
+            <w:pPr>
+              <w:pStyle w:val="Compact"/>
+              <w:jc w:val="left"/>
+            </w:pPr>
+            <w:r>
+              <w:t xml:space="preserve">De pup piept in de bench. Hij legt zich met zijn deken op de keukenvloer, met een hand door de spijlen. Later maakt hij er een principe van:</w:t>
             </w:r>
             <w:r>
               <w:t xml:space="preserve"> </w:t>
@@ -2508,34 +2748,10 @@
               <w:t xml:space="preserve">“</w:t>
             </w:r>
             <w:r>
-              <w:t xml:space="preserve">NEE</w:t>
+              <w:t xml:space="preserve">De eerste nacht slaapt ge bij uw pup. Ze heeft net haar hele roedel verloren.</w:t>
             </w:r>
             <w:r>
               <w:t xml:space="preserve">”</w:t>
-            </w:r>
-            <w:r>
-              <w:t xml:space="preserve"> </w:t>
-            </w:r>
-            <w:r>
-              <w:t xml:space="preserve">en</w:t>
-            </w:r>
-            <w:r>
-              <w:t xml:space="preserve"> </w:t>
-            </w:r>
-            <w:r>
-              <w:t xml:space="preserve">“</w:t>
-            </w:r>
-            <w:r>
-              <w:t xml:space="preserve">POOT</w:t>
-            </w:r>
-            <w:r>
-              <w:t xml:space="preserve">”</w:t>
-            </w:r>
-            <w:r>
-              <w:t xml:space="preserve"> </w:t>
-            </w:r>
-            <w:r>
-              <w:t xml:space="preserve">steeds harder; Tara begrijpt er niets van. Mieke doet het één keer rustig met een koekje, en het lukt. Hij moppert, en oefent die avond stiekem in de keuken.</w:t>
             </w:r>
           </w:p>
         </w:tc>
@@ -2549,31 +2765,31 @@
               <w:jc w:val="left"/>
             </w:pPr>
             <w:r>
-              <w:t xml:space="preserve">7</w:t>
-            </w:r>
-          </w:p>
-        </w:tc>
-        <w:tc>
-          <w:tcPr/>
-          <w:p>
-            <w:pPr>
-              <w:pStyle w:val="Compact"/>
-              <w:jc w:val="left"/>
-            </w:pPr>
-            <w:r>
-              <w:t xml:space="preserve">Strengheid mislukt</w:t>
-            </w:r>
-          </w:p>
-        </w:tc>
-        <w:tc>
-          <w:tcPr/>
-          <w:p>
-            <w:pPr>
-              <w:pStyle w:val="Compact"/>
-              <w:jc w:val="left"/>
-            </w:pPr>
-            <w:r>
-              <w:t xml:space="preserve">Hij leest over</w:t>
+              <w:t xml:space="preserve">5</w:t>
+            </w:r>
+          </w:p>
+        </w:tc>
+        <w:tc>
+          <w:tcPr/>
+          <w:p>
+            <w:pPr>
+              <w:pStyle w:val="Compact"/>
+              <w:jc w:val="left"/>
+            </w:pPr>
+            <w:r>
+              <w:t xml:space="preserve">Ongeduld</w:t>
+            </w:r>
+          </w:p>
+        </w:tc>
+        <w:tc>
+          <w:tcPr/>
+          <w:p>
+            <w:pPr>
+              <w:pStyle w:val="Compact"/>
+              <w:jc w:val="left"/>
+            </w:pPr>
+            <w:r>
+              <w:t xml:space="preserve">Hij roept</w:t>
             </w:r>
             <w:r>
               <w:t xml:space="preserve"> </w:t>
@@ -2582,7 +2798,7 @@
               <w:t xml:space="preserve">“</w:t>
             </w:r>
             <w:r>
-              <w:t xml:space="preserve">de alfa</w:t>
+              <w:t xml:space="preserve">NEE</w:t>
             </w:r>
             <w:r>
               <w:t xml:space="preserve">”</w:t>
@@ -2591,7 +2807,25 @@
               <w:t xml:space="preserve"> </w:t>
             </w:r>
             <w:r>
-              <w:t xml:space="preserve">en probeert het: aan de lijn rukken, streng staren, de opgerolde krant. Tara wordt stil en schrikt van elk ritselend papier. Op een ochtend ziet hij haar wegduiken voor de krant die hij gewoon wil lezen. Hij zegt niets, gooit de krant in de vuilnisbak en leest die dag niet.</w:t>
+              <w:t xml:space="preserve">en</w:t>
+            </w:r>
+            <w:r>
+              <w:t xml:space="preserve"> </w:t>
+            </w:r>
+            <w:r>
+              <w:t xml:space="preserve">“</w:t>
+            </w:r>
+            <w:r>
+              <w:t xml:space="preserve">POOT</w:t>
+            </w:r>
+            <w:r>
+              <w:t xml:space="preserve">”</w:t>
+            </w:r>
+            <w:r>
+              <w:t xml:space="preserve"> </w:t>
+            </w:r>
+            <w:r>
+              <w:t xml:space="preserve">steeds harder; Tara begrijpt er niets van. Mieke doet het één keer rustig met een koekje, en het lukt. Hij moppert, en oefent die avond stiekem in de keuken.</w:t>
             </w:r>
           </w:p>
         </w:tc>
@@ -2605,31 +2839,49 @@
               <w:jc w:val="left"/>
             </w:pPr>
             <w:r>
-              <w:t xml:space="preserve">10</w:t>
-            </w:r>
-          </w:p>
-        </w:tc>
-        <w:tc>
-          <w:tcPr/>
-          <w:p>
-            <w:pPr>
-              <w:pStyle w:val="Compact"/>
-              <w:jc w:val="left"/>
-            </w:pPr>
-            <w:r>
-              <w:t xml:space="preserve">Hij betrapt zichzelf</w:t>
-            </w:r>
-          </w:p>
-        </w:tc>
-        <w:tc>
-          <w:tcPr/>
-          <w:p>
-            <w:pPr>
-              <w:pStyle w:val="Compact"/>
-              <w:jc w:val="left"/>
-            </w:pPr>
-            <w:r>
-              <w:t xml:space="preserve">Hij vindt de kapotte pantoffel en begint te roepen. Midden in de zin stopt hij, ziet haar weggedraaide kop, en gaat naast haar op de grond zitten.</w:t>
+              <w:t xml:space="preserve">7</w:t>
+            </w:r>
+          </w:p>
+        </w:tc>
+        <w:tc>
+          <w:tcPr/>
+          <w:p>
+            <w:pPr>
+              <w:pStyle w:val="Compact"/>
+              <w:jc w:val="left"/>
+            </w:pPr>
+            <w:r>
+              <w:t xml:space="preserve">Strengheid mislukt</w:t>
+            </w:r>
+          </w:p>
+        </w:tc>
+        <w:tc>
+          <w:tcPr/>
+          <w:p>
+            <w:pPr>
+              <w:pStyle w:val="Compact"/>
+              <w:jc w:val="left"/>
+            </w:pPr>
+            <w:r>
+              <w:t xml:space="preserve">Hij leest over</w:t>
+            </w:r>
+            <w:r>
+              <w:t xml:space="preserve"> </w:t>
+            </w:r>
+            <w:r>
+              <w:t xml:space="preserve">“</w:t>
+            </w:r>
+            <w:r>
+              <w:t xml:space="preserve">de alfa</w:t>
+            </w:r>
+            <w:r>
+              <w:t xml:space="preserve">”</w:t>
+            </w:r>
+            <w:r>
+              <w:t xml:space="preserve"> </w:t>
+            </w:r>
+            <w:r>
+              <w:t xml:space="preserve">en probeert het: aan de lijn rukken, streng staren, de opgerolde krant. Tara wordt stil en schrikt van elk ritselend papier. Op een ochtend ziet hij haar wegduiken voor de krant die hij gewoon wil lezen. Hij zegt niets, gooit de krant in de vuilnisbak en leest die dag niet.</w:t>
             </w:r>
           </w:p>
         </w:tc>
@@ -2643,61 +2895,31 @@
               <w:jc w:val="left"/>
             </w:pPr>
             <w:r>
-              <w:t xml:space="preserve">12</w:t>
-            </w:r>
-          </w:p>
-        </w:tc>
-        <w:tc>
-          <w:tcPr/>
-          <w:p>
-            <w:pPr>
-              <w:pStyle w:val="Compact"/>
-              <w:jc w:val="left"/>
-            </w:pPr>
-            <w:r>
-              <w:t xml:space="preserve">Geduld beloond</w:t>
-            </w:r>
-          </w:p>
-        </w:tc>
-        <w:tc>
-          <w:tcPr/>
-          <w:p>
-            <w:pPr>
-              <w:pStyle w:val="Compact"/>
-              <w:jc w:val="left"/>
-            </w:pPr>
-            <w:r>
-              <w:t xml:space="preserve">Maandenlang heeft hij</w:t>
-            </w:r>
-            <w:r>
-              <w:t xml:space="preserve"> </w:t>
-            </w:r>
-            <w:r>
-              <w:t xml:space="preserve">“</w:t>
-            </w:r>
-            <w:r>
-              <w:t xml:space="preserve">plaats</w:t>
-            </w:r>
-            <w:r>
-              <w:t xml:space="preserve">”</w:t>
-            </w:r>
-            <w:r>
-              <w:t xml:space="preserve"> </w:t>
-            </w:r>
-            <w:r>
-              <w:t xml:space="preserve">geoefend, eerst thuis, dan op een leeg terras. Nu ligt Tara rustig op haar kleedje op het volle dorpsplein. Hij zegt tegen de man aan het volgende tafeltje:</w:t>
-            </w:r>
-            <w:r>
-              <w:t xml:space="preserve"> </w:t>
-            </w:r>
-            <w:r>
-              <w:t xml:space="preserve">“</w:t>
-            </w:r>
-            <w:r>
-              <w:t xml:space="preserve">Geduld. Dat is alles.</w:t>
-            </w:r>
-            <w:r>
-              <w:t xml:space="preserve">”</w:t>
+              <w:t xml:space="preserve">10</w:t>
+            </w:r>
+          </w:p>
+        </w:tc>
+        <w:tc>
+          <w:tcPr/>
+          <w:p>
+            <w:pPr>
+              <w:pStyle w:val="Compact"/>
+              <w:jc w:val="left"/>
+            </w:pPr>
+            <w:r>
+              <w:t xml:space="preserve">Hij betrapt zichzelf, en hij ontdekt het lied</w:t>
+            </w:r>
+          </w:p>
+        </w:tc>
+        <w:tc>
+          <w:tcPr/>
+          <w:p>
+            <w:pPr>
+              <w:pStyle w:val="Compact"/>
+              <w:jc w:val="left"/>
+            </w:pPr>
+            <w:r>
+              <w:t xml:space="preserve">Hij vindt de kapotte pantoffel en begint te roepen. Midden in de zin stopt hij, ziet haar weggedraaide kop, en gaat naast haar op de grond zitten. De volgende ochtend zingt ze, met de andere pantoffel in haar bek. Hij neemt de pantoffel af; het lied stopt. Hij geeft hem terug; het lied begint weer. Hij doet het drie keer, en lacht. Het eerste experiment van de proefpersoon dat lukt.</w:t>
             </w:r>
           </w:p>
         </w:tc>
@@ -2711,31 +2933,31 @@
               <w:jc w:val="left"/>
             </w:pPr>
             <w:r>
-              <w:t xml:space="preserve">13</w:t>
-            </w:r>
-          </w:p>
-        </w:tc>
-        <w:tc>
-          <w:tcPr/>
-          <w:p>
-            <w:pPr>
-              <w:pStyle w:val="Compact"/>
-              <w:jc w:val="left"/>
-            </w:pPr>
-            <w:r>
-              <w:t xml:space="preserve">Zijn roedelfilosofie</w:t>
-            </w:r>
-          </w:p>
-        </w:tc>
-        <w:tc>
-          <w:tcPr/>
-          <w:p>
-            <w:pPr>
-              <w:pStyle w:val="Compact"/>
-              <w:jc w:val="left"/>
-            </w:pPr>
-            <w:r>
-              <w:t xml:space="preserve">Na het eten krijgt Tara het laatste stukje vlees van zijn bord.</w:t>
+              <w:t xml:space="preserve">12</w:t>
+            </w:r>
+          </w:p>
+        </w:tc>
+        <w:tc>
+          <w:tcPr/>
+          <w:p>
+            <w:pPr>
+              <w:pStyle w:val="Compact"/>
+              <w:jc w:val="left"/>
+            </w:pPr>
+            <w:r>
+              <w:t xml:space="preserve">Geduld beloond</w:t>
+            </w:r>
+          </w:p>
+        </w:tc>
+        <w:tc>
+          <w:tcPr/>
+          <w:p>
+            <w:pPr>
+              <w:pStyle w:val="Compact"/>
+              <w:jc w:val="left"/>
+            </w:pPr>
+            <w:r>
+              <w:t xml:space="preserve">Maandenlang heeft hij</w:t>
             </w:r>
             <w:r>
               <w:t xml:space="preserve"> </w:t>
@@ -2744,7 +2966,25 @@
               <w:t xml:space="preserve">“</w:t>
             </w:r>
             <w:r>
-              <w:t xml:space="preserve">De leider eet eerst het beste stuk. Maar hij deelt. Dat is een roedel.</w:t>
+              <w:t xml:space="preserve">plaats</w:t>
+            </w:r>
+            <w:r>
+              <w:t xml:space="preserve">”</w:t>
+            </w:r>
+            <w:r>
+              <w:t xml:space="preserve"> </w:t>
+            </w:r>
+            <w:r>
+              <w:t xml:space="preserve">geoefend, eerst thuis, dan op een leeg terras. Nu ligt Tara rustig op haar kleedje op het volle dorpsplein. Hij zegt tegen de man aan het volgende tafeltje:</w:t>
+            </w:r>
+            <w:r>
+              <w:t xml:space="preserve"> </w:t>
+            </w:r>
+            <w:r>
+              <w:t xml:space="preserve">“</w:t>
+            </w:r>
+            <w:r>
+              <w:t xml:space="preserve">Geduld. Dat is alles.</w:t>
             </w:r>
             <w:r>
               <w:t xml:space="preserve">”</w:t>
@@ -2761,31 +3001,31 @@
               <w:jc w:val="left"/>
             </w:pPr>
             <w:r>
-              <w:t xml:space="preserve">16</w:t>
-            </w:r>
-          </w:p>
-        </w:tc>
-        <w:tc>
-          <w:tcPr/>
-          <w:p>
-            <w:pPr>
-              <w:pStyle w:val="Compact"/>
-              <w:jc w:val="left"/>
-            </w:pPr>
-            <w:r>
-              <w:t xml:space="preserve">Tara’s pleitbezorger</w:t>
-            </w:r>
-          </w:p>
-        </w:tc>
-        <w:tc>
-          <w:tcPr/>
-          <w:p>
-            <w:pPr>
-              <w:pStyle w:val="Compact"/>
-              <w:jc w:val="left"/>
-            </w:pPr>
-            <w:r>
-              <w:t xml:space="preserve">Een vreemde buigt over Tara heen en staart haar aan. Nu is het Lode die zegt:</w:t>
+              <w:t xml:space="preserve">13</w:t>
+            </w:r>
+          </w:p>
+        </w:tc>
+        <w:tc>
+          <w:tcPr/>
+          <w:p>
+            <w:pPr>
+              <w:pStyle w:val="Compact"/>
+              <w:jc w:val="left"/>
+            </w:pPr>
+            <w:r>
+              <w:t xml:space="preserve">Zijn roedelfilosofie</w:t>
+            </w:r>
+          </w:p>
+        </w:tc>
+        <w:tc>
+          <w:tcPr/>
+          <w:p>
+            <w:pPr>
+              <w:pStyle w:val="Compact"/>
+              <w:jc w:val="left"/>
+            </w:pPr>
+            <w:r>
+              <w:t xml:space="preserve">Na het eten krijgt Tara het laatste stukje vlees van zijn bord.</w:t>
             </w:r>
             <w:r>
               <w:t xml:space="preserve"> </w:t>
@@ -2794,7 +3034,7 @@
               <w:t xml:space="preserve">“</w:t>
             </w:r>
             <w:r>
-              <w:t xml:space="preserve">Niet over haar heen hangen, ga op uw hurken zitten, kijk een beetje weg. Laat haar eerst ruiken.</w:t>
+              <w:t xml:space="preserve">De leider eet eerst het beste stuk. Maar hij deelt. Dat is een roedel.</w:t>
             </w:r>
             <w:r>
               <w:t xml:space="preserve">”</w:t>
@@ -2811,31 +3051,43 @@
               <w:jc w:val="left"/>
             </w:pPr>
             <w:r>
-              <w:t xml:space="preserve">18</w:t>
-            </w:r>
-          </w:p>
-        </w:tc>
-        <w:tc>
-          <w:tcPr/>
-          <w:p>
-            <w:pPr>
-              <w:pStyle w:val="Compact"/>
-              <w:jc w:val="left"/>
-            </w:pPr>
-            <w:r>
-              <w:t xml:space="preserve">Vertrouwen zonder deur</w:t>
-            </w:r>
-          </w:p>
-        </w:tc>
-        <w:tc>
-          <w:tcPr/>
-          <w:p>
-            <w:pPr>
-              <w:pStyle w:val="Compact"/>
-              <w:jc w:val="left"/>
-            </w:pPr>
-            <w:r>
-              <w:t xml:space="preserve">De slaapkamer is verboden terrein, maar de deur gaat nooit dicht. Hij heeft het haar duizend keer rustig gezegd.</w:t>
+              <w:t xml:space="preserve">16</w:t>
+            </w:r>
+          </w:p>
+        </w:tc>
+        <w:tc>
+          <w:tcPr/>
+          <w:p>
+            <w:pPr>
+              <w:pStyle w:val="Compact"/>
+              <w:jc w:val="left"/>
+            </w:pPr>
+            <w:r>
+              <w:t xml:space="preserve">Tara’s pleitbezorger</w:t>
+            </w:r>
+          </w:p>
+        </w:tc>
+        <w:tc>
+          <w:tcPr/>
+          <w:p>
+            <w:pPr>
+              <w:pStyle w:val="Compact"/>
+              <w:jc w:val="left"/>
+            </w:pPr>
+            <w:r>
+              <w:t xml:space="preserve">Een vreemde buigt over Tara heen en staart haar aan. Nu is het Lode die zegt:</w:t>
+            </w:r>
+            <w:r>
+              <w:t xml:space="preserve"> </w:t>
+            </w:r>
+            <w:r>
+              <w:t xml:space="preserve">“</w:t>
+            </w:r>
+            <w:r>
+              <w:t xml:space="preserve">Niet over haar heen hangen, ga op uw hurken zitten, kijk een beetje weg. Laat haar eerst ruiken.</w:t>
+            </w:r>
+            <w:r>
+              <w:t xml:space="preserve">”</w:t>
             </w:r>
           </w:p>
         </w:tc>
@@ -2849,31 +3101,31 @@
               <w:jc w:val="left"/>
             </w:pPr>
             <w:r>
-              <w:t xml:space="preserve">19</w:t>
-            </w:r>
-          </w:p>
-        </w:tc>
-        <w:tc>
-          <w:tcPr/>
-          <w:p>
-            <w:pPr>
-              <w:pStyle w:val="Compact"/>
-              <w:jc w:val="left"/>
-            </w:pPr>
-            <w:r>
-              <w:t xml:space="preserve">Zijn eigen regels</w:t>
-            </w:r>
-          </w:p>
-        </w:tc>
-        <w:tc>
-          <w:tcPr/>
-          <w:p>
-            <w:pPr>
-              <w:pStyle w:val="Compact"/>
-              <w:jc w:val="left"/>
-            </w:pPr>
-            <w:r>
-              <w:t xml:space="preserve">Lijnplicht en poepzakjes; zie hieronder.</w:t>
+              <w:t xml:space="preserve">18</w:t>
+            </w:r>
+          </w:p>
+        </w:tc>
+        <w:tc>
+          <w:tcPr/>
+          <w:p>
+            <w:pPr>
+              <w:pStyle w:val="Compact"/>
+              <w:jc w:val="left"/>
+            </w:pPr>
+            <w:r>
+              <w:t xml:space="preserve">Vertrouwen zonder deur</w:t>
+            </w:r>
+          </w:p>
+        </w:tc>
+        <w:tc>
+          <w:tcPr/>
+          <w:p>
+            <w:pPr>
+              <w:pStyle w:val="Compact"/>
+              <w:jc w:val="left"/>
+            </w:pPr>
+            <w:r>
+              <w:t xml:space="preserve">De slaapkamer is verboden terrein, maar de deur gaat nooit dicht. Hij heeft het haar duizend keer rustig gezegd.</w:t>
             </w:r>
           </w:p>
         </w:tc>
@@ -2887,31 +3139,31 @@
               <w:jc w:val="left"/>
             </w:pPr>
             <w:r>
-              <w:t xml:space="preserve">23</w:t>
-            </w:r>
-          </w:p>
-        </w:tc>
-        <w:tc>
-          <w:tcPr/>
-          <w:p>
-            <w:pPr>
-              <w:pStyle w:val="Compact"/>
-              <w:jc w:val="left"/>
-            </w:pPr>
-            <w:r>
-              <w:t xml:space="preserve">De spiegel</w:t>
-            </w:r>
-          </w:p>
-        </w:tc>
-        <w:tc>
-          <w:tcPr/>
-          <w:p>
-            <w:pPr>
-              <w:pStyle w:val="Compact"/>
-              <w:jc w:val="left"/>
-            </w:pPr>
-            <w:r>
-              <w:t xml:space="preserve">Hij wandelt al tien jaar elke dag, in alle weer. Zijn bloeddruk is goed. Hij weet niet meer precies waarom hij ooit een hond nam.</w:t>
+              <w:t xml:space="preserve">19</w:t>
+            </w:r>
+          </w:p>
+        </w:tc>
+        <w:tc>
+          <w:tcPr/>
+          <w:p>
+            <w:pPr>
+              <w:pStyle w:val="Compact"/>
+              <w:jc w:val="left"/>
+            </w:pPr>
+            <w:r>
+              <w:t xml:space="preserve">Zijn eigen regels</w:t>
+            </w:r>
+          </w:p>
+        </w:tc>
+        <w:tc>
+          <w:tcPr/>
+          <w:p>
+            <w:pPr>
+              <w:pStyle w:val="Compact"/>
+              <w:jc w:val="left"/>
+            </w:pPr>
+            <w:r>
+              <w:t xml:space="preserve">Lijnplicht en poepzakjes; zie hieronder.</w:t>
             </w:r>
           </w:p>
         </w:tc>
@@ -2925,6 +3177,44 @@
               <w:jc w:val="left"/>
             </w:pPr>
             <w:r>
+              <w:t xml:space="preserve">23</w:t>
+            </w:r>
+          </w:p>
+        </w:tc>
+        <w:tc>
+          <w:tcPr/>
+          <w:p>
+            <w:pPr>
+              <w:pStyle w:val="Compact"/>
+              <w:jc w:val="left"/>
+            </w:pPr>
+            <w:r>
+              <w:t xml:space="preserve">De spiegel</w:t>
+            </w:r>
+          </w:p>
+        </w:tc>
+        <w:tc>
+          <w:tcPr/>
+          <w:p>
+            <w:pPr>
+              <w:pStyle w:val="Compact"/>
+              <w:jc w:val="left"/>
+            </w:pPr>
+            <w:r>
+              <w:t xml:space="preserve">Hij wandelt al tien jaar elke dag, in alle weer. Zijn bloeddruk is goed. Hij weet niet meer precies waarom hij ooit een hond nam.</w:t>
+            </w:r>
+          </w:p>
+        </w:tc>
+      </w:tr>
+      <w:tr>
+        <w:tc>
+          <w:tcPr/>
+          <w:p>
+            <w:pPr>
+              <w:pStyle w:val="Compact"/>
+              <w:jc w:val="left"/>
+            </w:pPr>
+            <w:r>
               <w:t xml:space="preserve">26</w:t>
             </w:r>
           </w:p>
@@ -2977,7 +3267,7 @@
       <w:pPr>
         <w:numPr>
           <w:ilvl w:val="0"/>
-          <w:numId w:val="1008"/>
+          <w:numId w:val="1009"/>
         </w:numPr>
         <w:pStyle w:val="Compact"/>
       </w:pPr>
@@ -2995,7 +3285,7 @@
       <w:pPr>
         <w:numPr>
           <w:ilvl w:val="0"/>
-          <w:numId w:val="1008"/>
+          <w:numId w:val="1009"/>
         </w:numPr>
         <w:pStyle w:val="Compact"/>
       </w:pPr>
@@ -3013,7 +3303,7 @@
       <w:pPr>
         <w:numPr>
           <w:ilvl w:val="0"/>
-          <w:numId w:val="1008"/>
+          <w:numId w:val="1009"/>
         </w:numPr>
         <w:pStyle w:val="Compact"/>
       </w:pPr>
@@ -3031,7 +3321,7 @@
       <w:pPr>
         <w:numPr>
           <w:ilvl w:val="0"/>
-          <w:numId w:val="1008"/>
+          <w:numId w:val="1009"/>
         </w:numPr>
         <w:pStyle w:val="Compact"/>
       </w:pPr>
@@ -3049,7 +3339,7 @@
       <w:pPr>
         <w:numPr>
           <w:ilvl w:val="0"/>
-          <w:numId w:val="1008"/>
+          <w:numId w:val="1009"/>
         </w:numPr>
         <w:pStyle w:val="Compact"/>
       </w:pPr>
@@ -3246,7 +3536,7 @@
       <w:pPr>
         <w:numPr>
           <w:ilvl w:val="0"/>
-          <w:numId w:val="1009"/>
+          <w:numId w:val="1010"/>
         </w:numPr>
         <w:pStyle w:val="Compact"/>
       </w:pPr>
@@ -3268,7 +3558,7 @@
       <w:pPr>
         <w:numPr>
           <w:ilvl w:val="0"/>
-          <w:numId w:val="1009"/>
+          <w:numId w:val="1010"/>
         </w:numPr>
         <w:pStyle w:val="Compact"/>
       </w:pPr>
@@ -3300,7 +3590,7 @@
       <w:pPr>
         <w:numPr>
           <w:ilvl w:val="0"/>
-          <w:numId w:val="1010"/>
+          <w:numId w:val="1011"/>
         </w:numPr>
         <w:pStyle w:val="Compact"/>
       </w:pPr>
@@ -3322,7 +3612,7 @@
       <w:pPr>
         <w:numPr>
           <w:ilvl w:val="0"/>
-          <w:numId w:val="1010"/>
+          <w:numId w:val="1011"/>
         </w:numPr>
         <w:pStyle w:val="Compact"/>
       </w:pPr>
@@ -3354,7 +3644,7 @@
       <w:pPr>
         <w:numPr>
           <w:ilvl w:val="0"/>
-          <w:numId w:val="1011"/>
+          <w:numId w:val="1012"/>
         </w:numPr>
         <w:pStyle w:val="Compact"/>
       </w:pPr>
@@ -3376,7 +3666,7 @@
       <w:pPr>
         <w:numPr>
           <w:ilvl w:val="0"/>
-          <w:numId w:val="1011"/>
+          <w:numId w:val="1012"/>
         </w:numPr>
         <w:pStyle w:val="Compact"/>
       </w:pPr>
@@ -3392,7 +3682,7 @@
       <w:pPr>
         <w:numPr>
           <w:ilvl w:val="0"/>
-          <w:numId w:val="1011"/>
+          <w:numId w:val="1012"/>
         </w:numPr>
         <w:pStyle w:val="Compact"/>
       </w:pPr>
@@ -3411,7 +3701,7 @@
       <w:pPr>
         <w:numPr>
           <w:ilvl w:val="0"/>
-          <w:numId w:val="1011"/>
+          <w:numId w:val="1012"/>
         </w:numPr>
         <w:pStyle w:val="Compact"/>
       </w:pPr>
@@ -3427,7 +3717,7 @@
       <w:pPr>
         <w:numPr>
           <w:ilvl w:val="0"/>
-          <w:numId w:val="1011"/>
+          <w:numId w:val="1012"/>
         </w:numPr>
         <w:pStyle w:val="Compact"/>
       </w:pPr>
@@ -3443,7 +3733,7 @@
       <w:pPr>
         <w:numPr>
           <w:ilvl w:val="0"/>
-          <w:numId w:val="1011"/>
+          <w:numId w:val="1012"/>
         </w:numPr>
         <w:pStyle w:val="Compact"/>
       </w:pPr>
@@ -4932,6 +5222,106 @@
               <w:jc w:val="left"/>
             </w:pPr>
             <w:r>
+              <w:t xml:space="preserve">Het liedje</w:t>
+            </w:r>
+          </w:p>
+        </w:tc>
+        <w:tc>
+          <w:tcPr/>
+          <w:p>
+            <w:pPr>
+              <w:pStyle w:val="Compact"/>
+              <w:jc w:val="left"/>
+            </w:pPr>
+            <w:r>
+              <w:t xml:space="preserve">Hoofdstuk 3: Tara kiest Lode door te kwispelen en te zingen, met een strootje in de bek</w:t>
+            </w:r>
+          </w:p>
+        </w:tc>
+        <w:tc>
+          <w:tcPr/>
+          <w:p>
+            <w:pPr>
+              <w:pStyle w:val="Compact"/>
+              <w:jc w:val="left"/>
+            </w:pPr>
+            <w:r>
+              <w:t xml:space="preserve">Hoofdstuk 5: elke ochtend bij het ontbijt. Hoofdstuk 10: Lode ontdekt dat het lied stopt zonder iets in haar mond. Dossier 2 blijft onverklaard.</w:t>
+            </w:r>
+          </w:p>
+        </w:tc>
+        <w:tc>
+          <w:tcPr/>
+          <w:p>
+            <w:pPr>
+              <w:pStyle w:val="Compact"/>
+              <w:jc w:val="left"/>
+            </w:pPr>
+            <w:r>
+              <w:t xml:space="preserve">Hoofdstuk 25: de ochtend van de operatie moet ze nuchter blijven en krijgt ze geen eten. Ze zingt toch, zacht, met de rode bal in haar bek. In de kliniek neemt een verpleegkundige de bal uit haar mond, en het lied stopt. Epiloog: Lode wordt elke ochtend wakker op het uur van het lied</w:t>
+            </w:r>
+          </w:p>
+        </w:tc>
+      </w:tr>
+      <w:tr>
+        <w:tc>
+          <w:tcPr/>
+          <w:p>
+            <w:pPr>
+              <w:pStyle w:val="Compact"/>
+              <w:jc w:val="left"/>
+            </w:pPr>
+            <w:r>
+              <w:t xml:space="preserve">Iets mee naar bed</w:t>
+            </w:r>
+          </w:p>
+        </w:tc>
+        <w:tc>
+          <w:tcPr/>
+          <w:p>
+            <w:pPr>
+              <w:pStyle w:val="Compact"/>
+              <w:jc w:val="left"/>
+            </w:pPr>
+            <w:r>
+              <w:t xml:space="preserve">Hoofdstuk 4: het dekentje uit de auto</w:t>
+            </w:r>
+          </w:p>
+        </w:tc>
+        <w:tc>
+          <w:tcPr/>
+          <w:p>
+            <w:pPr>
+              <w:pStyle w:val="Compact"/>
+              <w:jc w:val="left"/>
+            </w:pPr>
+            <w:r>
+              <w:t xml:space="preserve">Deel II: Lodes pantoffel. Deel III: de rode bal</w:t>
+            </w:r>
+          </w:p>
+        </w:tc>
+        <w:tc>
+          <w:tcPr/>
+          <w:p>
+            <w:pPr>
+              <w:pStyle w:val="Compact"/>
+              <w:jc w:val="left"/>
+            </w:pPr>
+            <w:r>
+              <w:t xml:space="preserve">Hoofdstuk 25: de laatste avond neemt ze de bal nog mee naar de mand. Hoofdstuk 26: Lode legt de bal bij haar snuit in het hok; ze neemt hem niet. Epiloog: de bal ligt in de lege mand, met Mira ernaast</w:t>
+            </w:r>
+          </w:p>
+        </w:tc>
+      </w:tr>
+      <w:tr>
+        <w:tc>
+          <w:tcPr/>
+          <w:p>
+            <w:pPr>
+              <w:pStyle w:val="Compact"/>
+              <w:jc w:val="left"/>
+            </w:pPr>
+            <w:r>
               <w:t xml:space="preserve">De rode bal</w:t>
             </w:r>
           </w:p>
@@ -4956,19 +5346,19 @@
               <w:jc w:val="left"/>
             </w:pPr>
             <w:r>
-              <w:t xml:space="preserve">Deel II</w:t>
-            </w:r>
-          </w:p>
-        </w:tc>
-        <w:tc>
-          <w:tcPr/>
-          <w:p>
-            <w:pPr>
-              <w:pStyle w:val="Compact"/>
-              <w:jc w:val="left"/>
-            </w:pPr>
-            <w:r>
-              <w:t xml:space="preserve">Epiloog: Lode vindt hem in het gras, en ziet hem pas als hij erop trapt</w:t>
+              <w:t xml:space="preserve">Deel II: haar bedgenoot</w:t>
+            </w:r>
+          </w:p>
+        </w:tc>
+        <w:tc>
+          <w:tcPr/>
+          <w:p>
+            <w:pPr>
+              <w:pStyle w:val="Compact"/>
+              <w:jc w:val="left"/>
+            </w:pPr>
+            <w:r>
+              <w:t xml:space="preserve">Hoofdstuk 26: de bal komt mee naar huis in Lodes jaszak, samen met de halsband. Epiloog: terug in de mand</w:t>
             </w:r>
           </w:p>
         </w:tc>
@@ -5586,7 +5976,7 @@
         <w:t xml:space="preserve"> </w:t>
       </w:r>
       <w:r>
-        <w:t xml:space="preserve">Een man die naar koffie en zenuwen ruikt, kiest haar en doet haar een rode halsband om. De autorit, en het spoor van het kot dat dunner wordt.</w:t>
+        <w:t xml:space="preserve">Een man komt het kot binnen. Hij ruikt naar koffie en zenuwen, en hij heeft een papiertje vast. Het zusje blijft liggen. Tara pakt een strootje, loopt naar hem toe, kwispelt met haar hele achterlijf, en zingt: haar liedje, voor het eerst. Hij hurkt. Hij heeft gekozen, denkt hij. De lezer weet beter. Hij doet haar een rode halsband om. Dan de autorit, en het spoor van het kot dat met elke bocht dunner wordt. Het strootje heeft ze nog in haar bek als ze aankomt.</w:t>
       </w:r>
     </w:p>
     <w:p>
@@ -5617,7 +6007,7 @@
         <w:t xml:space="preserve">Tara</w:t>
       </w:r>
       <w:r>
-        <w:t xml:space="preserve">. De eerste nacht piept ze in de bench. Lode komt in zijn pyjama de trap af, moppert iets, en legt zich met een deken op de keukenvloer, een hand door de spijlen. Hij weet zelf niet waarom.</w:t>
+        <w:t xml:space="preserve">. De eerste nacht sleept ze het dekentje uit de auto mee naar de bench, het enige dat nog naar het kot ruikt. Ze piept toch. Lode komt in zijn pyjama de trap af, moppert iets, en legt zich met een deken op de keukenvloer, een hand door de spijlen. Hij weet zelf niet waarom.</w:t>
       </w:r>
     </w:p>
     <w:p>
@@ -5681,6 +6071,12 @@
       </w:r>
       <w:r>
         <w:t xml:space="preserve">- Tara gaat zitten en de koekjestrommel gaat open. Ze gaat nog eens zitten.</w:t>
+      </w:r>
+      <w:r>
+        <w:t xml:space="preserve"> </w:t>
+      </w:r>
+      <w:r>
+        <w:t xml:space="preserve">- Elke ochtend, als ze Lodes voeten op de trap hoort, zingt ze. Dan komt het eten. Haar eerste hypothese: het lied doet de etensbak vullen. Het tegendeel wordt nooit bewezen.</w:t>
       </w:r>
       <w:r>
         <w:t xml:space="preserve"> </w:t>
@@ -5860,7 +6256,7 @@
         <w:t xml:space="preserve"> </w:t>
       </w:r>
       <w:r>
-        <w:t xml:space="preserve">De pantoffel. Lode begint te roepen, stopt midden in de zin, en gaat naast haar op de grond zitten.</w:t>
+        <w:t xml:space="preserve">De pantoffel. Lode begint te roepen, stopt midden in de zin, en gaat naast haar op de grond zitten. De volgende ochtend zingt Tara met de andere pantoffel in haar bek. Lode neemt hem af, en het lied stopt. Hij geeft hem terug, en het lied begint. Hij doet het nog eens, en lacht. De proefpersoon doet een experiment met de onderzoeker, en het lukt. Vanaf dan slaapt Tara met die pantoffel. Lode koopt een nieuw paar en zegt niets.</w:t>
       </w:r>
     </w:p>
     <w:p>
@@ -6140,7 +6536,19 @@
         <w:t xml:space="preserve"> </w:t>
       </w:r>
       <w:r>
-        <w:t xml:space="preserve">- Een boswachter houdt hen tegen, wijst op het bord, en schrijft misschien een GAS-boete uit.</w:t>
+        <w:t xml:space="preserve">- Een boswachter houdt hen tegen, wijst op het bord, en vraagt Lodes identiteitskaart. Hij noteert alles in een boekje.</w:t>
+      </w:r>
+      <w:r>
+        <w:t xml:space="preserve"> </w:t>
+      </w:r>
+      <w:r>
+        <w:t xml:space="preserve">- Drie weken later valt er een brief van de gemeente in de bus: een GAS-boete voor een loslopende hond, opgelegd door de sanctionerend ambtenaar op basis van de vaststelling van de boswachter. Tara noteert dat de envelop Lode laat ruiken zoals vroeger na een dag op de Ring.</w:t>
+      </w:r>
+      <w:r>
+        <w:t xml:space="preserve"> </w:t>
+      </w:r>
+      <w:r>
+        <w:t xml:space="preserve">- Lode schrijft een verweerschrift van drie bladzijden over hondenhaters en beweging. Mieke leest het, zegt niets, en legt de overschrijving naast zijn koffie. Hij betaalt.</w:t>
       </w:r>
       <w:r>
         <w:t xml:space="preserve"> </w:t>
@@ -6426,7 +6834,19 @@
         <w:t xml:space="preserve"> </w:t>
       </w:r>
       <w:r>
+        <w:t xml:space="preserve">- Tara moet nuchter blijven. Ze hoort Lode op de trap, en de etensbak blijft leeg. Ze zingt toch, zacht, met de rode bal in haar bek. Lode gaat op de onderste trede zitten en luistert tot het ophoudt.</w:t>
+      </w:r>
+      <w:r>
+        <w:t xml:space="preserve"> </w:t>
+      </w:r>
+      <w:r>
         <w:t xml:space="preserve">- De kliniek: koud licht, piepende monitoren, een tondeuse die een plekje op haar poot kaal scheert.</w:t>
+      </w:r>
+      <w:r>
+        <w:t xml:space="preserve"> </w:t>
+      </w:r>
+      <w:r>
+        <w:t xml:space="preserve">- Een verpleegkundige neemt de bal vriendelijk uit haar mond en geeft hem aan Lode. Het lied stopt.</w:t>
       </w:r>
       <w:r>
         <w:t xml:space="preserve"> </w:t>
@@ -6501,7 +6921,7 @@
       <w:pPr>
         <w:numPr>
           <w:ilvl w:val="0"/>
-          <w:numId w:val="1012"/>
+          <w:numId w:val="1013"/>
         </w:numPr>
         <w:pStyle w:val="Compact"/>
       </w:pPr>
@@ -6535,7 +6955,7 @@
       <w:pPr>
         <w:numPr>
           <w:ilvl w:val="0"/>
-          <w:numId w:val="1012"/>
+          <w:numId w:val="1013"/>
         </w:numPr>
         <w:pStyle w:val="Compact"/>
       </w:pPr>
@@ -6557,7 +6977,7 @@
       <w:pPr>
         <w:numPr>
           <w:ilvl w:val="0"/>
-          <w:numId w:val="1012"/>
+          <w:numId w:val="1013"/>
         </w:numPr>
         <w:pStyle w:val="Compact"/>
       </w:pPr>
@@ -6579,7 +6999,7 @@
       <w:pPr>
         <w:numPr>
           <w:ilvl w:val="0"/>
-          <w:numId w:val="1012"/>
+          <w:numId w:val="1013"/>
         </w:numPr>
         <w:pStyle w:val="Compact"/>
       </w:pPr>
@@ -6594,14 +7014,14 @@
         <w:t xml:space="preserve"> </w:t>
       </w:r>
       <w:r>
-        <w:t xml:space="preserve">Hij steekt zijn hand door de spijlen, zoals die eerste nacht op de keukenvloer. Nu reageert ze helemaal niet meer. Hij vraagt zich af of ze haar iets hebben ingespoten. Hij stelt die vraag niet hardop. (Voor de lezer blijft het open: een kalmerend middel is bij zulke patiënten gewoon, en Lodes twijfel is de twijfel van iemand die zich vastklampt.)</w:t>
+        <w:t xml:space="preserve">Hij heeft de rode bal meegebracht en legt hem bij haar snuit. Ze neemt hem niet. Hij steekt zijn hand door de spijlen, zoals die eerste nacht op de keukenvloer. Nu reageert ze helemaal niet meer. Hij vraagt zich af of ze haar iets hebben ingespoten. Hij stelt die vraag niet hardop. (Voor de lezer blijft het open: een kalmerend middel is bij zulke patiënten gewoon, en Lodes twijfel is de twijfel van iemand die zich vastklampt.)</w:t>
       </w:r>
     </w:p>
     <w:p>
       <w:pPr>
         <w:numPr>
           <w:ilvl w:val="0"/>
-          <w:numId w:val="1012"/>
+          <w:numId w:val="1013"/>
         </w:numPr>
         <w:pStyle w:val="Compact"/>
       </w:pPr>
@@ -6616,14 +7036,14 @@
         <w:t xml:space="preserve"> </w:t>
       </w:r>
       <w:r>
-        <w:t xml:space="preserve">Hij tekent het papier. Hij blijft erbij. Hij heeft de halsband in zijn jaszak.</w:t>
+        <w:t xml:space="preserve">Hij tekent het papier. Hij blijft erbij. Hij gaat naar buiten met de halsband en de rode bal in zijn jaszak.</w:t>
       </w:r>
     </w:p>
     <w:p>
       <w:pPr>
         <w:numPr>
           <w:ilvl w:val="0"/>
-          <w:numId w:val="1012"/>
+          <w:numId w:val="1013"/>
         </w:numPr>
         <w:pStyle w:val="Compact"/>
       </w:pPr>
@@ -6664,25 +7084,31 @@
         <w:pStyle w:val="FirstParagraph"/>
       </w:pPr>
       <w:r>
-        <w:t xml:space="preserve">Enkele weken later, in Lodes stem of in de derde persoon (zie sectie 11).</w:t>
-      </w:r>
-      <w:r>
-        <w:t xml:space="preserve"> </w:t>
-      </w:r>
-      <w:r>
-        <w:t xml:space="preserve">- Mira ligt in de lege mand. De lijn hangt aan de kapstok.</w:t>
-      </w:r>
-      <w:r>
-        <w:t xml:space="preserve"> </w:t>
-      </w:r>
-      <w:r>
-        <w:t xml:space="preserve">- Lode trekt zijn jas aan en gaat toch wandelen, alleen, de heide op, zoals elke dag in twaalf jaar.</w:t>
-      </w:r>
-      <w:r>
-        <w:t xml:space="preserve"> </w:t>
-      </w:r>
-      <w:r>
-        <w:t xml:space="preserve">- Op het grasveld trapt hij op iets: de rode bal, die hij niet had gezien.</w:t>
+        <w:t xml:space="preserve">Enkele weken later, in Lodes stem, in dezelfde sobere toon als hoofdstuk 26.</w:t>
+      </w:r>
+      <w:r>
+        <w:t xml:space="preserve"> </w:t>
+      </w:r>
+      <w:r>
+        <w:t xml:space="preserve">- Elke ochtend wordt Lode wakker op het uur van het lied. Hij blijft liggen en luistert. Het is stil in de keuken.</w:t>
+      </w:r>
+      <w:r>
+        <w:t xml:space="preserve"> </w:t>
+      </w:r>
+      <w:r>
+        <w:t xml:space="preserve">- Hij gaat de trap af. Hij telt de treden niet meer, maar hij weet dat zij ze telde.</w:t>
+      </w:r>
+      <w:r>
+        <w:t xml:space="preserve"> </w:t>
+      </w:r>
+      <w:r>
+        <w:t xml:space="preserve">- De rode bal ligt in de lege mand. Mira ligt ernaast. De lijn hangt aan de kapstok.</w:t>
+      </w:r>
+      <w:r>
+        <w:t xml:space="preserve"> </w:t>
+      </w:r>
+      <w:r>
+        <w:t xml:space="preserve">- Hij trekt zijn jas aan en gaat toch wandelen, alleen, de heide op, zoals elke dag in twaalf jaar.</w:t>
       </w:r>
       <w:r>
         <w:t xml:space="preserve"> </w:t>
@@ -6739,7 +7165,7 @@
     </w:p>
     <w:bookmarkEnd w:id="47"/>
     <w:bookmarkEnd w:id="48"/>
-    <w:bookmarkStart w:id="75" w:name="onderzoek-en-feitencontrole"/>
+    <w:bookmarkStart w:id="77" w:name="onderzoek-en-feitencontrole"/>
     <w:p>
       <w:pPr>
         <w:pStyle w:val="Heading1"/>
@@ -6748,7 +7174,7 @@
         <w:t xml:space="preserve">10. Onderzoek en feitencontrole</w:t>
       </w:r>
     </w:p>
-    <w:bookmarkStart w:id="57" w:name="nieuw-voor-deze-versie"/>
+    <w:bookmarkStart w:id="59" w:name="nieuw-voor-deze-versie"/>
     <w:p>
       <w:pPr>
         <w:pStyle w:val="Heading2"/>
@@ -7159,6 +7585,82 @@
           <w:bCs/>
           <w:b/>
         </w:rPr>
+        <w:t xml:space="preserve">Iets in de bek dragen en zingen.</w:t>
+      </w:r>
+      <w:r>
+        <w:t xml:space="preserve"> </w:t>
+      </w:r>
+      <w:r>
+        <w:t xml:space="preserve">Retrievers zijn gefokt om wild zacht in de bek te dragen (</w:t>
+      </w:r>
+      <w:r>
+        <w:t xml:space="preserve">“</w:t>
+      </w:r>
+      <w:r>
+        <w:t xml:space="preserve">soft mouth</w:t>
+      </w:r>
+      <w:r>
+        <w:t xml:space="preserve">”</w:t>
+      </w:r>
+      <w:r>
+        <w:t xml:space="preserve">). Veel Labradors begroeten hun mens met een speeltje of een ander voorwerp in de mond, vaak met gejank of</w:t>
+      </w:r>
+      <w:r>
+        <w:t xml:space="preserve"> </w:t>
+      </w:r>
+      <w:r>
+        <w:t xml:space="preserve">“</w:t>
+      </w:r>
+      <w:r>
+        <w:t xml:space="preserve">gezang</w:t>
+      </w:r>
+      <w:r>
+        <w:t xml:space="preserve">”</w:t>
+      </w:r>
+      <w:r>
+        <w:t xml:space="preserve"> </w:t>
+      </w:r>
+      <w:r>
+        <w:t xml:space="preserve">van opwinding. Eigenaren belonen dat onbewust door er blij op te reageren. Tara’s liedje is dus echt hondengedrag, geen verzinsel. Bronnen:</w:t>
+      </w:r>
+      <w:r>
+        <w:t xml:space="preserve"> </w:t>
+      </w:r>
+      <w:hyperlink r:id="rId56">
+        <w:r>
+          <w:rPr>
+            <w:rStyle w:val="Hyperlink"/>
+          </w:rPr>
+          <w:t xml:space="preserve">Honolulu Advertiser, met dierengedragsdeskundige Nicholas Dodman</w:t>
+        </w:r>
+      </w:hyperlink>
+      <w:r>
+        <w:t xml:space="preserve">;</w:t>
+      </w:r>
+      <w:r>
+        <w:t xml:space="preserve"> </w:t>
+      </w:r>
+      <w:hyperlink r:id="rId57">
+        <w:r>
+          <w:rPr>
+            <w:rStyle w:val="Hyperlink"/>
+          </w:rPr>
+          <w:t xml:space="preserve">Wamiz</w:t>
+        </w:r>
+      </w:hyperlink>
+      <w:r>
+        <w:t xml:space="preserve">.</w:t>
+      </w:r>
+    </w:p>
+    <w:p>
+      <w:pPr>
+        <w:pStyle w:val="BodyText"/>
+      </w:pPr>
+      <w:r>
+        <w:rPr>
+          <w:bCs/>
+          <w:b/>
+        </w:rPr>
         <w:t xml:space="preserve">Minimumleeftijd van pups.</w:t>
       </w:r>
       <w:r>
@@ -7167,7 +7669,7 @@
       <w:r>
         <w:t xml:space="preserve">8 weken, volgens de auteur. Een hond moet ook voor de leeftijd van 8 weken gechipt en in DogID geregistreerd zijn (</w:t>
       </w:r>
-      <w:hyperlink r:id="rId56">
+      <w:hyperlink r:id="rId58">
         <w:r>
           <w:rPr>
             <w:rStyle w:val="Hyperlink"/>
@@ -7179,8 +7681,8 @@
         <w:t xml:space="preserve">).</w:t>
       </w:r>
     </w:p>
-    <w:bookmarkEnd w:id="57"/>
-    <w:bookmarkStart w:id="73" w:name="uit-versie-2-blijft-geldig"/>
+    <w:bookmarkEnd w:id="59"/>
+    <w:bookmarkStart w:id="75" w:name="uit-versie-2-blijft-geldig"/>
     <w:p>
       <w:pPr>
         <w:pStyle w:val="Heading2"/>
@@ -7193,7 +7695,7 @@
       <w:pPr>
         <w:numPr>
           <w:ilvl w:val="0"/>
-          <w:numId w:val="1013"/>
+          <w:numId w:val="1014"/>
         </w:numPr>
         <w:pStyle w:val="Compact"/>
       </w:pPr>
@@ -7210,7 +7712,7 @@
       <w:r>
         <w:t xml:space="preserve">ongeveer een kwart van de Labradors draagt een POMC-mutatie, met meer honger en een lager energieverbruik (</w:t>
       </w:r>
-      <w:hyperlink r:id="rId58">
+      <w:hyperlink r:id="rId60">
         <w:r>
           <w:rPr>
             <w:rStyle w:val="Hyperlink"/>
@@ -7226,7 +7728,7 @@
       <w:pPr>
         <w:numPr>
           <w:ilvl w:val="0"/>
-          <w:numId w:val="1013"/>
+          <w:numId w:val="1014"/>
         </w:numPr>
         <w:pStyle w:val="Compact"/>
       </w:pPr>
@@ -7243,7 +7745,7 @@
       <w:r>
         <w:t xml:space="preserve">in een studie herkenden honden stressgeur in ongeveer 94% van de proeven (</w:t>
       </w:r>
-      <w:hyperlink r:id="rId59">
+      <w:hyperlink r:id="rId61">
         <w:r>
           <w:rPr>
             <w:rStyle w:val="Hyperlink"/>
@@ -7259,7 +7761,7 @@
       <w:pPr>
         <w:numPr>
           <w:ilvl w:val="0"/>
-          <w:numId w:val="1013"/>
+          <w:numId w:val="1014"/>
         </w:numPr>
         <w:pStyle w:val="Compact"/>
       </w:pPr>
@@ -7276,7 +7778,7 @@
       <w:r>
         <w:t xml:space="preserve">een theorie van Horowitz, niet getest (</w:t>
       </w:r>
-      <w:hyperlink r:id="rId60">
+      <w:hyperlink r:id="rId62">
         <w:r>
           <w:rPr>
             <w:rStyle w:val="Hyperlink"/>
@@ -7292,7 +7794,7 @@
       <w:pPr>
         <w:numPr>
           <w:ilvl w:val="0"/>
-          <w:numId w:val="1013"/>
+          <w:numId w:val="1014"/>
         </w:numPr>
         <w:pStyle w:val="Compact"/>
       </w:pPr>
@@ -7309,7 +7811,7 @@
       <w:r>
         <w:t xml:space="preserve">de eerste twee weken blind en doof (</w:t>
       </w:r>
-      <w:hyperlink r:id="rId61">
+      <w:hyperlink r:id="rId63">
         <w:r>
           <w:rPr>
             <w:rStyle w:val="Hyperlink"/>
@@ -7325,7 +7827,7 @@
       <w:pPr>
         <w:numPr>
           <w:ilvl w:val="0"/>
-          <w:numId w:val="1013"/>
+          <w:numId w:val="1014"/>
         </w:numPr>
         <w:pStyle w:val="Compact"/>
       </w:pPr>
@@ -7342,7 +7844,7 @@
       <w:r>
         <w:t xml:space="preserve">blauw en geel wel, rood en groen nauwelijks (</w:t>
       </w:r>
-      <w:hyperlink r:id="rId62">
+      <w:hyperlink r:id="rId64">
         <w:r>
           <w:rPr>
             <w:rStyle w:val="Hyperlink"/>
@@ -7358,7 +7860,7 @@
       <w:pPr>
         <w:numPr>
           <w:ilvl w:val="0"/>
-          <w:numId w:val="1013"/>
+          <w:numId w:val="1014"/>
         </w:numPr>
         <w:pStyle w:val="Compact"/>
       </w:pPr>
@@ -7375,7 +7877,7 @@
       <w:r>
         <w:t xml:space="preserve">activeert het beloningscentrum het sterkst (</w:t>
       </w:r>
-      <w:hyperlink r:id="rId63">
+      <w:hyperlink r:id="rId65">
         <w:r>
           <w:rPr>
             <w:rStyle w:val="Hyperlink"/>
@@ -7391,7 +7893,7 @@
       <w:pPr>
         <w:numPr>
           <w:ilvl w:val="0"/>
-          <w:numId w:val="1013"/>
+          <w:numId w:val="1014"/>
         </w:numPr>
         <w:pStyle w:val="Compact"/>
       </w:pPr>
@@ -7408,7 +7910,7 @@
       <w:r>
         <w:t xml:space="preserve">voorlopig maar reëel (</w:t>
       </w:r>
-      <w:hyperlink r:id="rId64">
+      <w:hyperlink r:id="rId66">
         <w:r>
           <w:rPr>
             <w:rStyle w:val="Hyperlink"/>
@@ -7424,7 +7926,7 @@
       <w:pPr>
         <w:numPr>
           <w:ilvl w:val="0"/>
-          <w:numId w:val="1013"/>
+          <w:numId w:val="1014"/>
         </w:numPr>
         <w:pStyle w:val="Compact"/>
       </w:pPr>
@@ -7441,7 +7943,7 @@
       <w:r>
         <w:t xml:space="preserve">met de eigen baas (</w:t>
       </w:r>
-      <w:hyperlink r:id="rId65">
+      <w:hyperlink r:id="rId67">
         <w:r>
           <w:rPr>
             <w:rStyle w:val="Hyperlink"/>
@@ -7457,7 +7959,7 @@
       <w:pPr>
         <w:numPr>
           <w:ilvl w:val="0"/>
-          <w:numId w:val="1013"/>
+          <w:numId w:val="1014"/>
         </w:numPr>
         <w:pStyle w:val="Compact"/>
       </w:pPr>
@@ -7474,7 +7976,7 @@
       <w:r>
         <w:t xml:space="preserve">(</w:t>
       </w:r>
-      <w:hyperlink r:id="rId66">
+      <w:hyperlink r:id="rId68">
         <w:r>
           <w:rPr>
             <w:rStyle w:val="Hyperlink"/>
@@ -7490,7 +7992,7 @@
       <w:pPr>
         <w:numPr>
           <w:ilvl w:val="0"/>
-          <w:numId w:val="1013"/>
+          <w:numId w:val="1014"/>
         </w:numPr>
         <w:pStyle w:val="Compact"/>
       </w:pPr>
@@ -7507,7 +8009,7 @@
       <w:r>
         <w:t xml:space="preserve">(</w:t>
       </w:r>
-      <w:hyperlink r:id="rId67">
+      <w:hyperlink r:id="rId69">
         <w:r>
           <w:rPr>
             <w:rStyle w:val="Hyperlink"/>
@@ -7523,7 +8025,7 @@
       <w:pPr>
         <w:numPr>
           <w:ilvl w:val="0"/>
-          <w:numId w:val="1013"/>
+          <w:numId w:val="1014"/>
         </w:numPr>
         <w:pStyle w:val="Compact"/>
       </w:pPr>
@@ -7540,7 +8042,7 @@
       <w:r>
         <w:t xml:space="preserve">(</w:t>
       </w:r>
-      <w:hyperlink r:id="rId68">
+      <w:hyperlink r:id="rId70">
         <w:r>
           <w:rPr>
             <w:rStyle w:val="Hyperlink"/>
@@ -7556,7 +8058,7 @@
       <w:pPr>
         <w:numPr>
           <w:ilvl w:val="0"/>
-          <w:numId w:val="1013"/>
+          <w:numId w:val="1014"/>
         </w:numPr>
         <w:pStyle w:val="Compact"/>
       </w:pPr>
@@ -7573,7 +8075,7 @@
       <w:r>
         <w:t xml:space="preserve">ongeveer 12 à 13 jaar (</w:t>
       </w:r>
-      <w:hyperlink r:id="rId69">
+      <w:hyperlink r:id="rId71">
         <w:r>
           <w:rPr>
             <w:rStyle w:val="Hyperlink"/>
@@ -7589,7 +8091,7 @@
       <w:pPr>
         <w:numPr>
           <w:ilvl w:val="0"/>
-          <w:numId w:val="1013"/>
+          <w:numId w:val="1014"/>
         </w:numPr>
         <w:pStyle w:val="Compact"/>
       </w:pPr>
@@ -7606,7 +8108,7 @@
       <w:r>
         <w:t xml:space="preserve">sinds 2018 (</w:t>
       </w:r>
-      <w:hyperlink r:id="rId70">
+      <w:hyperlink r:id="rId72">
         <w:r>
           <w:rPr>
             <w:rStyle w:val="Hyperlink"/>
@@ -7651,7 +8153,7 @@
       <w:r>
         <w:t xml:space="preserve">(1922), mogelijk als motto (</w:t>
       </w:r>
-      <w:hyperlink r:id="rId71">
+      <w:hyperlink r:id="rId73">
         <w:r>
           <w:rPr>
             <w:rStyle w:val="Hyperlink"/>
@@ -7684,7 +8186,7 @@
       <w:r>
         <w:t xml:space="preserve">(</w:t>
       </w:r>
-      <w:hyperlink r:id="rId72">
+      <w:hyperlink r:id="rId74">
         <w:r>
           <w:rPr>
             <w:rStyle w:val="Hyperlink"/>
@@ -7715,8 +8217,8 @@
         <w:t xml:space="preserve">.</w:t>
       </w:r>
     </w:p>
-    <w:bookmarkEnd w:id="73"/>
-    <w:bookmarkStart w:id="74" w:name="wetenschapstabel"/>
+    <w:bookmarkEnd w:id="75"/>
+    <w:bookmarkStart w:id="76" w:name="wetenschapstabel"/>
     <w:p>
       <w:pPr>
         <w:pStyle w:val="Heading2"/>
@@ -8353,275 +8855,23 @@
         </w:tc>
       </w:tr>
     </w:tbl>
-    <w:bookmarkEnd w:id="74"/>
-    <w:bookmarkEnd w:id="75"/>
-    <w:bookmarkStart w:id="77" w:name="het-einde-schrijven-aanpak"/>
-    <w:p>
-      <w:pPr>
-        <w:pStyle w:val="Heading1"/>
-      </w:pPr>
-      <w:r>
-        <w:t xml:space="preserve">11. Het einde schrijven: aanpak</w:t>
-      </w:r>
-    </w:p>
-    <w:p>
-      <w:pPr>
-        <w:pStyle w:val="FirstParagraph"/>
-      </w:pPr>
-      <w:r>
-        <w:t xml:space="preserve">Het einde is het moeilijkste en belangrijkste deel van het boek. Deze afspraken gelden:</w:t>
-      </w:r>
-    </w:p>
-    <w:p>
-      <w:pPr>
-        <w:numPr>
-          <w:ilvl w:val="0"/>
-          <w:numId w:val="1014"/>
-        </w:numPr>
-        <w:pStyle w:val="Compact"/>
-      </w:pPr>
-      <w:r>
-        <w:rPr>
-          <w:bCs/>
-          <w:b/>
-        </w:rPr>
-        <w:t xml:space="preserve">Geen gevoelswoorden.</w:t>
-      </w:r>
-      <w:r>
-        <w:t xml:space="preserve"> </w:t>
-      </w:r>
-      <w:r>
-        <w:t xml:space="preserve">Lode zegt nergens</w:t>
-      </w:r>
-      <w:r>
-        <w:t xml:space="preserve"> </w:t>
-      </w:r>
-      <w:r>
-        <w:t xml:space="preserve">“</w:t>
-      </w:r>
-      <w:r>
-        <w:t xml:space="preserve">ik was kapot</w:t>
-      </w:r>
-      <w:r>
-        <w:t xml:space="preserve">”</w:t>
-      </w:r>
-      <w:r>
-        <w:t xml:space="preserve"> </w:t>
-      </w:r>
-      <w:r>
-        <w:t xml:space="preserve">of</w:t>
-      </w:r>
-      <w:r>
-        <w:t xml:space="preserve"> </w:t>
-      </w:r>
-      <w:r>
-        <w:t xml:space="preserve">“</w:t>
-      </w:r>
-      <w:r>
-        <w:t xml:space="preserve">het brak mijn hart</w:t>
-      </w:r>
-      <w:r>
-        <w:t xml:space="preserve">”</w:t>
-      </w:r>
-      <w:r>
-        <w:t xml:space="preserve">. Het verdriet zit in dingen en handelingen: de halsband in zijn jaszak, de radio die uit blijft, de lijn aan de kapstok, het stukje vlees dat hij nog naast haar neus legt.</w:t>
-      </w:r>
-    </w:p>
-    <w:p>
-      <w:pPr>
-        <w:numPr>
-          <w:ilvl w:val="0"/>
-          <w:numId w:val="1014"/>
-        </w:numPr>
-        <w:pStyle w:val="Compact"/>
-      </w:pPr>
-      <w:r>
-        <w:rPr>
-          <w:bCs/>
-          <w:b/>
-        </w:rPr>
-        <w:t xml:space="preserve">Tara’s methode in Lodes handen.</w:t>
-      </w:r>
-      <w:r>
-        <w:t xml:space="preserve"> </w:t>
-      </w:r>
-      <w:r>
-        <w:t xml:space="preserve">Hij noteert wat hij ziet, met vraagtekens:</w:t>
-      </w:r>
-      <w:r>
-        <w:t xml:space="preserve"> </w:t>
-      </w:r>
-      <w:r>
-        <w:t xml:space="preserve">“</w:t>
-      </w:r>
-      <w:r>
-        <w:t xml:space="preserve">Oor bewoog, mogelijk. Neus, mogelijk.</w:t>
-      </w:r>
-      <w:r>
-        <w:t xml:space="preserve">”</w:t>
-      </w:r>
-      <w:r>
-        <w:t xml:space="preserve"> </w:t>
-      </w:r>
-      <w:r>
-        <w:t xml:space="preserve">De lezer begrijpt dat hij twaalf jaar heeft geleerd zo te kijken, en dat het nu niet genoeg is.</w:t>
-      </w:r>
-    </w:p>
-    <w:p>
-      <w:pPr>
-        <w:numPr>
-          <w:ilvl w:val="0"/>
-          <w:numId w:val="1014"/>
-        </w:numPr>
-        <w:pStyle w:val="Compact"/>
-      </w:pPr>
-      <w:r>
-        <w:rPr>
-          <w:bCs/>
-          <w:b/>
-        </w:rPr>
-        <w:t xml:space="preserve">De twijfel blijft staan.</w:t>
-      </w:r>
-      <w:r>
-        <w:t xml:space="preserve"> </w:t>
-      </w:r>
-      <w:r>
-        <w:t xml:space="preserve">Het boek oordeelt niet of de beslissing juist was. Lode doet het zelf ook niet. Hij leeft ermee.</w:t>
-      </w:r>
-    </w:p>
-    <w:p>
-      <w:pPr>
-        <w:numPr>
-          <w:ilvl w:val="0"/>
-          <w:numId w:val="1014"/>
-        </w:numPr>
-        <w:pStyle w:val="Compact"/>
-      </w:pPr>
-      <w:r>
-        <w:rPr>
-          <w:bCs/>
-          <w:b/>
-        </w:rPr>
-        <w:t xml:space="preserve">De dierenartsen blijven menselijk.</w:t>
-      </w:r>
-      <w:r>
-        <w:t xml:space="preserve"> </w:t>
-      </w:r>
-      <w:r>
-        <w:t xml:space="preserve">De chirurgijn heeft voor Tara gevochten. De jonge dierenarts op de intensieve zorg is voorzichtig en vriendelijk. Lodes vermoeden over de injectie is zijn vermoeden, niet de waarheid van het boek.</w:t>
-      </w:r>
-    </w:p>
-    <w:p>
-      <w:pPr>
-        <w:numPr>
-          <w:ilvl w:val="0"/>
-          <w:numId w:val="1014"/>
-        </w:numPr>
-        <w:pStyle w:val="Compact"/>
-      </w:pPr>
-      <w:r>
-        <w:rPr>
-          <w:bCs/>
-          <w:b/>
-        </w:rPr>
-        <w:t xml:space="preserve">Kort.</w:t>
-      </w:r>
-      <w:r>
-        <w:t xml:space="preserve"> </w:t>
-      </w:r>
-      <w:r>
-        <w:t xml:space="preserve">Hoofdstuk 25 en 26 samen zijn hoogstens 3.600 woorden. Witregels en korte alinea’s doen het werk.</w:t>
-      </w:r>
-    </w:p>
-    <w:p>
-      <w:pPr>
-        <w:numPr>
-          <w:ilvl w:val="0"/>
-          <w:numId w:val="1014"/>
-        </w:numPr>
-        <w:pStyle w:val="Compact"/>
-      </w:pPr>
-      <w:r>
-        <w:rPr>
-          <w:bCs/>
-          <w:b/>
-        </w:rPr>
-        <w:t xml:space="preserve">De epiloog</w:t>
-      </w:r>
-      <w:r>
-        <w:t xml:space="preserve"> </w:t>
-      </w:r>
-      <w:r>
-        <w:t xml:space="preserve">wordt geschreven in Lodes stem (aanbevolen, sluit aan op hoofdstuk 26) of in een zeer ingetogen derde persoon. Dat is een keuze voor de auteur.</w:t>
-      </w:r>
-    </w:p>
-    <w:bookmarkStart w:id="76" w:name="Xead231bbf92b2b64993506410400f6d97d1b6d5"/>
-    <w:p>
-      <w:pPr>
-        <w:pStyle w:val="Heading2"/>
-      </w:pPr>
-      <w:r>
-        <w:t xml:space="preserve">Voorbeeld van de toon (richting, geen definitieve tekst)</w:t>
-      </w:r>
-    </w:p>
-    <w:p>
-      <w:pPr>
-        <w:pStyle w:val="BlockText"/>
-      </w:pPr>
-      <w:r>
-        <w:t xml:space="preserve">Observatie, tweede bezoek.</w:t>
-      </w:r>
-    </w:p>
-    <w:p>
-      <w:pPr>
-        <w:pStyle w:val="BlockText"/>
-      </w:pPr>
-      <w:r>
-        <w:t xml:space="preserve">Ze lag op haar zij, onder dezelfde groene deken. De pomp tikte. Ik stak mijn hand door de spijlen, zoals die eerste nacht op de keukenvloer, en legde hem tegen haar borst. Ze was warm.</w:t>
-      </w:r>
-    </w:p>
-    <w:p>
-      <w:pPr>
-        <w:pStyle w:val="BlockText"/>
-      </w:pPr>
-      <w:r>
-        <w:t xml:space="preserve">Ik zei haar naam. Daarna zei ik hem nog eens, zachter, alsof dat zou helpen.</w:t>
-      </w:r>
-    </w:p>
-    <w:p>
-      <w:pPr>
-        <w:pStyle w:val="BlockText"/>
-      </w:pPr>
-      <w:r>
-        <w:t xml:space="preserve">Gisteren had haar oor bewogen. Dat had ik gezien. Vandaag bewoog er niets. Ik keek naar het kleefband op haar poot en vroeg me af wat er sinds gisteren door dat buisje was gegaan. Ik heb het niet gevraagd.</w:t>
-      </w:r>
-    </w:p>
-    <w:p>
-      <w:pPr>
-        <w:pStyle w:val="BlockText"/>
-      </w:pPr>
-      <w:r>
-        <w:t xml:space="preserve">Ik heb twaalf jaar geleerd van een hond hoe je kijkt. Ik keek. Er was niets meer om te zien.</w:t>
-      </w:r>
-    </w:p>
     <w:bookmarkEnd w:id="76"/>
     <w:bookmarkEnd w:id="77"/>
-    <w:bookmarkStart w:id="82" w:name="terugkerende-rubrieken"/>
+    <w:bookmarkStart w:id="79" w:name="het-einde-schrijven-aanpak"/>
     <w:p>
       <w:pPr>
         <w:pStyle w:val="Heading1"/>
       </w:pPr>
       <w:r>
-        <w:t xml:space="preserve">12. Terugkerende rubrieken</w:t>
-      </w:r>
-    </w:p>
-    <w:bookmarkStart w:id="78" w:name="labradorwetten"/>
-    <w:p>
-      <w:pPr>
-        <w:pStyle w:val="Heading2"/>
-      </w:pPr>
-      <w:r>
-        <w:t xml:space="preserve">Labradorwetten</w:t>
+        <w:t xml:space="preserve">11. Het einde schrijven: aanpak</w:t>
+      </w:r>
+    </w:p>
+    <w:p>
+      <w:pPr>
+        <w:pStyle w:val="FirstParagraph"/>
+      </w:pPr>
+      <w:r>
+        <w:t xml:space="preserve">Het einde is het moeilijkste en belangrijkste deel van het boek. Deze afspraken gelden:</w:t>
       </w:r>
     </w:p>
     <w:p>
@@ -8637,13 +8887,46 @@
           <w:bCs/>
           <w:b/>
         </w:rPr>
-        <w:t xml:space="preserve">Nr. 3:</w:t>
-      </w:r>
-      <w:r>
-        <w:t xml:space="preserve"> </w:t>
-      </w:r>
-      <w:r>
-        <w:t xml:space="preserve">Je hoeft niet iedere bezoeker te vertrouwen. Maar je mag wel eerst even ruiken.</w:t>
+        <w:t xml:space="preserve">Geen gevoelswoorden.</w:t>
+      </w:r>
+      <w:r>
+        <w:t xml:space="preserve"> </w:t>
+      </w:r>
+      <w:r>
+        <w:t xml:space="preserve">Lode zegt nergens</w:t>
+      </w:r>
+      <w:r>
+        <w:t xml:space="preserve"> </w:t>
+      </w:r>
+      <w:r>
+        <w:t xml:space="preserve">“</w:t>
+      </w:r>
+      <w:r>
+        <w:t xml:space="preserve">ik was kapot</w:t>
+      </w:r>
+      <w:r>
+        <w:t xml:space="preserve">”</w:t>
+      </w:r>
+      <w:r>
+        <w:t xml:space="preserve"> </w:t>
+      </w:r>
+      <w:r>
+        <w:t xml:space="preserve">of</w:t>
+      </w:r>
+      <w:r>
+        <w:t xml:space="preserve"> </w:t>
+      </w:r>
+      <w:r>
+        <w:t xml:space="preserve">“</w:t>
+      </w:r>
+      <w:r>
+        <w:t xml:space="preserve">het brak mijn hart</w:t>
+      </w:r>
+      <w:r>
+        <w:t xml:space="preserve">”</w:t>
+      </w:r>
+      <w:r>
+        <w:t xml:space="preserve">. Het verdriet zit in dingen en handelingen: de halsband in zijn jaszak, de radio die uit blijft, de lijn aan de kapstok, het stukje vlees dat hij nog naast haar neus legt.</w:t>
       </w:r>
     </w:p>
     <w:p>
@@ -8659,13 +8942,31 @@
           <w:bCs/>
           <w:b/>
         </w:rPr>
-        <w:t xml:space="preserve">Nr. 11:</w:t>
-      </w:r>
-      <w:r>
-        <w:t xml:space="preserve"> </w:t>
-      </w:r>
-      <w:r>
-        <w:t xml:space="preserve">Wie altijd haast heeft, mist de interessantste geuren.</w:t>
+        <w:t xml:space="preserve">Tara’s methode in Lodes handen.</w:t>
+      </w:r>
+      <w:r>
+        <w:t xml:space="preserve"> </w:t>
+      </w:r>
+      <w:r>
+        <w:t xml:space="preserve">Hij noteert wat hij ziet, met vraagtekens:</w:t>
+      </w:r>
+      <w:r>
+        <w:t xml:space="preserve"> </w:t>
+      </w:r>
+      <w:r>
+        <w:t xml:space="preserve">“</w:t>
+      </w:r>
+      <w:r>
+        <w:t xml:space="preserve">Oor bewoog, mogelijk. Neus, mogelijk.</w:t>
+      </w:r>
+      <w:r>
+        <w:t xml:space="preserve">”</w:t>
+      </w:r>
+      <w:r>
+        <w:t xml:space="preserve"> </w:t>
+      </w:r>
+      <w:r>
+        <w:t xml:space="preserve">De lezer begrijpt dat hij twaalf jaar heeft geleerd zo te kijken, en dat het nu niet genoeg is.</w:t>
       </w:r>
     </w:p>
     <w:p>
@@ -8681,13 +8982,13 @@
           <w:bCs/>
           <w:b/>
         </w:rPr>
-        <w:t xml:space="preserve">Nr. 22:</w:t>
-      </w:r>
-      <w:r>
-        <w:t xml:space="preserve"> </w:t>
-      </w:r>
-      <w:r>
-        <w:t xml:space="preserve">Mensen bewaren herinneringen. Wij bewaren geuren.</w:t>
+        <w:t xml:space="preserve">De twijfel blijft staan.</w:t>
+      </w:r>
+      <w:r>
+        <w:t xml:space="preserve"> </w:t>
+      </w:r>
+      <w:r>
+        <w:t xml:space="preserve">Het boek oordeelt niet of de beslissing juist was. Lode doet het zelf ook niet. Hij leeft ermee.</w:t>
       </w:r>
     </w:p>
     <w:p>
@@ -8703,13 +9004,13 @@
           <w:bCs/>
           <w:b/>
         </w:rPr>
-        <w:t xml:space="preserve">Nr. 31:</w:t>
-      </w:r>
-      <w:r>
-        <w:t xml:space="preserve"> </w:t>
-      </w:r>
-      <w:r>
-        <w:t xml:space="preserve">Een wandeling is nooit dezelfde. Alleen mensen denken dat.</w:t>
+        <w:t xml:space="preserve">De dierenartsen blijven menselijk.</w:t>
+      </w:r>
+      <w:r>
+        <w:t xml:space="preserve"> </w:t>
+      </w:r>
+      <w:r>
+        <w:t xml:space="preserve">De chirurgijn heeft voor Tara gevochten. De jonge dierenarts op de intensieve zorg is voorzichtig en vriendelijk. Lodes vermoeden over de injectie is zijn vermoeden, niet de waarheid van het boek.</w:t>
       </w:r>
     </w:p>
     <w:p>
@@ -8725,13 +9026,13 @@
           <w:bCs/>
           <w:b/>
         </w:rPr>
-        <w:t xml:space="preserve">Nr. 38 (nieuw):</w:t>
-      </w:r>
-      <w:r>
-        <w:t xml:space="preserve"> </w:t>
-      </w:r>
-      <w:r>
-        <w:t xml:space="preserve">Wie eerst eet, moet ook delen. Anders is het geen roedel, maar een restaurant.</w:t>
+        <w:t xml:space="preserve">Kort.</w:t>
+      </w:r>
+      <w:r>
+        <w:t xml:space="preserve"> </w:t>
+      </w:r>
+      <w:r>
+        <w:t xml:space="preserve">Hoofdstuk 25 en 26 samen zijn hoogstens 3.600 woorden. Witregels en korte alinea’s doen het werk.</w:t>
       </w:r>
     </w:p>
     <w:p>
@@ -8747,45 +9048,82 @@
           <w:bCs/>
           <w:b/>
         </w:rPr>
-        <w:t xml:space="preserve">Nr. 45:</w:t>
-      </w:r>
-      <w:r>
-        <w:t xml:space="preserve"> </w:t>
-      </w:r>
-      <w:r>
-        <w:t xml:space="preserve">Een goede onderzoeker twijfelt aan haar hypothese. Een goede hond twijfelt nooit aan haar baas.</w:t>
-      </w:r>
-    </w:p>
-    <w:p>
-      <w:pPr>
-        <w:numPr>
-          <w:ilvl w:val="0"/>
-          <w:numId w:val="1015"/>
-        </w:numPr>
-        <w:pStyle w:val="Compact"/>
-      </w:pPr>
-      <w:r>
-        <w:rPr>
-          <w:bCs/>
-          <w:b/>
-        </w:rPr>
-        <w:t xml:space="preserve">Nr. 52:</w:t>
-      </w:r>
-      <w:r>
-        <w:t xml:space="preserve"> </w:t>
-      </w:r>
-      <w:r>
-        <w:t xml:space="preserve">Wat je niet begrijpt, mag je nog steeds liefhebben.</w:t>
+        <w:t xml:space="preserve">De epiloog</w:t>
+      </w:r>
+      <w:r>
+        <w:t xml:space="preserve"> </w:t>
+      </w:r>
+      <w:r>
+        <w:t xml:space="preserve">staat in Lodes stem, als voortzetting van hoofdstuk 26. Het ontbrekende lied draagt de epiloog: het verdriet zit in de stilte op het uur waarop zij altijd zong.</w:t>
+      </w:r>
+    </w:p>
+    <w:bookmarkStart w:id="78" w:name="Xead231bbf92b2b64993506410400f6d97d1b6d5"/>
+    <w:p>
+      <w:pPr>
+        <w:pStyle w:val="Heading2"/>
+      </w:pPr>
+      <w:r>
+        <w:t xml:space="preserve">Voorbeeld van de toon (richting, geen definitieve tekst)</w:t>
+      </w:r>
+    </w:p>
+    <w:p>
+      <w:pPr>
+        <w:pStyle w:val="BlockText"/>
+      </w:pPr>
+      <w:r>
+        <w:t xml:space="preserve">Observatie, tweede bezoek.</w:t>
+      </w:r>
+    </w:p>
+    <w:p>
+      <w:pPr>
+        <w:pStyle w:val="BlockText"/>
+      </w:pPr>
+      <w:r>
+        <w:t xml:space="preserve">Ze lag op haar zij, onder dezelfde groene deken. De pomp tikte. Ik stak mijn hand door de spijlen, zoals die eerste nacht op de keukenvloer, en legde hem tegen haar borst. Ze was warm.</w:t>
+      </w:r>
+    </w:p>
+    <w:p>
+      <w:pPr>
+        <w:pStyle w:val="BlockText"/>
+      </w:pPr>
+      <w:r>
+        <w:t xml:space="preserve">Ik zei haar naam. Daarna zei ik hem nog eens, zachter, alsof dat zou helpen.</w:t>
+      </w:r>
+    </w:p>
+    <w:p>
+      <w:pPr>
+        <w:pStyle w:val="BlockText"/>
+      </w:pPr>
+      <w:r>
+        <w:t xml:space="preserve">Gisteren had haar oor bewogen. Dat had ik gezien. Vandaag bewoog er niets. Ik keek naar het kleefband op haar poot en vroeg me af wat er sinds gisteren door dat buisje was gegaan. Ik heb het niet gevraagd.</w:t>
+      </w:r>
+    </w:p>
+    <w:p>
+      <w:pPr>
+        <w:pStyle w:val="BlockText"/>
+      </w:pPr>
+      <w:r>
+        <w:t xml:space="preserve">Ik heb twaalf jaar geleerd van een hond hoe je kijkt. Ik keek. Er was niets meer om te zien.</w:t>
       </w:r>
     </w:p>
     <w:bookmarkEnd w:id="78"/>
-    <w:bookmarkStart w:id="79" w:name="onderzoeksdossiers"/>
+    <w:bookmarkEnd w:id="79"/>
+    <w:bookmarkStart w:id="84" w:name="terugkerende-rubrieken"/>
+    <w:p>
+      <w:pPr>
+        <w:pStyle w:val="Heading1"/>
+      </w:pPr>
+      <w:r>
+        <w:t xml:space="preserve">12. Terugkerende rubrieken</w:t>
+      </w:r>
+    </w:p>
+    <w:bookmarkStart w:id="80" w:name="labradorwetten"/>
     <w:p>
       <w:pPr>
         <w:pStyle w:val="Heading2"/>
       </w:pPr>
       <w:r>
-        <w:t xml:space="preserve">Onderzoeksdossiers</w:t>
+        <w:t xml:space="preserve">Labradorwetten</w:t>
       </w:r>
     </w:p>
     <w:p>
@@ -8801,13 +9139,13 @@
           <w:bCs/>
           <w:b/>
         </w:rPr>
-        <w:t xml:space="preserve">Dossier 7:</w:t>
-      </w:r>
-      <w:r>
-        <w:t xml:space="preserve"> </w:t>
-      </w:r>
-      <w:r>
-        <w:t xml:space="preserve">de rode bal. Status: onzichtbaar. Vermoedelijk gemaakt van geur alleen.</w:t>
+        <w:t xml:space="preserve">Nr. 1 (nieuw):</w:t>
+      </w:r>
+      <w:r>
+        <w:t xml:space="preserve"> </w:t>
+      </w:r>
+      <w:r>
+        <w:t xml:space="preserve">Kies zelf je mens. Hij denkt toch dat hij jou gekozen heeft.</w:t>
       </w:r>
     </w:p>
     <w:p>
@@ -8823,13 +9161,13 @@
           <w:bCs/>
           <w:b/>
         </w:rPr>
-        <w:t xml:space="preserve">Dossier 18:</w:t>
-      </w:r>
-      <w:r>
-        <w:t xml:space="preserve"> </w:t>
-      </w:r>
-      <w:r>
-        <w:t xml:space="preserve">waarom mensen applaudisseren. Status: nog onbegrepen. Opmerking: niemand krijgt een koekje.</w:t>
+        <w:t xml:space="preserve">Nr. 3:</w:t>
+      </w:r>
+      <w:r>
+        <w:t xml:space="preserve"> </w:t>
+      </w:r>
+      <w:r>
+        <w:t xml:space="preserve">Je hoeft niet iedere bezoeker te vertrouwen. Maar je mag wel eerst even ruiken.</w:t>
       </w:r>
     </w:p>
     <w:p>
@@ -8845,13 +9183,13 @@
           <w:bCs/>
           <w:b/>
         </w:rPr>
-        <w:t xml:space="preserve">Dossier 26 (nieuw):</w:t>
-      </w:r>
-      <w:r>
-        <w:t xml:space="preserve"> </w:t>
-      </w:r>
-      <w:r>
-        <w:t xml:space="preserve">de krant. Status: gearchiveerd. De proefpersoon leest sindsdien op een plat licht ding dat niet ritselt. Aanbeveling: geen verder onderzoek nodig.</w:t>
+        <w:t xml:space="preserve">Nr. 11:</w:t>
+      </w:r>
+      <w:r>
+        <w:t xml:space="preserve"> </w:t>
+      </w:r>
+      <w:r>
+        <w:t xml:space="preserve">Wie altijd haast heeft, mist de interessantste geuren.</w:t>
       </w:r>
     </w:p>
     <w:p>
@@ -8867,13 +9205,13 @@
           <w:bCs/>
           <w:b/>
         </w:rPr>
-        <w:t xml:space="preserve">Dossier 41:</w:t>
-      </w:r>
-      <w:r>
-        <w:t xml:space="preserve"> </w:t>
-      </w:r>
-      <w:r>
-        <w:t xml:space="preserve">de stofzuiger. Status: levensgevaarlijk. Aanbeveling: vanop veilige afstand blijven observeren.</w:t>
+        <w:t xml:space="preserve">Nr. 22:</w:t>
+      </w:r>
+      <w:r>
+        <w:t xml:space="preserve"> </w:t>
+      </w:r>
+      <w:r>
+        <w:t xml:space="preserve">Mensen bewaren herinneringen. Wij bewaren geuren.</w:t>
       </w:r>
     </w:p>
     <w:p>
@@ -8889,13 +9227,13 @@
           <w:bCs/>
           <w:b/>
         </w:rPr>
-        <w:t xml:space="preserve">Dossier 64:</w:t>
-      </w:r>
-      <w:r>
-        <w:t xml:space="preserve"> </w:t>
-      </w:r>
-      <w:r>
-        <w:t xml:space="preserve">gapen. Status: besmettelijk, maar uitsluitend bij eigen mensen.</w:t>
+        <w:t xml:space="preserve">Nr. 31:</w:t>
+      </w:r>
+      <w:r>
+        <w:t xml:space="preserve"> </w:t>
+      </w:r>
+      <w:r>
+        <w:t xml:space="preserve">Een wandeling is nooit dezelfde. Alleen mensen denken dat.</w:t>
       </w:r>
     </w:p>
     <w:p>
@@ -8911,13 +9249,13 @@
           <w:bCs/>
           <w:b/>
         </w:rPr>
-        <w:t xml:space="preserve">Dossier 72:</w:t>
-      </w:r>
-      <w:r>
-        <w:t xml:space="preserve"> </w:t>
-      </w:r>
-      <w:r>
-        <w:t xml:space="preserve">Kerstmis. Status: onverklaarbaar.</w:t>
+        <w:t xml:space="preserve">Nr. 38 (nieuw):</w:t>
+      </w:r>
+      <w:r>
+        <w:t xml:space="preserve"> </w:t>
+      </w:r>
+      <w:r>
+        <w:t xml:space="preserve">Wie eerst eet, moet ook delen. Anders is het geen roedel, maar een restaurant.</w:t>
       </w:r>
     </w:p>
     <w:p>
@@ -8933,13 +9271,13 @@
           <w:bCs/>
           <w:b/>
         </w:rPr>
-        <w:t xml:space="preserve">Dossier 89:</w:t>
-      </w:r>
-      <w:r>
-        <w:t xml:space="preserve"> </w:t>
-      </w:r>
-      <w:r>
-        <w:t xml:space="preserve">de postbode. Status: reproduceerbaar gevaar. Opmerking: in twaalf jaar drie verschillende geuren in hetzelfde uniform. Alle drie verdacht.</w:t>
+        <w:t xml:space="preserve">Nr. 45:</w:t>
+      </w:r>
+      <w:r>
+        <w:t xml:space="preserve"> </w:t>
+      </w:r>
+      <w:r>
+        <w:t xml:space="preserve">Een goede onderzoeker twijfelt aan haar hypothese. Een goede hond twijfelt nooit aan haar baas.</w:t>
       </w:r>
     </w:p>
     <w:p>
@@ -8955,63 +9293,23 @@
           <w:bCs/>
           <w:b/>
         </w:rPr>
-        <w:t xml:space="preserve">Dossier 95 (nieuw):</w:t>
-      </w:r>
-      <w:r>
-        <w:t xml:space="preserve"> </w:t>
-      </w:r>
-      <w:r>
-        <w:t xml:space="preserve">het bordje in het bos. Status: de proefpersoon kan het lezen en negeert het. De boswachter kan het lezen en wijst ernaar. Conclusie: het bordje heeft twee betekenissen.</w:t>
-      </w:r>
-    </w:p>
-    <w:p>
-      <w:pPr>
-        <w:numPr>
-          <w:ilvl w:val="0"/>
-          <w:numId w:val="1016"/>
-        </w:numPr>
-        <w:pStyle w:val="Compact"/>
-      </w:pPr>
-      <w:r>
-        <w:rPr>
-          <w:bCs/>
-          <w:b/>
-        </w:rPr>
-        <w:t xml:space="preserve">Dossier 103:</w:t>
-      </w:r>
-      <w:r>
-        <w:t xml:space="preserve"> </w:t>
-      </w:r>
-      <w:r>
-        <w:t xml:space="preserve">de spiegel. Status: een tweede hond die nooit buiten komt. Zeer onbeleefd.</w:t>
-      </w:r>
-    </w:p>
-    <w:bookmarkEnd w:id="79"/>
-    <w:bookmarkStart w:id="80" w:name="opmerkingen-van-de-kat"/>
+        <w:t xml:space="preserve">Nr. 52:</w:t>
+      </w:r>
+      <w:r>
+        <w:t xml:space="preserve"> </w:t>
+      </w:r>
+      <w:r>
+        <w:t xml:space="preserve">Wat je niet begrijpt, mag je nog steeds liefhebben.</w:t>
+      </w:r>
+    </w:p>
+    <w:bookmarkEnd w:id="80"/>
+    <w:bookmarkStart w:id="81" w:name="onderzoeksdossiers"/>
     <w:p>
       <w:pPr>
         <w:pStyle w:val="Heading2"/>
       </w:pPr>
       <w:r>
-        <w:t xml:space="preserve">Opmerkingen van de kat</w:t>
-      </w:r>
-    </w:p>
-    <w:p>
-      <w:pPr>
-        <w:pStyle w:val="FirstParagraph"/>
-      </w:pPr>
-      <w:r>
-        <w:t xml:space="preserve">Hoogstens zes in het hele boek, en altijd gedrag, nooit gedachten.</w:t>
-      </w:r>
-    </w:p>
-    <w:bookmarkEnd w:id="80"/>
-    <w:bookmarkStart w:id="81" w:name="de-langetermijnstudie"/>
-    <w:p>
-      <w:pPr>
-        <w:pStyle w:val="Heading2"/>
-      </w:pPr>
-      <w:r>
-        <w:t xml:space="preserve">De langetermijnstudie</w:t>
+        <w:t xml:space="preserve">Onderzoeksdossiers</w:t>
       </w:r>
     </w:p>
     <w:p>
@@ -9027,13 +9325,13 @@
           <w:bCs/>
           <w:b/>
         </w:rPr>
-        <w:t xml:space="preserve">Looptijd:</w:t>
-      </w:r>
-      <w:r>
-        <w:t xml:space="preserve"> </w:t>
-      </w:r>
-      <w:r>
-        <w:t xml:space="preserve">twaalf jaar.</w:t>
+        <w:t xml:space="preserve">Dossier 2 (nieuw):</w:t>
+      </w:r>
+      <w:r>
+        <w:t xml:space="preserve"> </w:t>
+      </w:r>
+      <w:r>
+        <w:t xml:space="preserve">het lied. Status: onverklaard. Opmerking: de onderzoeker kan haar eigen gedrag niet verklaren. Het lied werkt alleen met iets in de mond. De proefpersoon heeft dit in Deel II experimenteel bevestigd. Zeer irritant.</w:t>
       </w:r>
     </w:p>
     <w:p>
@@ -9049,13 +9347,13 @@
           <w:bCs/>
           <w:b/>
         </w:rPr>
-        <w:t xml:space="preserve">Proefpersonen:</w:t>
-      </w:r>
-      <w:r>
-        <w:t xml:space="preserve"> </w:t>
-      </w:r>
-      <w:r>
-        <w:t xml:space="preserve">vier volwassen mensen, twee kinderen, één kat en drie postbodes.</w:t>
+        <w:t xml:space="preserve">Dossier 7:</w:t>
+      </w:r>
+      <w:r>
+        <w:t xml:space="preserve"> </w:t>
+      </w:r>
+      <w:r>
+        <w:t xml:space="preserve">de rode bal. Status: onzichtbaar. Vermoedelijk gemaakt van geur alleen.</w:t>
       </w:r>
     </w:p>
     <w:p>
@@ -9071,13 +9369,13 @@
           <w:bCs/>
           <w:b/>
         </w:rPr>
-        <w:t xml:space="preserve">Wandelingen:</w:t>
-      </w:r>
-      <w:r>
-        <w:t xml:space="preserve"> </w:t>
-      </w:r>
-      <w:r>
-        <w:t xml:space="preserve">ongeveer negenduizend, waarvan een groot deel dogtime.</w:t>
+        <w:t xml:space="preserve">Dossier 18:</w:t>
+      </w:r>
+      <w:r>
+        <w:t xml:space="preserve"> </w:t>
+      </w:r>
+      <w:r>
+        <w:t xml:space="preserve">waarom mensen applaudisseren. Status: nog onbegrepen. Opmerking: niemand krijgt een koekje.</w:t>
       </w:r>
     </w:p>
     <w:p>
@@ -9093,6 +9391,276 @@
           <w:bCs/>
           <w:b/>
         </w:rPr>
+        <w:t xml:space="preserve">Dossier 26 (nieuw):</w:t>
+      </w:r>
+      <w:r>
+        <w:t xml:space="preserve"> </w:t>
+      </w:r>
+      <w:r>
+        <w:t xml:space="preserve">de krant. Status: gearchiveerd. De proefpersoon leest sindsdien op een plat licht ding dat niet ritselt. Aanbeveling: geen verder onderzoek nodig.</w:t>
+      </w:r>
+    </w:p>
+    <w:p>
+      <w:pPr>
+        <w:numPr>
+          <w:ilvl w:val="0"/>
+          <w:numId w:val="1017"/>
+        </w:numPr>
+        <w:pStyle w:val="Compact"/>
+      </w:pPr>
+      <w:r>
+        <w:rPr>
+          <w:bCs/>
+          <w:b/>
+        </w:rPr>
+        <w:t xml:space="preserve">Dossier 41:</w:t>
+      </w:r>
+      <w:r>
+        <w:t xml:space="preserve"> </w:t>
+      </w:r>
+      <w:r>
+        <w:t xml:space="preserve">de stofzuiger. Status: levensgevaarlijk. Aanbeveling: vanop veilige afstand blijven observeren.</w:t>
+      </w:r>
+    </w:p>
+    <w:p>
+      <w:pPr>
+        <w:numPr>
+          <w:ilvl w:val="0"/>
+          <w:numId w:val="1017"/>
+        </w:numPr>
+        <w:pStyle w:val="Compact"/>
+      </w:pPr>
+      <w:r>
+        <w:rPr>
+          <w:bCs/>
+          <w:b/>
+        </w:rPr>
+        <w:t xml:space="preserve">Dossier 64:</w:t>
+      </w:r>
+      <w:r>
+        <w:t xml:space="preserve"> </w:t>
+      </w:r>
+      <w:r>
+        <w:t xml:space="preserve">gapen. Status: besmettelijk, maar uitsluitend bij eigen mensen.</w:t>
+      </w:r>
+    </w:p>
+    <w:p>
+      <w:pPr>
+        <w:numPr>
+          <w:ilvl w:val="0"/>
+          <w:numId w:val="1017"/>
+        </w:numPr>
+        <w:pStyle w:val="Compact"/>
+      </w:pPr>
+      <w:r>
+        <w:rPr>
+          <w:bCs/>
+          <w:b/>
+        </w:rPr>
+        <w:t xml:space="preserve">Dossier 72:</w:t>
+      </w:r>
+      <w:r>
+        <w:t xml:space="preserve"> </w:t>
+      </w:r>
+      <w:r>
+        <w:t xml:space="preserve">Kerstmis. Status: onverklaarbaar.</w:t>
+      </w:r>
+    </w:p>
+    <w:p>
+      <w:pPr>
+        <w:numPr>
+          <w:ilvl w:val="0"/>
+          <w:numId w:val="1017"/>
+        </w:numPr>
+        <w:pStyle w:val="Compact"/>
+      </w:pPr>
+      <w:r>
+        <w:rPr>
+          <w:bCs/>
+          <w:b/>
+        </w:rPr>
+        <w:t xml:space="preserve">Dossier 58 (nieuw):</w:t>
+      </w:r>
+      <w:r>
+        <w:t xml:space="preserve"> </w:t>
+      </w:r>
+      <w:r>
+        <w:t xml:space="preserve">de brief van de gemeente. Status: gevaarlijk. Een witte envelop zonder geur van een bekende mens, en toch werd de proefpersoon er stil van. Aanbeveling: alle witte enveloppen voortaan wantrouwen.</w:t>
+      </w:r>
+    </w:p>
+    <w:p>
+      <w:pPr>
+        <w:numPr>
+          <w:ilvl w:val="0"/>
+          <w:numId w:val="1017"/>
+        </w:numPr>
+        <w:pStyle w:val="Compact"/>
+      </w:pPr>
+      <w:r>
+        <w:rPr>
+          <w:bCs/>
+          <w:b/>
+        </w:rPr>
+        <w:t xml:space="preserve">Dossier 89:</w:t>
+      </w:r>
+      <w:r>
+        <w:t xml:space="preserve"> </w:t>
+      </w:r>
+      <w:r>
+        <w:t xml:space="preserve">de postbode. Status: reproduceerbaar gevaar. Opmerking: in twaalf jaar drie verschillende geuren in hetzelfde uniform. Alle drie verdacht.</w:t>
+      </w:r>
+    </w:p>
+    <w:p>
+      <w:pPr>
+        <w:numPr>
+          <w:ilvl w:val="0"/>
+          <w:numId w:val="1017"/>
+        </w:numPr>
+        <w:pStyle w:val="Compact"/>
+      </w:pPr>
+      <w:r>
+        <w:rPr>
+          <w:bCs/>
+          <w:b/>
+        </w:rPr>
+        <w:t xml:space="preserve">Dossier 95 (nieuw):</w:t>
+      </w:r>
+      <w:r>
+        <w:t xml:space="preserve"> </w:t>
+      </w:r>
+      <w:r>
+        <w:t xml:space="preserve">het bordje in het bos. Status: de proefpersoon kan het lezen en negeert het. De boswachter kan het lezen en wijst ernaar. Conclusie: het bordje heeft twee betekenissen.</w:t>
+      </w:r>
+    </w:p>
+    <w:p>
+      <w:pPr>
+        <w:numPr>
+          <w:ilvl w:val="0"/>
+          <w:numId w:val="1017"/>
+        </w:numPr>
+        <w:pStyle w:val="Compact"/>
+      </w:pPr>
+      <w:r>
+        <w:rPr>
+          <w:bCs/>
+          <w:b/>
+        </w:rPr>
+        <w:t xml:space="preserve">Dossier 103:</w:t>
+      </w:r>
+      <w:r>
+        <w:t xml:space="preserve"> </w:t>
+      </w:r>
+      <w:r>
+        <w:t xml:space="preserve">de spiegel. Status: een tweede hond die nooit buiten komt. Zeer onbeleefd.</w:t>
+      </w:r>
+    </w:p>
+    <w:bookmarkEnd w:id="81"/>
+    <w:bookmarkStart w:id="82" w:name="opmerkingen-van-de-kat"/>
+    <w:p>
+      <w:pPr>
+        <w:pStyle w:val="Heading2"/>
+      </w:pPr>
+      <w:r>
+        <w:t xml:space="preserve">Opmerkingen van de kat</w:t>
+      </w:r>
+    </w:p>
+    <w:p>
+      <w:pPr>
+        <w:pStyle w:val="FirstParagraph"/>
+      </w:pPr>
+      <w:r>
+        <w:t xml:space="preserve">Hoogstens zes in het hele boek, en altijd gedrag, nooit gedachten.</w:t>
+      </w:r>
+    </w:p>
+    <w:bookmarkEnd w:id="82"/>
+    <w:bookmarkStart w:id="83" w:name="de-langetermijnstudie"/>
+    <w:p>
+      <w:pPr>
+        <w:pStyle w:val="Heading2"/>
+      </w:pPr>
+      <w:r>
+        <w:t xml:space="preserve">De langetermijnstudie</w:t>
+      </w:r>
+    </w:p>
+    <w:p>
+      <w:pPr>
+        <w:numPr>
+          <w:ilvl w:val="0"/>
+          <w:numId w:val="1018"/>
+        </w:numPr>
+        <w:pStyle w:val="Compact"/>
+      </w:pPr>
+      <w:r>
+        <w:rPr>
+          <w:bCs/>
+          <w:b/>
+        </w:rPr>
+        <w:t xml:space="preserve">Looptijd:</w:t>
+      </w:r>
+      <w:r>
+        <w:t xml:space="preserve"> </w:t>
+      </w:r>
+      <w:r>
+        <w:t xml:space="preserve">twaalf jaar.</w:t>
+      </w:r>
+    </w:p>
+    <w:p>
+      <w:pPr>
+        <w:numPr>
+          <w:ilvl w:val="0"/>
+          <w:numId w:val="1018"/>
+        </w:numPr>
+        <w:pStyle w:val="Compact"/>
+      </w:pPr>
+      <w:r>
+        <w:rPr>
+          <w:bCs/>
+          <w:b/>
+        </w:rPr>
+        <w:t xml:space="preserve">Proefpersonen:</w:t>
+      </w:r>
+      <w:r>
+        <w:t xml:space="preserve"> </w:t>
+      </w:r>
+      <w:r>
+        <w:t xml:space="preserve">vier volwassen mensen, twee kinderen, één kat en drie postbodes.</w:t>
+      </w:r>
+    </w:p>
+    <w:p>
+      <w:pPr>
+        <w:numPr>
+          <w:ilvl w:val="0"/>
+          <w:numId w:val="1018"/>
+        </w:numPr>
+        <w:pStyle w:val="Compact"/>
+      </w:pPr>
+      <w:r>
+        <w:rPr>
+          <w:bCs/>
+          <w:b/>
+        </w:rPr>
+        <w:t xml:space="preserve">Wandelingen:</w:t>
+      </w:r>
+      <w:r>
+        <w:t xml:space="preserve"> </w:t>
+      </w:r>
+      <w:r>
+        <w:t xml:space="preserve">ongeveer negenduizend, waarvan een groot deel dogtime.</w:t>
+      </w:r>
+    </w:p>
+    <w:p>
+      <w:pPr>
+        <w:numPr>
+          <w:ilvl w:val="0"/>
+          <w:numId w:val="1018"/>
+        </w:numPr>
+        <w:pStyle w:val="Compact"/>
+      </w:pPr>
+      <w:r>
+        <w:rPr>
+          <w:bCs/>
+          <w:b/>
+        </w:rPr>
         <w:t xml:space="preserve">Slotsom:</w:t>
       </w:r>
       <w:r>
@@ -9102,9 +9670,9 @@
         <w:t xml:space="preserve">nog steeds geen sluitende verklaring gevonden. De studie wordt afgesloten door de proefpersoon (hoofdstuk 26).</w:t>
       </w:r>
     </w:p>
-    <w:bookmarkEnd w:id="81"/>
-    <w:bookmarkEnd w:id="82"/>
-    <w:bookmarkStart w:id="83" w:name="wandelingen-per-hoofdstuk"/>
+    <w:bookmarkEnd w:id="83"/>
+    <w:bookmarkEnd w:id="84"/>
+    <w:bookmarkStart w:id="85" w:name="wandelingen-per-hoofdstuk"/>
     <w:p>
       <w:pPr>
         <w:pStyle w:val="Heading1"/>
@@ -9547,106 +10115,14 @@
         </w:tc>
       </w:tr>
     </w:tbl>
-    <w:bookmarkEnd w:id="83"/>
-    <w:bookmarkStart w:id="84" w:name="vormgeving-en-illustraties"/>
+    <w:bookmarkEnd w:id="85"/>
+    <w:bookmarkStart w:id="86" w:name="vormgeving-en-illustraties"/>
     <w:p>
       <w:pPr>
         <w:pStyle w:val="Heading1"/>
       </w:pPr>
       <w:r>
         <w:t xml:space="preserve">14. Vormgeving en illustraties</w:t>
-      </w:r>
-    </w:p>
-    <w:p>
-      <w:pPr>
-        <w:numPr>
-          <w:ilvl w:val="0"/>
-          <w:numId w:val="1018"/>
-        </w:numPr>
-        <w:pStyle w:val="Compact"/>
-      </w:pPr>
-      <w:r>
-        <w:t xml:space="preserve">Pootafdrukken als markering voor hoofdstukken en rubrieken.</w:t>
-      </w:r>
-    </w:p>
-    <w:p>
-      <w:pPr>
-        <w:numPr>
-          <w:ilvl w:val="0"/>
-          <w:numId w:val="1018"/>
-        </w:numPr>
-        <w:pStyle w:val="Compact"/>
-      </w:pPr>
-      <w:r>
-        <w:t xml:space="preserve">Onderzoeksdossiers als handgeschreven notitiekaartjes; Labradorwetten als omkaderd citaat.</w:t>
-      </w:r>
-    </w:p>
-    <w:p>
-      <w:pPr>
-        <w:numPr>
-          <w:ilvl w:val="0"/>
-          <w:numId w:val="1018"/>
-        </w:numPr>
-        <w:pStyle w:val="Compact"/>
-      </w:pPr>
-      <w:r>
-        <w:t xml:space="preserve">Pseudowetenschappelijke schema’s en een geurkaart in de bijlage.</w:t>
-      </w:r>
-    </w:p>
-    <w:p>
-      <w:pPr>
-        <w:numPr>
-          <w:ilvl w:val="0"/>
-          <w:numId w:val="1018"/>
-        </w:numPr>
-        <w:pStyle w:val="Compact"/>
-      </w:pPr>
-      <w:r>
-        <w:t xml:space="preserve">Lijntekeningen van Tara, vooral in blauw en geel, de kleuren die zij zelf ziet.</w:t>
-      </w:r>
-    </w:p>
-    <w:p>
-      <w:pPr>
-        <w:numPr>
-          <w:ilvl w:val="0"/>
-          <w:numId w:val="1018"/>
-        </w:numPr>
-        <w:pStyle w:val="Compact"/>
-      </w:pPr>
-      <w:r>
-        <w:t xml:space="preserve">Een rij pootafdrukken die per Deel grijzer wordt.</w:t>
-      </w:r>
-    </w:p>
-    <w:p>
-      <w:pPr>
-        <w:numPr>
-          <w:ilvl w:val="0"/>
-          <w:numId w:val="1018"/>
-        </w:numPr>
-        <w:pStyle w:val="Compact"/>
-      </w:pPr>
-      <w:r>
-        <w:rPr>
-          <w:bCs/>
-          <w:b/>
-        </w:rPr>
-        <w:t xml:space="preserve">Hoofdstuk 26 krijgt een andere vormgeving:</w:t>
-      </w:r>
-      <w:r>
-        <w:t xml:space="preserve"> </w:t>
-      </w:r>
-      <w:r>
-        <w:t xml:space="preserve">geen pootafdruk maar een gewoon, gelinieerd blad, alsof Lode het in een schrift heeft geschreven.</w:t>
-      </w:r>
-    </w:p>
-    <w:bookmarkEnd w:id="84"/>
-    <w:bookmarkStart w:id="85" w:name="wat-we-bewust-niet-gebruiken"/>
-    <w:p>
-      <w:pPr>
-        <w:pStyle w:val="Heading1"/>
-      </w:pPr>
-      <w:r>
-        <w:t xml:space="preserve">15. Wat we bewust niet gebruiken</w:t>
       </w:r>
     </w:p>
     <w:p>
@@ -9658,7 +10134,7 @@
         <w:pStyle w:val="Compact"/>
       </w:pPr>
       <w:r>
-        <w:t xml:space="preserve">De gids over de humoristische thriller en de experimentele satire.</w:t>
+        <w:t xml:space="preserve">Pootafdrukken als markering voor hoofdstukken en rubrieken.</w:t>
       </w:r>
     </w:p>
     <w:p>
@@ -9670,7 +10146,7 @@
         <w:pStyle w:val="Compact"/>
       </w:pPr>
       <w:r>
-        <w:t xml:space="preserve">De oude scènes met Buster als kant-en-klare tekst.</w:t>
+        <w:t xml:space="preserve">Onderzoeksdossiers als handgeschreven notitiekaartjes; Labradorwetten als omkaderd citaat.</w:t>
       </w:r>
     </w:p>
     <w:p>
@@ -9682,7 +10158,7 @@
         <w:pStyle w:val="Compact"/>
       </w:pPr>
       <w:r>
-        <w:t xml:space="preserve">Een volwassen baby en kleinkinderen binnen één hondenleven.</w:t>
+        <w:t xml:space="preserve">Pseudowetenschappelijke schema’s en een geurkaart in de bijlage.</w:t>
       </w:r>
     </w:p>
     <w:p>
@@ -9694,7 +10170,7 @@
         <w:pStyle w:val="Compact"/>
       </w:pPr>
       <w:r>
-        <w:t xml:space="preserve">De kat met eigen gedachten.</w:t>
+        <w:t xml:space="preserve">Lijntekeningen van Tara, vooral in blauw en geel, de kleuren die zij zelf ziet.</w:t>
       </w:r>
     </w:p>
     <w:p>
@@ -9706,7 +10182,7 @@
         <w:pStyle w:val="Compact"/>
       </w:pPr>
       <w:r>
-        <w:t xml:space="preserve">Een brief van Tara aan de lezer.</w:t>
+        <w:t xml:space="preserve">Een rij pootafdrukken die per Deel grijzer wordt.</w:t>
       </w:r>
     </w:p>
     <w:p>
@@ -9718,11 +10194,103 @@
         <w:pStyle w:val="Compact"/>
       </w:pPr>
       <w:r>
+        <w:rPr>
+          <w:bCs/>
+          <w:b/>
+        </w:rPr>
+        <w:t xml:space="preserve">Hoofdstuk 26 krijgt een andere vormgeving:</w:t>
+      </w:r>
+      <w:r>
+        <w:t xml:space="preserve"> </w:t>
+      </w:r>
+      <w:r>
+        <w:t xml:space="preserve">geen pootafdruk maar een gewoon, gelinieerd blad, alsof Lode het in een schrift heeft geschreven.</w:t>
+      </w:r>
+    </w:p>
+    <w:bookmarkEnd w:id="86"/>
+    <w:bookmarkStart w:id="87" w:name="wat-we-bewust-niet-gebruiken"/>
+    <w:p>
+      <w:pPr>
+        <w:pStyle w:val="Heading1"/>
+      </w:pPr>
+      <w:r>
+        <w:t xml:space="preserve">15. Wat we bewust niet gebruiken</w:t>
+      </w:r>
+    </w:p>
+    <w:p>
+      <w:pPr>
+        <w:numPr>
+          <w:ilvl w:val="0"/>
+          <w:numId w:val="1020"/>
+        </w:numPr>
+        <w:pStyle w:val="Compact"/>
+      </w:pPr>
+      <w:r>
+        <w:t xml:space="preserve">De gids over de humoristische thriller en de experimentele satire.</w:t>
+      </w:r>
+    </w:p>
+    <w:p>
+      <w:pPr>
+        <w:numPr>
+          <w:ilvl w:val="0"/>
+          <w:numId w:val="1020"/>
+        </w:numPr>
+        <w:pStyle w:val="Compact"/>
+      </w:pPr>
+      <w:r>
+        <w:t xml:space="preserve">De oude scènes met Buster als kant-en-klare tekst.</w:t>
+      </w:r>
+    </w:p>
+    <w:p>
+      <w:pPr>
+        <w:numPr>
+          <w:ilvl w:val="0"/>
+          <w:numId w:val="1020"/>
+        </w:numPr>
+        <w:pStyle w:val="Compact"/>
+      </w:pPr>
+      <w:r>
+        <w:t xml:space="preserve">Een volwassen baby en kleinkinderen binnen één hondenleven.</w:t>
+      </w:r>
+    </w:p>
+    <w:p>
+      <w:pPr>
+        <w:numPr>
+          <w:ilvl w:val="0"/>
+          <w:numId w:val="1020"/>
+        </w:numPr>
+        <w:pStyle w:val="Compact"/>
+      </w:pPr>
+      <w:r>
+        <w:t xml:space="preserve">De kat met eigen gedachten.</w:t>
+      </w:r>
+    </w:p>
+    <w:p>
+      <w:pPr>
+        <w:numPr>
+          <w:ilvl w:val="0"/>
+          <w:numId w:val="1020"/>
+        </w:numPr>
+        <w:pStyle w:val="Compact"/>
+      </w:pPr>
+      <w:r>
+        <w:t xml:space="preserve">Een brief van Tara aan de lezer.</w:t>
+      </w:r>
+    </w:p>
+    <w:p>
+      <w:pPr>
+        <w:numPr>
+          <w:ilvl w:val="0"/>
+          <w:numId w:val="1020"/>
+        </w:numPr>
+        <w:pStyle w:val="Compact"/>
+      </w:pPr>
+      <w:r>
         <w:t xml:space="preserve">Een expliciete, lange beschrijving van de euthanasie. Het moment zelf blijft buiten beeld of gebeurt in één zin.</w:t>
       </w:r>
     </w:p>
-    <w:bookmarkEnd w:id="85"/>
-    <w:bookmarkStart w:id="86" w:name="anekdotenbank"/>
+    <w:bookmarkEnd w:id="87"/>
+    <w:bookmarkStart w:id="88" w:name="anekdotenbank"/>
     <w:p>
       <w:pPr>
         <w:pStyle w:val="Heading1"/>
@@ -10380,31 +10948,31 @@
               <w:jc w:val="left"/>
             </w:pPr>
             <w:r>
-              <w:t xml:space="preserve">De rode bal waarop Lode trapt</w:t>
-            </w:r>
-          </w:p>
-        </w:tc>
-        <w:tc>
-          <w:tcPr/>
-          <w:p>
-            <w:pPr>
-              <w:pStyle w:val="Compact"/>
-              <w:jc w:val="left"/>
-            </w:pPr>
-            <w:r>
-              <w:t xml:space="preserve">Epiloog</w:t>
-            </w:r>
-          </w:p>
-        </w:tc>
-        <w:tc>
-          <w:tcPr/>
-          <w:p>
-            <w:pPr>
-              <w:pStyle w:val="Compact"/>
-              <w:jc w:val="left"/>
-            </w:pPr>
-            <w:r>
-              <w:t xml:space="preserve">Dogtime</w:t>
+              <w:t xml:space="preserve">Tara kiest Lode met een kwispel en een liedje</w:t>
+            </w:r>
+          </w:p>
+        </w:tc>
+        <w:tc>
+          <w:tcPr/>
+          <w:p>
+            <w:pPr>
+              <w:pStyle w:val="Compact"/>
+              <w:jc w:val="left"/>
+            </w:pPr>
+            <w:r>
+              <w:t xml:space="preserve">3</w:t>
+            </w:r>
+          </w:p>
+        </w:tc>
+        <w:tc>
+          <w:tcPr/>
+          <w:p>
+            <w:pPr>
+              <w:pStyle w:val="Compact"/>
+              <w:jc w:val="left"/>
+            </w:pPr>
+            <w:r>
+              <w:t xml:space="preserve">n.v.t.</w:t>
             </w:r>
           </w:p>
         </w:tc>
@@ -10430,19 +10998,19 @@
               <w:jc w:val="left"/>
             </w:pPr>
             <w:r>
-              <w:t xml:space="preserve">Sleutels kwijt, Tara weet waar ze liggen</w:t>
-            </w:r>
-          </w:p>
-        </w:tc>
-        <w:tc>
-          <w:tcPr/>
-          <w:p>
-            <w:pPr>
-              <w:pStyle w:val="Compact"/>
-              <w:jc w:val="left"/>
-            </w:pPr>
-            <w:r>
-              <w:t xml:space="preserve">Deel II</w:t>
+              <w:t xml:space="preserve">Het ochtendlied bij het ontbijt</w:t>
+            </w:r>
+          </w:p>
+        </w:tc>
+        <w:tc>
+          <w:tcPr/>
+          <w:p>
+            <w:pPr>
+              <w:pStyle w:val="Compact"/>
+              <w:jc w:val="left"/>
+            </w:pPr>
+            <w:r>
+              <w:t xml:space="preserve">5, doorlopend</w:t>
             </w:r>
           </w:p>
         </w:tc>
@@ -10466,7 +11034,7 @@
               <w:jc w:val="left"/>
             </w:pPr>
             <w:r>
-              <w:t xml:space="preserve">Idee</w:t>
+              <w:t xml:space="preserve">Nieuw</w:t>
             </w:r>
           </w:p>
         </w:tc>
@@ -10477,6 +11045,256 @@
           <w:p>
             <w:pPr>
               <w:pStyle w:val="Compact"/>
+              <w:jc w:val="left"/>
+            </w:pPr>
+            <w:r>
+              <w:t xml:space="preserve">Lode ontdekt: geen voorwerp in de mond, geen lied</w:t>
+            </w:r>
+          </w:p>
+        </w:tc>
+        <w:tc>
+          <w:tcPr/>
+          <w:p>
+            <w:pPr>
+              <w:pStyle w:val="Compact"/>
+              <w:jc w:val="left"/>
+            </w:pPr>
+            <w:r>
+              <w:t xml:space="preserve">10</w:t>
+            </w:r>
+          </w:p>
+        </w:tc>
+        <w:tc>
+          <w:tcPr/>
+          <w:p>
+            <w:pPr>
+              <w:pStyle w:val="Compact"/>
+              <w:jc w:val="left"/>
+            </w:pPr>
+            <w:r>
+              <w:t xml:space="preserve">n.v.t.</w:t>
+            </w:r>
+          </w:p>
+        </w:tc>
+        <w:tc>
+          <w:tcPr/>
+          <w:p>
+            <w:pPr>
+              <w:pStyle w:val="Compact"/>
+              <w:jc w:val="left"/>
+            </w:pPr>
+            <w:r>
+              <w:t xml:space="preserve">Nieuw</w:t>
+            </w:r>
+          </w:p>
+        </w:tc>
+      </w:tr>
+      <w:tr>
+        <w:tc>
+          <w:tcPr/>
+          <w:p>
+            <w:pPr>
+              <w:pStyle w:val="Compact"/>
+              <w:jc w:val="left"/>
+            </w:pPr>
+            <w:r>
+              <w:t xml:space="preserve">Elke avond iets mee naar de mand</w:t>
+            </w:r>
+          </w:p>
+        </w:tc>
+        <w:tc>
+          <w:tcPr/>
+          <w:p>
+            <w:pPr>
+              <w:pStyle w:val="Compact"/>
+              <w:jc w:val="left"/>
+            </w:pPr>
+            <w:r>
+              <w:t xml:space="preserve">4, doorlopend</w:t>
+            </w:r>
+          </w:p>
+        </w:tc>
+        <w:tc>
+          <w:tcPr/>
+          <w:p>
+            <w:pPr>
+              <w:pStyle w:val="Compact"/>
+              <w:jc w:val="left"/>
+            </w:pPr>
+            <w:r>
+              <w:t xml:space="preserve">n.v.t.</w:t>
+            </w:r>
+          </w:p>
+        </w:tc>
+        <w:tc>
+          <w:tcPr/>
+          <w:p>
+            <w:pPr>
+              <w:pStyle w:val="Compact"/>
+              <w:jc w:val="left"/>
+            </w:pPr>
+            <w:r>
+              <w:t xml:space="preserve">Nieuw</w:t>
+            </w:r>
+          </w:p>
+        </w:tc>
+      </w:tr>
+      <w:tr>
+        <w:tc>
+          <w:tcPr/>
+          <w:p>
+            <w:pPr>
+              <w:pStyle w:val="Compact"/>
+              <w:jc w:val="left"/>
+            </w:pPr>
+            <w:r>
+              <w:t xml:space="preserve">Het laatste lied, nuchter, met de rode bal</w:t>
+            </w:r>
+          </w:p>
+        </w:tc>
+        <w:tc>
+          <w:tcPr/>
+          <w:p>
+            <w:pPr>
+              <w:pStyle w:val="Compact"/>
+              <w:jc w:val="left"/>
+            </w:pPr>
+            <w:r>
+              <w:t xml:space="preserve">25</w:t>
+            </w:r>
+          </w:p>
+        </w:tc>
+        <w:tc>
+          <w:tcPr/>
+          <w:p>
+            <w:pPr>
+              <w:pStyle w:val="Compact"/>
+              <w:jc w:val="left"/>
+            </w:pPr>
+            <w:r>
+              <w:t xml:space="preserve">n.v.t.</w:t>
+            </w:r>
+          </w:p>
+        </w:tc>
+        <w:tc>
+          <w:tcPr/>
+          <w:p>
+            <w:pPr>
+              <w:pStyle w:val="Compact"/>
+              <w:jc w:val="left"/>
+            </w:pPr>
+            <w:r>
+              <w:t xml:space="preserve">Nieuw</w:t>
+            </w:r>
+          </w:p>
+        </w:tc>
+      </w:tr>
+      <w:tr>
+        <w:tc>
+          <w:tcPr/>
+          <w:p>
+            <w:pPr>
+              <w:pStyle w:val="Compact"/>
+              <w:jc w:val="left"/>
+            </w:pPr>
+            <w:r>
+              <w:t xml:space="preserve">De brief van de gemeente en het verweerschrift</w:t>
+            </w:r>
+          </w:p>
+        </w:tc>
+        <w:tc>
+          <w:tcPr/>
+          <w:p>
+            <w:pPr>
+              <w:pStyle w:val="Compact"/>
+              <w:jc w:val="left"/>
+            </w:pPr>
+            <w:r>
+              <w:t xml:space="preserve">19</w:t>
+            </w:r>
+          </w:p>
+        </w:tc>
+        <w:tc>
+          <w:tcPr/>
+          <w:p>
+            <w:pPr>
+              <w:pStyle w:val="Compact"/>
+              <w:jc w:val="left"/>
+            </w:pPr>
+            <w:r>
+              <w:t xml:space="preserve">n.v.t.</w:t>
+            </w:r>
+          </w:p>
+        </w:tc>
+        <w:tc>
+          <w:tcPr/>
+          <w:p>
+            <w:pPr>
+              <w:pStyle w:val="Compact"/>
+              <w:jc w:val="left"/>
+            </w:pPr>
+            <w:r>
+              <w:t xml:space="preserve">Nieuw</w:t>
+            </w:r>
+          </w:p>
+        </w:tc>
+      </w:tr>
+      <w:tr>
+        <w:tc>
+          <w:tcPr/>
+          <w:p>
+            <w:pPr>
+              <w:pStyle w:val="Compact"/>
+              <w:jc w:val="left"/>
+            </w:pPr>
+            <w:r>
+              <w:t xml:space="preserve">Sleutels kwijt, Tara weet waar ze liggen</w:t>
+            </w:r>
+          </w:p>
+        </w:tc>
+        <w:tc>
+          <w:tcPr/>
+          <w:p>
+            <w:pPr>
+              <w:pStyle w:val="Compact"/>
+              <w:jc w:val="left"/>
+            </w:pPr>
+            <w:r>
+              <w:t xml:space="preserve">Deel II</w:t>
+            </w:r>
+          </w:p>
+        </w:tc>
+        <w:tc>
+          <w:tcPr/>
+          <w:p>
+            <w:pPr>
+              <w:pStyle w:val="Compact"/>
+              <w:jc w:val="left"/>
+            </w:pPr>
+            <w:r>
+              <w:t xml:space="preserve">n.v.t.</w:t>
+            </w:r>
+          </w:p>
+        </w:tc>
+        <w:tc>
+          <w:tcPr/>
+          <w:p>
+            <w:pPr>
+              <w:pStyle w:val="Compact"/>
+              <w:jc w:val="left"/>
+            </w:pPr>
+            <w:r>
+              <w:t xml:space="preserve">Idee</w:t>
+            </w:r>
+          </w:p>
+        </w:tc>
+      </w:tr>
+      <w:tr>
+        <w:tc>
+          <w:tcPr/>
+          <w:p>
+            <w:pPr>
+              <w:pStyle w:val="Compact"/>
             </w:pPr>
           </w:p>
         </w:tc>
@@ -10510,8 +11328,8 @@
         </w:tc>
       </w:tr>
     </w:tbl>
-    <w:bookmarkEnd w:id="86"/>
-    <w:bookmarkStart w:id="87" w:name="open-keuzes-voor-de-auteur"/>
+    <w:bookmarkEnd w:id="88"/>
+    <w:bookmarkStart w:id="89" w:name="open-keuzes-voor-de-auteur"/>
     <w:p>
       <w:pPr>
         <w:pStyle w:val="Heading1"/>
@@ -10522,122 +11340,18 @@
     </w:p>
     <w:p>
       <w:pPr>
-        <w:numPr>
-          <w:ilvl w:val="0"/>
-          <w:numId w:val="1020"/>
-        </w:numPr>
-        <w:pStyle w:val="Compact"/>
-      </w:pPr>
-      <w:r>
-        <w:rPr>
-          <w:bCs/>
-          <w:b/>
-        </w:rPr>
-        <w:t xml:space="preserve">Namen:</w:t>
-      </w:r>
-      <w:r>
-        <w:t xml:space="preserve"> </w:t>
-      </w:r>
-      <w:r>
-        <w:t xml:space="preserve">Lode, Mieke, Mira, Sofie, Jonas, Bram en Lotte, en het fictieve dorp.</w:t>
-      </w:r>
-    </w:p>
-    <w:p>
-      <w:pPr>
-        <w:numPr>
-          <w:ilvl w:val="0"/>
-          <w:numId w:val="1020"/>
-        </w:numPr>
-        <w:pStyle w:val="Compact"/>
-      </w:pPr>
-      <w:r>
-        <w:rPr>
-          <w:bCs/>
-          <w:b/>
-        </w:rPr>
-        <w:t xml:space="preserve">De epiloog:</w:t>
-      </w:r>
-      <w:r>
-        <w:t xml:space="preserve"> </w:t>
-      </w:r>
-      <w:r>
-        <w:t xml:space="preserve">in Lodes stem (aanbevolen) of in de derde persoon.</w:t>
-      </w:r>
-    </w:p>
-    <w:p>
-      <w:pPr>
-        <w:numPr>
-          <w:ilvl w:val="0"/>
-          <w:numId w:val="1020"/>
-        </w:numPr>
-        <w:pStyle w:val="Compact"/>
-      </w:pPr>
-      <w:r>
-        <w:rPr>
-          <w:bCs/>
-          <w:b/>
-        </w:rPr>
-        <w:t xml:space="preserve">De optionele nuance</w:t>
-      </w:r>
-      <w:r>
-        <w:t xml:space="preserve"> </w:t>
-      </w:r>
-      <w:r>
-        <w:t xml:space="preserve">van het reekalfje in hoofdstuk 19.</w:t>
-      </w:r>
-    </w:p>
-    <w:p>
-      <w:pPr>
-        <w:numPr>
-          <w:ilvl w:val="0"/>
-          <w:numId w:val="1020"/>
-        </w:numPr>
-        <w:pStyle w:val="Compact"/>
-      </w:pPr>
-      <w:r>
-        <w:rPr>
-          <w:bCs/>
-          <w:b/>
-        </w:rPr>
-        <w:t xml:space="preserve">Het motto:</w:t>
-      </w:r>
-      <w:r>
-        <w:t xml:space="preserve"> </w:t>
-      </w:r>
-      <w:r>
-        <w:t xml:space="preserve">wel of geen motto van Kafka.</w:t>
-      </w:r>
-    </w:p>
-    <w:p>
-      <w:pPr>
-        <w:numPr>
-          <w:ilvl w:val="0"/>
-          <w:numId w:val="1020"/>
-        </w:numPr>
-        <w:pStyle w:val="Compact"/>
-      </w:pPr>
-      <w:r>
-        <w:rPr>
-          <w:bCs/>
-          <w:b/>
-        </w:rPr>
-        <w:t xml:space="preserve">De boete:</w:t>
-      </w:r>
-      <w:r>
-        <w:t xml:space="preserve"> </w:t>
-      </w:r>
-      <w:r>
-        <w:t xml:space="preserve">of de boswachter echt een GAS-boete uitschrijft.</w:t>
-      </w:r>
-    </w:p>
-    <w:bookmarkEnd w:id="87"/>
-    <w:bookmarkStart w:id="88" w:name="wijzigingen-ten-opzichte-van-versie-2"/>
-    <w:p>
-      <w:pPr>
-        <w:pStyle w:val="Heading1"/>
-      </w:pPr>
-      <w:r>
-        <w:t xml:space="preserve">18. Wijzigingen ten opzichte van versie 2</w:t>
+        <w:pStyle w:val="FirstParagraph"/>
+      </w:pPr>
+      <w:r>
+        <w:t xml:space="preserve">Vastgelegd door de auteur: de namen (Lode, Mieke, Mira, Sofie, Jonas, Bram, Lotte), de epiloog in Lodes stem, en de GAS-boete via de gemeente.</w:t>
+      </w:r>
+    </w:p>
+    <w:p>
+      <w:pPr>
+        <w:pStyle w:val="BodyText"/>
+      </w:pPr>
+      <w:r>
+        <w:t xml:space="preserve">Nog open:</w:t>
       </w:r>
     </w:p>
     <w:p>
@@ -10653,13 +11367,13 @@
           <w:bCs/>
           <w:b/>
         </w:rPr>
-        <w:t xml:space="preserve">Lode</w:t>
-      </w:r>
-      <w:r>
-        <w:t xml:space="preserve"> </w:t>
-      </w:r>
-      <w:r>
-        <w:t xml:space="preserve">heeft een achtergrond (boerderij, hond aan de ketting, de opgerolde krant) en een ontwikkeling van strengheid naar geduld en liefde, uitgewerkt per hoofdstuk.</w:t>
+        <w:t xml:space="preserve">Het fictieve dorp:</w:t>
+      </w:r>
+      <w:r>
+        <w:t xml:space="preserve"> </w:t>
+      </w:r>
+      <w:r>
+        <w:t xml:space="preserve">een naam voor het dorp in de Antwerpse Kempen.</w:t>
       </w:r>
     </w:p>
     <w:p>
@@ -10675,13 +11389,13 @@
           <w:bCs/>
           <w:b/>
         </w:rPr>
-        <w:t xml:space="preserve">Lodes overtuigingen</w:t>
-      </w:r>
-      <w:r>
-        <w:t xml:space="preserve"> </w:t>
-      </w:r>
-      <w:r>
-        <w:t xml:space="preserve">zijn in het verhaal verweven: de eerste nacht, inleven in een roedeldier, delen aan tafel.</w:t>
+        <w:t xml:space="preserve">De optionele nuance</w:t>
+      </w:r>
+      <w:r>
+        <w:t xml:space="preserve"> </w:t>
+      </w:r>
+      <w:r>
+        <w:t xml:space="preserve">van het reekalfje in hoofdstuk 19.</w:t>
       </w:r>
     </w:p>
     <w:p>
@@ -10697,6 +11411,104 @@
           <w:bCs/>
           <w:b/>
         </w:rPr>
+        <w:t xml:space="preserve">Het motto:</w:t>
+      </w:r>
+      <w:r>
+        <w:t xml:space="preserve"> </w:t>
+      </w:r>
+      <w:r>
+        <w:t xml:space="preserve">wel of geen motto van Kafka.</w:t>
+      </w:r>
+    </w:p>
+    <w:p>
+      <w:pPr>
+        <w:numPr>
+          <w:ilvl w:val="0"/>
+          <w:numId w:val="1021"/>
+        </w:numPr>
+        <w:pStyle w:val="Compact"/>
+      </w:pPr>
+      <w:r>
+        <w:rPr>
+          <w:bCs/>
+          <w:b/>
+        </w:rPr>
+        <w:t xml:space="preserve">Het bedrag van de boete:</w:t>
+      </w:r>
+      <w:r>
+        <w:t xml:space="preserve"> </w:t>
+      </w:r>
+      <w:r>
+        <w:t xml:space="preserve">een GAS-boete kan tot 250 euro gaan. Een concreet bedrag, bijvoorbeeld 100 euro, maakt de brief echter.</w:t>
+      </w:r>
+    </w:p>
+    <w:bookmarkEnd w:id="89"/>
+    <w:bookmarkStart w:id="90" w:name="wijzigingen-ten-opzichte-van-versie-2"/>
+    <w:p>
+      <w:pPr>
+        <w:pStyle w:val="Heading1"/>
+      </w:pPr>
+      <w:r>
+        <w:t xml:space="preserve">18. Wijzigingen ten opzichte van versie 2</w:t>
+      </w:r>
+    </w:p>
+    <w:p>
+      <w:pPr>
+        <w:numPr>
+          <w:ilvl w:val="0"/>
+          <w:numId w:val="1022"/>
+        </w:numPr>
+        <w:pStyle w:val="Compact"/>
+      </w:pPr>
+      <w:r>
+        <w:rPr>
+          <w:bCs/>
+          <w:b/>
+        </w:rPr>
+        <w:t xml:space="preserve">Lode</w:t>
+      </w:r>
+      <w:r>
+        <w:t xml:space="preserve"> </w:t>
+      </w:r>
+      <w:r>
+        <w:t xml:space="preserve">heeft een achtergrond (boerderij, hond aan de ketting, de opgerolde krant) en een ontwikkeling van strengheid naar geduld en liefde, uitgewerkt per hoofdstuk.</w:t>
+      </w:r>
+    </w:p>
+    <w:p>
+      <w:pPr>
+        <w:numPr>
+          <w:ilvl w:val="0"/>
+          <w:numId w:val="1022"/>
+        </w:numPr>
+        <w:pStyle w:val="Compact"/>
+      </w:pPr>
+      <w:r>
+        <w:rPr>
+          <w:bCs/>
+          <w:b/>
+        </w:rPr>
+        <w:t xml:space="preserve">Lodes overtuigingen</w:t>
+      </w:r>
+      <w:r>
+        <w:t xml:space="preserve"> </w:t>
+      </w:r>
+      <w:r>
+        <w:t xml:space="preserve">zijn in het verhaal verweven: de eerste nacht, inleven in een roedeldier, delen aan tafel.</w:t>
+      </w:r>
+    </w:p>
+    <w:p>
+      <w:pPr>
+        <w:numPr>
+          <w:ilvl w:val="0"/>
+          <w:numId w:val="1022"/>
+        </w:numPr>
+        <w:pStyle w:val="Compact"/>
+      </w:pPr>
+      <w:r>
+        <w:rPr>
+          <w:bCs/>
+          <w:b/>
+        </w:rPr>
         <w:t xml:space="preserve">De wandelmodi</w:t>
       </w:r>
       <w:r>
@@ -10739,7 +11551,7 @@
       <w:pPr>
         <w:numPr>
           <w:ilvl w:val="0"/>
-          <w:numId w:val="1021"/>
+          <w:numId w:val="1022"/>
         </w:numPr>
         <w:pStyle w:val="Compact"/>
       </w:pPr>
@@ -10761,7 +11573,7 @@
       <w:pPr>
         <w:numPr>
           <w:ilvl w:val="0"/>
-          <w:numId w:val="1021"/>
+          <w:numId w:val="1022"/>
         </w:numPr>
         <w:pStyle w:val="Compact"/>
       </w:pPr>
@@ -10783,7 +11595,7 @@
       <w:pPr>
         <w:numPr>
           <w:ilvl w:val="0"/>
-          <w:numId w:val="1021"/>
+          <w:numId w:val="1022"/>
         </w:numPr>
         <w:pStyle w:val="Compact"/>
       </w:pPr>
@@ -10799,7 +11611,7 @@
       <w:pPr>
         <w:numPr>
           <w:ilvl w:val="1"/>
-          <w:numId w:val="1022"/>
+          <w:numId w:val="1023"/>
         </w:numPr>
         <w:pStyle w:val="Compact"/>
       </w:pPr>
@@ -10827,7 +11639,7 @@
       <w:pPr>
         <w:numPr>
           <w:ilvl w:val="1"/>
-          <w:numId w:val="1022"/>
+          <w:numId w:val="1023"/>
         </w:numPr>
         <w:pStyle w:val="Compact"/>
       </w:pPr>
@@ -10855,7 +11667,7 @@
       <w:pPr>
         <w:numPr>
           <w:ilvl w:val="1"/>
-          <w:numId w:val="1022"/>
+          <w:numId w:val="1023"/>
         </w:numPr>
         <w:pStyle w:val="Compact"/>
       </w:pPr>
@@ -10895,7 +11707,7 @@
       <w:pPr>
         <w:numPr>
           <w:ilvl w:val="0"/>
-          <w:numId w:val="1021"/>
+          <w:numId w:val="1022"/>
         </w:numPr>
         <w:pStyle w:val="Compact"/>
       </w:pPr>
@@ -10917,7 +11729,7 @@
       <w:pPr>
         <w:numPr>
           <w:ilvl w:val="0"/>
-          <w:numId w:val="1021"/>
+          <w:numId w:val="1022"/>
         </w:numPr>
         <w:pStyle w:val="Compact"/>
       </w:pPr>
@@ -10939,7 +11751,7 @@
       <w:pPr>
         <w:numPr>
           <w:ilvl w:val="0"/>
-          <w:numId w:val="1021"/>
+          <w:numId w:val="1022"/>
         </w:numPr>
         <w:pStyle w:val="Compact"/>
       </w:pPr>
@@ -10961,7 +11773,7 @@
       <w:pPr>
         <w:numPr>
           <w:ilvl w:val="0"/>
-          <w:numId w:val="1021"/>
+          <w:numId w:val="1022"/>
         </w:numPr>
         <w:pStyle w:val="Compact"/>
       </w:pPr>
@@ -10983,7 +11795,7 @@
       <w:pPr>
         <w:numPr>
           <w:ilvl w:val="0"/>
-          <w:numId w:val="1021"/>
+          <w:numId w:val="1022"/>
         </w:numPr>
         <w:pStyle w:val="Compact"/>
       </w:pPr>
@@ -11005,7 +11817,7 @@
       <w:pPr>
         <w:numPr>
           <w:ilvl w:val="0"/>
-          <w:numId w:val="1021"/>
+          <w:numId w:val="1022"/>
         </w:numPr>
         <w:pStyle w:val="Compact"/>
       </w:pPr>
@@ -11023,7 +11835,165 @@
         <w:t xml:space="preserve">voor de schimmelinfectie, de hartstilstand en de lijnplicht, met bronnen.</w:t>
       </w:r>
     </w:p>
-    <w:bookmarkEnd w:id="88"/>
+    <w:bookmarkEnd w:id="90"/>
+    <w:bookmarkStart w:id="91" w:name="wijzigingen-in-versie-4"/>
+    <w:p>
+      <w:pPr>
+        <w:pStyle w:val="Heading1"/>
+      </w:pPr>
+      <w:r>
+        <w:t xml:space="preserve">19. Wijzigingen in versie 4</w:t>
+      </w:r>
+    </w:p>
+    <w:p>
+      <w:pPr>
+        <w:numPr>
+          <w:ilvl w:val="0"/>
+          <w:numId w:val="1024"/>
+        </w:numPr>
+        <w:pStyle w:val="Compact"/>
+      </w:pPr>
+      <w:r>
+        <w:rPr>
+          <w:bCs/>
+          <w:b/>
+        </w:rPr>
+        <w:t xml:space="preserve">Tara kiest Lode bij de fokker</w:t>
+      </w:r>
+      <w:r>
+        <w:t xml:space="preserve"> </w:t>
+      </w:r>
+      <w:r>
+        <w:t xml:space="preserve">door te kwispelen en te zingen (hoofdstuk 3). Lode ziet dat pas later.</w:t>
+      </w:r>
+    </w:p>
+    <w:p>
+      <w:pPr>
+        <w:numPr>
+          <w:ilvl w:val="0"/>
+          <w:numId w:val="1024"/>
+        </w:numPr>
+        <w:pStyle w:val="Compact"/>
+      </w:pPr>
+      <w:r>
+        <w:rPr>
+          <w:bCs/>
+          <w:b/>
+        </w:rPr>
+        <w:t xml:space="preserve">Het liedje</w:t>
+      </w:r>
+      <w:r>
+        <w:t xml:space="preserve"> </w:t>
+      </w:r>
+      <w:r>
+        <w:t xml:space="preserve">is een doorlopende draad: elke ochtend bij het ontbijt, alleen met iets in haar mond, ontdekt door Lode in hoofdstuk 10, en voor het laatst gezongen op de ochtend van de operatie (hoofdstuk 25).</w:t>
+      </w:r>
+    </w:p>
+    <w:p>
+      <w:pPr>
+        <w:numPr>
+          <w:ilvl w:val="0"/>
+          <w:numId w:val="1024"/>
+        </w:numPr>
+        <w:pStyle w:val="Compact"/>
+      </w:pPr>
+      <w:r>
+        <w:rPr>
+          <w:bCs/>
+          <w:b/>
+        </w:rPr>
+        <w:t xml:space="preserve">Elke avond neemt Tara iets mee naar haar mand:</w:t>
+      </w:r>
+      <w:r>
+        <w:t xml:space="preserve"> </w:t>
+      </w:r>
+      <w:r>
+        <w:t xml:space="preserve">het dekentje, de pantoffel, de rode bal.</w:t>
+      </w:r>
+    </w:p>
+    <w:p>
+      <w:pPr>
+        <w:numPr>
+          <w:ilvl w:val="0"/>
+          <w:numId w:val="1024"/>
+        </w:numPr>
+        <w:pStyle w:val="Compact"/>
+      </w:pPr>
+      <w:r>
+        <w:rPr>
+          <w:bCs/>
+          <w:b/>
+        </w:rPr>
+        <w:t xml:space="preserve">Nieuwe rubrieken:</w:t>
+      </w:r>
+      <w:r>
+        <w:t xml:space="preserve"> </w:t>
+      </w:r>
+      <w:r>
+        <w:t xml:space="preserve">Labradorwet 1 en de dossiers 2 en 58.</w:t>
+      </w:r>
+    </w:p>
+    <w:p>
+      <w:pPr>
+        <w:numPr>
+          <w:ilvl w:val="0"/>
+          <w:numId w:val="1024"/>
+        </w:numPr>
+        <w:pStyle w:val="Compact"/>
+      </w:pPr>
+      <w:r>
+        <w:rPr>
+          <w:bCs/>
+          <w:b/>
+        </w:rPr>
+        <w:t xml:space="preserve">De epiloog staat definitief in Lodes stem</w:t>
+      </w:r>
+      <w:r>
+        <w:t xml:space="preserve"> </w:t>
+      </w:r>
+      <w:r>
+        <w:t xml:space="preserve">en draait om het ontbrekende ochtendlied. De rode bal komt mee naar huis in plaats van in het gras te liggen.</w:t>
+      </w:r>
+    </w:p>
+    <w:p>
+      <w:pPr>
+        <w:numPr>
+          <w:ilvl w:val="0"/>
+          <w:numId w:val="1024"/>
+        </w:numPr>
+        <w:pStyle w:val="Compact"/>
+      </w:pPr>
+      <w:r>
+        <w:rPr>
+          <w:bCs/>
+          <w:b/>
+        </w:rPr>
+        <w:t xml:space="preserve">De boswachter</w:t>
+      </w:r>
+      <w:r>
+        <w:t xml:space="preserve"> </w:t>
+      </w:r>
+      <w:r>
+        <w:t xml:space="preserve">stelt de overtreding vast; de gemeente stuurt een GAS-boete. Lode schrijft een verweerschrift en betaalt toch.</w:t>
+      </w:r>
+    </w:p>
+    <w:p>
+      <w:pPr>
+        <w:numPr>
+          <w:ilvl w:val="0"/>
+          <w:numId w:val="1024"/>
+        </w:numPr>
+        <w:pStyle w:val="Compact"/>
+      </w:pPr>
+      <w:r>
+        <w:rPr>
+          <w:bCs/>
+          <w:b/>
+        </w:rPr>
+        <w:t xml:space="preserve">De namen zijn definitief.</w:t>
+      </w:r>
+    </w:p>
+    <w:bookmarkEnd w:id="91"/>
     <w:sectPr/>
   </w:body>
 </w:document>
@@ -11328,15 +12298,6 @@
     <w:abstractNumId w:val="991"/>
   </w:num>
   <w:num w:numId="1003">
-    <w:abstractNumId w:val="991"/>
-  </w:num>
-  <w:num w:numId="1004">
-    <w:abstractNumId w:val="991"/>
-  </w:num>
-  <w:num w:numId="1005">
-    <w:abstractNumId w:val="991"/>
-  </w:num>
-  <w:num w:numId="1006">
     <w:abstractNumId w:val="99411"/>
     <w:lvlOverride w:ilvl="0">
       <w:startOverride w:val="1"/>
@@ -11366,22 +12327,16 @@
       <w:startOverride w:val="1"/>
     </w:lvlOverride>
   </w:num>
-  <w:num w:numId="1007">
+  <w:num w:numId="1004">
     <w:abstractNumId w:val="991"/>
   </w:num>
-  <w:num w:numId="1008">
+  <w:num w:numId="1005">
     <w:abstractNumId w:val="991"/>
   </w:num>
-  <w:num w:numId="1009">
+  <w:num w:numId="1006">
     <w:abstractNumId w:val="991"/>
   </w:num>
-  <w:num w:numId="1010">
-    <w:abstractNumId w:val="991"/>
-  </w:num>
-  <w:num w:numId="1011">
-    <w:abstractNumId w:val="991"/>
-  </w:num>
-  <w:num w:numId="1012">
+  <w:num w:numId="1007">
     <w:abstractNumId w:val="99411"/>
     <w:lvlOverride w:ilvl="0">
       <w:startOverride w:val="1"/>
@@ -11411,10 +12366,22 @@
       <w:startOverride w:val="1"/>
     </w:lvlOverride>
   </w:num>
-  <w:num w:numId="1013">
+  <w:num w:numId="1008">
     <w:abstractNumId w:val="991"/>
   </w:num>
-  <w:num w:numId="1014">
+  <w:num w:numId="1009">
+    <w:abstractNumId w:val="991"/>
+  </w:num>
+  <w:num w:numId="1010">
+    <w:abstractNumId w:val="991"/>
+  </w:num>
+  <w:num w:numId="1011">
+    <w:abstractNumId w:val="991"/>
+  </w:num>
+  <w:num w:numId="1012">
+    <w:abstractNumId w:val="991"/>
+  </w:num>
+  <w:num w:numId="1013">
     <w:abstractNumId w:val="99411"/>
     <w:lvlOverride w:ilvl="0">
       <w:startOverride w:val="1"/>
@@ -11444,22 +12411,10 @@
       <w:startOverride w:val="1"/>
     </w:lvlOverride>
   </w:num>
-  <w:num w:numId="1015">
+  <w:num w:numId="1014">
     <w:abstractNumId w:val="991"/>
   </w:num>
-  <w:num w:numId="1016">
-    <w:abstractNumId w:val="991"/>
-  </w:num>
-  <w:num w:numId="1017">
-    <w:abstractNumId w:val="991"/>
-  </w:num>
-  <w:num w:numId="1018">
-    <w:abstractNumId w:val="991"/>
-  </w:num>
-  <w:num w:numId="1019">
-    <w:abstractNumId w:val="991"/>
-  </w:num>
-  <w:num w:numId="1020">
+  <w:num w:numId="1015">
     <w:abstractNumId w:val="99411"/>
     <w:lvlOverride w:ilvl="0">
       <w:startOverride w:val="1"/>
@@ -11488,6 +12443,21 @@
     <w:lvlOverride w:ilvl="8">
       <w:startOverride w:val="1"/>
     </w:lvlOverride>
+  </w:num>
+  <w:num w:numId="1016">
+    <w:abstractNumId w:val="991"/>
+  </w:num>
+  <w:num w:numId="1017">
+    <w:abstractNumId w:val="991"/>
+  </w:num>
+  <w:num w:numId="1018">
+    <w:abstractNumId w:val="991"/>
+  </w:num>
+  <w:num w:numId="1019">
+    <w:abstractNumId w:val="991"/>
+  </w:num>
+  <w:num w:numId="1020">
+    <w:abstractNumId w:val="991"/>
   </w:num>
   <w:num w:numId="1021">
     <w:abstractNumId w:val="99411"/>
@@ -11520,7 +12490,67 @@
     </w:lvlOverride>
   </w:num>
   <w:num w:numId="1022">
+    <w:abstractNumId w:val="99411"/>
+    <w:lvlOverride w:ilvl="0">
+      <w:startOverride w:val="1"/>
+    </w:lvlOverride>
+    <w:lvlOverride w:ilvl="1">
+      <w:startOverride w:val="1"/>
+    </w:lvlOverride>
+    <w:lvlOverride w:ilvl="2">
+      <w:startOverride w:val="1"/>
+    </w:lvlOverride>
+    <w:lvlOverride w:ilvl="3">
+      <w:startOverride w:val="1"/>
+    </w:lvlOverride>
+    <w:lvlOverride w:ilvl="4">
+      <w:startOverride w:val="1"/>
+    </w:lvlOverride>
+    <w:lvlOverride w:ilvl="5">
+      <w:startOverride w:val="1"/>
+    </w:lvlOverride>
+    <w:lvlOverride w:ilvl="6">
+      <w:startOverride w:val="1"/>
+    </w:lvlOverride>
+    <w:lvlOverride w:ilvl="7">
+      <w:startOverride w:val="1"/>
+    </w:lvlOverride>
+    <w:lvlOverride w:ilvl="8">
+      <w:startOverride w:val="1"/>
+    </w:lvlOverride>
+  </w:num>
+  <w:num w:numId="1023">
     <w:abstractNumId w:val="991"/>
+  </w:num>
+  <w:num w:numId="1024">
+    <w:abstractNumId w:val="99411"/>
+    <w:lvlOverride w:ilvl="0">
+      <w:startOverride w:val="1"/>
+    </w:lvlOverride>
+    <w:lvlOverride w:ilvl="1">
+      <w:startOverride w:val="1"/>
+    </w:lvlOverride>
+    <w:lvlOverride w:ilvl="2">
+      <w:startOverride w:val="1"/>
+    </w:lvlOverride>
+    <w:lvlOverride w:ilvl="3">
+      <w:startOverride w:val="1"/>
+    </w:lvlOverride>
+    <w:lvlOverride w:ilvl="4">
+      <w:startOverride w:val="1"/>
+    </w:lvlOverride>
+    <w:lvlOverride w:ilvl="5">
+      <w:startOverride w:val="1"/>
+    </w:lvlOverride>
+    <w:lvlOverride w:ilvl="6">
+      <w:startOverride w:val="1"/>
+    </w:lvlOverride>
+    <w:lvlOverride w:ilvl="7">
+      <w:startOverride w:val="1"/>
+    </w:lvlOverride>
+    <w:lvlOverride w:ilvl="8">
+      <w:startOverride w:val="1"/>
+    </w:lvlOverride>
   </w:num>
 </w:numbering>
 </file>

</xml_diff>

<commit_message>
Tara, een Hondenleven: story bible v5 en schrijfbrief
Heultje (Westerlo) als dorp, GAS-boete van 250 euro, motto van Kafka,
en een bindende schrijfbrief voor de hoofdstukschrijvers.

Co-Authored-By: Claude Opus 5.5 <noreply@anthropic.com>
Claude-Session: https://claude.ai/code/session_011xXeHb7kuJsamVtPUp8TTz
</commit_message>
<xml_diff>
--- a/tara-een-hondenleven/story-bible/Story_Bible_Tara_een_Hondenleven.docx
+++ b/tara-een-hondenleven/story-bible/Story_Bible_Tara_een_Hondenleven.docx
@@ -45,7 +45,7 @@
         <w:t xml:space="preserve"> </w:t>
       </w:r>
       <w:r>
-        <w:t xml:space="preserve">4</w:t>
+        <w:t xml:space="preserve">5</w:t>
       </w:r>
       <w:r>
         <w:t xml:space="preserve"> </w:t>
@@ -5525,7 +5525,7 @@
         <w:pStyle w:val="FirstParagraph"/>
       </w:pPr>
       <w:r>
-        <w:t xml:space="preserve">Het verhaal speelt in een fictief dorp in de Antwerpse Kempen, tussen Herentals en Kasterlee. Er zijn zandwegen, dennenbossen, heide en vennen, en een dorpsplein met kerk en café.</w:t>
+        <w:t xml:space="preserve">Het verhaal speelt in Heultje, een dorp in de Antwerpse Kempen dat bij Westerlo hoort. Het is een echte plaats; huizen, straten en mensen in het boek zijn verzonnen. Lode rijdt via de E313 naar Antwerpen; Sofie woont in Herentals. Er zijn zandwegen, dennenbossen, heide en vennen, en een dorpsplein met kerk en café.</w:t>
       </w:r>
     </w:p>
     <w:p>
@@ -6542,7 +6542,7 @@
         <w:t xml:space="preserve"> </w:t>
       </w:r>
       <w:r>
-        <w:t xml:space="preserve">- Drie weken later valt er een brief van de gemeente in de bus: een GAS-boete voor een loslopende hond, opgelegd door de sanctionerend ambtenaar op basis van de vaststelling van de boswachter. Tara noteert dat de envelop Lode laat ruiken zoals vroeger na een dag op de Ring.</w:t>
+        <w:t xml:space="preserve">- Drie weken later valt er een brief van de gemeente Westerlo in de bus: een GAS-boete van 250 euro voor een loslopende hond, opgelegd door de sanctionerend ambtenaar op basis van de vaststelling van de boswachter. Tara noteert dat de envelop Lode laat ruiken zoals vroeger na een dag op de Ring.</w:t>
       </w:r>
       <w:r>
         <w:t xml:space="preserve"> </w:t>
@@ -8151,7 +8151,7 @@
         <w:t xml:space="preserve"> </w:t>
       </w:r>
       <w:r>
-        <w:t xml:space="preserve">(1922), mogelijk als motto (</w:t>
+        <w:t xml:space="preserve">(1922), levert het motto van het boek (</w:t>
       </w:r>
       <w:hyperlink r:id="rId73">
         <w:r>
@@ -11367,28 +11367,6 @@
           <w:bCs/>
           <w:b/>
         </w:rPr>
-        <w:t xml:space="preserve">Het fictieve dorp:</w:t>
-      </w:r>
-      <w:r>
-        <w:t xml:space="preserve"> </w:t>
-      </w:r>
-      <w:r>
-        <w:t xml:space="preserve">een naam voor het dorp in de Antwerpse Kempen.</w:t>
-      </w:r>
-    </w:p>
-    <w:p>
-      <w:pPr>
-        <w:numPr>
-          <w:ilvl w:val="0"/>
-          <w:numId w:val="1021"/>
-        </w:numPr>
-        <w:pStyle w:val="Compact"/>
-      </w:pPr>
-      <w:r>
-        <w:rPr>
-          <w:bCs/>
-          <w:b/>
-        </w:rPr>
         <w:t xml:space="preserve">De optionele nuance</w:t>
       </w:r>
       <w:r>
@@ -11400,46 +11378,10 @@
     </w:p>
     <w:p>
       <w:pPr>
-        <w:numPr>
-          <w:ilvl w:val="0"/>
-          <w:numId w:val="1021"/>
-        </w:numPr>
-        <w:pStyle w:val="Compact"/>
-      </w:pPr>
-      <w:r>
-        <w:rPr>
-          <w:bCs/>
-          <w:b/>
-        </w:rPr>
-        <w:t xml:space="preserve">Het motto:</w:t>
-      </w:r>
-      <w:r>
-        <w:t xml:space="preserve"> </w:t>
-      </w:r>
-      <w:r>
-        <w:t xml:space="preserve">wel of geen motto van Kafka.</w:t>
-      </w:r>
-    </w:p>
-    <w:p>
-      <w:pPr>
-        <w:numPr>
-          <w:ilvl w:val="0"/>
-          <w:numId w:val="1021"/>
-        </w:numPr>
-        <w:pStyle w:val="Compact"/>
-      </w:pPr>
-      <w:r>
-        <w:rPr>
-          <w:bCs/>
-          <w:b/>
-        </w:rPr>
-        <w:t xml:space="preserve">Het bedrag van de boete:</w:t>
-      </w:r>
-      <w:r>
-        <w:t xml:space="preserve"> </w:t>
-      </w:r>
-      <w:r>
-        <w:t xml:space="preserve">een GAS-boete kan tot 250 euro gaan. Een concreet bedrag, bijvoorbeeld 100 euro, maakt de brief echter.</w:t>
+        <w:pStyle w:val="FirstParagraph"/>
+      </w:pPr>
+      <w:r>
+        <w:t xml:space="preserve">Vastgelegd in versie 5: het dorp is Heultje (Westerlo), de GAS-boete bedraagt 250 euro, en het boek opent met een motto van Kafka (sectie 20).</w:t>
       </w:r>
     </w:p>
     <w:bookmarkEnd w:id="89"/>
@@ -11994,6 +11936,98 @@
       </w:r>
     </w:p>
     <w:bookmarkEnd w:id="91"/>
+    <w:bookmarkStart w:id="92" w:name="motto-en-versie-5"/>
+    <w:p>
+      <w:pPr>
+        <w:pStyle w:val="Heading1"/>
+      </w:pPr>
+      <w:r>
+        <w:t xml:space="preserve">20. Motto en versie 5</w:t>
+      </w:r>
+    </w:p>
+    <w:p>
+      <w:pPr>
+        <w:pStyle w:val="FirstParagraph"/>
+      </w:pPr>
+      <w:r>
+        <w:t xml:space="preserve">Het boek opent, na de titelpagina en voor de proloog, met dit motto (eigen vertaling uit het Duits; de tekst van Kafka is publiek domein):</w:t>
+      </w:r>
+    </w:p>
+    <w:p>
+      <w:pPr>
+        <w:pStyle w:val="BlockText"/>
+      </w:pPr>
+      <w:r>
+        <w:rPr>
+          <w:iCs/>
+          <w:i/>
+        </w:rPr>
+        <w:t xml:space="preserve">Waar haalt de aarde dit voedsel vandaan?</w:t>
+      </w:r>
+    </w:p>
+    <w:p>
+      <w:pPr>
+        <w:pStyle w:val="BlockText"/>
+      </w:pPr>
+      <w:r>
+        <w:t xml:space="preserve">Franz Kafka,</w:t>
+      </w:r>
+      <w:r>
+        <w:t xml:space="preserve"> </w:t>
+      </w:r>
+      <w:r>
+        <w:rPr>
+          <w:iCs/>
+          <w:i/>
+        </w:rPr>
+        <w:t xml:space="preserve">Onderzoekingen van een hond</w:t>
+      </w:r>
+      <w:r>
+        <w:t xml:space="preserve"> </w:t>
+      </w:r>
+      <w:r>
+        <w:t xml:space="preserve">(1922)</w:t>
+      </w:r>
+    </w:p>
+    <w:p>
+      <w:pPr>
+        <w:pStyle w:val="FirstParagraph"/>
+      </w:pPr>
+      <w:r>
+        <w:t xml:space="preserve">Het is de vraag waar Kafka’s onderzoekende hond zijn leven aan wijdt. Voor Tara is het antwoord simpel en fout: uit de koekjestrommel, zodra je zingt.</w:t>
+      </w:r>
+    </w:p>
+    <w:p>
+      <w:pPr>
+        <w:pStyle w:val="BodyText"/>
+      </w:pPr>
+      <w:r>
+        <w:rPr>
+          <w:bCs/>
+          <w:b/>
+        </w:rPr>
+        <w:t xml:space="preserve">Wijzigingen in versie 5:</w:t>
+      </w:r>
+      <w:r>
+        <w:t xml:space="preserve"> </w:t>
+      </w:r>
+      <w:r>
+        <w:t xml:space="preserve">- Het dorp is Heultje (Westerlo).</w:t>
+      </w:r>
+      <w:r>
+        <w:t xml:space="preserve"> </w:t>
+      </w:r>
+      <w:r>
+        <w:t xml:space="preserve">- De GAS-boete bedraagt 250 euro en komt van de gemeente Westerlo.</w:t>
+      </w:r>
+      <w:r>
+        <w:t xml:space="preserve"> </w:t>
+      </w:r>
+      <w:r>
+        <w:t xml:space="preserve">- Het motto van Kafka is vastgelegd.</w:t>
+      </w:r>
+    </w:p>
+    <w:bookmarkEnd w:id="92"/>
     <w:sectPr/>
   </w:body>
 </w:document>

</xml_diff>

<commit_message>
Tara, een Hondenleven: manuscript v1 na continuïteitsronde
Continuïteitsredactie over het hele boek (leeftijden kleinkinderen,
herhalingen, voorwerpen, trap, perspectief), samengevoegd manuscript
in Word, en story bible v6 bijgewerkt met de nieuwe vaste feiten.

Co-Authored-By: Claude Opus 5.5 <noreply@anthropic.com>
Claude-Session: https://claude.ai/code/session_011xXeHb7kuJsamVtPUp8TTz
</commit_message>
<xml_diff>
--- a/tara-een-hondenleven/story-bible/Story_Bible_Tara_een_Hondenleven.docx
+++ b/tara-een-hondenleven/story-bible/Story_Bible_Tara_een_Hondenleven.docx
@@ -45,7 +45,7 @@
         <w:t xml:space="preserve"> </w:t>
       </w:r>
       <w:r>
-        <w:t xml:space="preserve">5</w:t>
+        <w:t xml:space="preserve">6</w:t>
       </w:r>
       <w:r>
         <w:t xml:space="preserve"> </w:t>
@@ -11356,29 +11356,15 @@
     </w:p>
     <w:p>
       <w:pPr>
-        <w:numPr>
-          <w:ilvl w:val="0"/>
-          <w:numId w:val="1021"/>
-        </w:numPr>
-        <w:pStyle w:val="Compact"/>
-      </w:pPr>
-      <w:r>
-        <w:rPr>
-          <w:bCs/>
-          <w:b/>
-        </w:rPr>
-        <w:t xml:space="preserve">De optionele nuance</w:t>
-      </w:r>
-      <w:r>
-        <w:t xml:space="preserve"> </w:t>
-      </w:r>
-      <w:r>
-        <w:t xml:space="preserve">van het reekalfje in hoofdstuk 19.</w:t>
-      </w:r>
-    </w:p>
-    <w:p>
-      <w:pPr>
-        <w:pStyle w:val="FirstParagraph"/>
+        <w:pStyle w:val="BodyText"/>
+      </w:pPr>
+      <w:r>
+        <w:t xml:space="preserve">Het reekalfje staat in hoofdstuk 19 en is daarmee ook vastgelegd.</w:t>
+      </w:r>
+    </w:p>
+    <w:p>
+      <w:pPr>
+        <w:pStyle w:val="BodyText"/>
       </w:pPr>
       <w:r>
         <w:t xml:space="preserve">Vastgelegd in versie 5: het dorp is Heultje (Westerlo), de GAS-boete bedraagt 250 euro, en het boek opent met een motto van Kafka (sectie 20).</w:t>
@@ -11398,7 +11384,7 @@
       <w:pPr>
         <w:numPr>
           <w:ilvl w:val="0"/>
-          <w:numId w:val="1022"/>
+          <w:numId w:val="1021"/>
         </w:numPr>
         <w:pStyle w:val="Compact"/>
       </w:pPr>
@@ -11420,7 +11406,7 @@
       <w:pPr>
         <w:numPr>
           <w:ilvl w:val="0"/>
-          <w:numId w:val="1022"/>
+          <w:numId w:val="1021"/>
         </w:numPr>
         <w:pStyle w:val="Compact"/>
       </w:pPr>
@@ -11442,7 +11428,7 @@
       <w:pPr>
         <w:numPr>
           <w:ilvl w:val="0"/>
-          <w:numId w:val="1022"/>
+          <w:numId w:val="1021"/>
         </w:numPr>
         <w:pStyle w:val="Compact"/>
       </w:pPr>
@@ -11493,67 +11479,67 @@
       <w:pPr>
         <w:numPr>
           <w:ilvl w:val="0"/>
+          <w:numId w:val="1021"/>
+        </w:numPr>
+        <w:pStyle w:val="Compact"/>
+      </w:pPr>
+      <w:r>
+        <w:rPr>
+          <w:bCs/>
+          <w:b/>
+        </w:rPr>
+        <w:t xml:space="preserve">Lijnplicht en poepzakjes</w:t>
+      </w:r>
+      <w:r>
+        <w:t xml:space="preserve"> </w:t>
+      </w:r>
+      <w:r>
+        <w:t xml:space="preserve">zijn een karaktertrek van Lode. Hoofdstuk 19 is herschreven, met de feiten van het ANB als achtergrond.</w:t>
+      </w:r>
+    </w:p>
+    <w:p>
+      <w:pPr>
+        <w:numPr>
+          <w:ilvl w:val="0"/>
+          <w:numId w:val="1021"/>
+        </w:numPr>
+        <w:pStyle w:val="Compact"/>
+      </w:pPr>
+      <w:r>
+        <w:rPr>
+          <w:bCs/>
+          <w:b/>
+        </w:rPr>
+        <w:t xml:space="preserve">De minimumleeftijd van pups is 8 weken;</w:t>
+      </w:r>
+      <w:r>
+        <w:t xml:space="preserve"> </w:t>
+      </w:r>
+      <w:r>
+        <w:t xml:space="preserve">de tijdlijn is aangepast.</w:t>
+      </w:r>
+    </w:p>
+    <w:p>
+      <w:pPr>
+        <w:numPr>
+          <w:ilvl w:val="0"/>
+          <w:numId w:val="1021"/>
+        </w:numPr>
+        <w:pStyle w:val="Compact"/>
+      </w:pPr>
+      <w:r>
+        <w:rPr>
+          <w:bCs/>
+          <w:b/>
+        </w:rPr>
+        <w:t xml:space="preserve">Een nieuw einde:</w:t>
+      </w:r>
+    </w:p>
+    <w:p>
+      <w:pPr>
+        <w:numPr>
+          <w:ilvl w:val="1"/>
           <w:numId w:val="1022"/>
-        </w:numPr>
-        <w:pStyle w:val="Compact"/>
-      </w:pPr>
-      <w:r>
-        <w:rPr>
-          <w:bCs/>
-          <w:b/>
-        </w:rPr>
-        <w:t xml:space="preserve">Lijnplicht en poepzakjes</w:t>
-      </w:r>
-      <w:r>
-        <w:t xml:space="preserve"> </w:t>
-      </w:r>
-      <w:r>
-        <w:t xml:space="preserve">zijn een karaktertrek van Lode. Hoofdstuk 19 is herschreven, met de feiten van het ANB als achtergrond.</w:t>
-      </w:r>
-    </w:p>
-    <w:p>
-      <w:pPr>
-        <w:numPr>
-          <w:ilvl w:val="0"/>
-          <w:numId w:val="1022"/>
-        </w:numPr>
-        <w:pStyle w:val="Compact"/>
-      </w:pPr>
-      <w:r>
-        <w:rPr>
-          <w:bCs/>
-          <w:b/>
-        </w:rPr>
-        <w:t xml:space="preserve">De minimumleeftijd van pups is 8 weken;</w:t>
-      </w:r>
-      <w:r>
-        <w:t xml:space="preserve"> </w:t>
-      </w:r>
-      <w:r>
-        <w:t xml:space="preserve">de tijdlijn is aangepast.</w:t>
-      </w:r>
-    </w:p>
-    <w:p>
-      <w:pPr>
-        <w:numPr>
-          <w:ilvl w:val="0"/>
-          <w:numId w:val="1022"/>
-        </w:numPr>
-        <w:pStyle w:val="Compact"/>
-      </w:pPr>
-      <w:r>
-        <w:rPr>
-          <w:bCs/>
-          <w:b/>
-        </w:rPr>
-        <w:t xml:space="preserve">Een nieuw einde:</w:t>
-      </w:r>
-    </w:p>
-    <w:p>
-      <w:pPr>
-        <w:numPr>
-          <w:ilvl w:val="1"/>
-          <w:numId w:val="1023"/>
         </w:numPr>
         <w:pStyle w:val="Compact"/>
       </w:pPr>
@@ -11581,7 +11567,7 @@
       <w:pPr>
         <w:numPr>
           <w:ilvl w:val="1"/>
-          <w:numId w:val="1023"/>
+          <w:numId w:val="1022"/>
         </w:numPr>
         <w:pStyle w:val="Compact"/>
       </w:pPr>
@@ -11609,7 +11595,7 @@
       <w:pPr>
         <w:numPr>
           <w:ilvl w:val="1"/>
-          <w:numId w:val="1023"/>
+          <w:numId w:val="1022"/>
         </w:numPr>
         <w:pStyle w:val="Compact"/>
       </w:pPr>
@@ -11649,7 +11635,7 @@
       <w:pPr>
         <w:numPr>
           <w:ilvl w:val="0"/>
-          <w:numId w:val="1022"/>
+          <w:numId w:val="1021"/>
         </w:numPr>
         <w:pStyle w:val="Compact"/>
       </w:pPr>
@@ -11671,7 +11657,7 @@
       <w:pPr>
         <w:numPr>
           <w:ilvl w:val="0"/>
-          <w:numId w:val="1022"/>
+          <w:numId w:val="1021"/>
         </w:numPr>
         <w:pStyle w:val="Compact"/>
       </w:pPr>
@@ -11693,7 +11679,7 @@
       <w:pPr>
         <w:numPr>
           <w:ilvl w:val="0"/>
-          <w:numId w:val="1022"/>
+          <w:numId w:val="1021"/>
         </w:numPr>
         <w:pStyle w:val="Compact"/>
       </w:pPr>
@@ -11715,7 +11701,7 @@
       <w:pPr>
         <w:numPr>
           <w:ilvl w:val="0"/>
-          <w:numId w:val="1022"/>
+          <w:numId w:val="1021"/>
         </w:numPr>
         <w:pStyle w:val="Compact"/>
       </w:pPr>
@@ -11737,7 +11723,7 @@
       <w:pPr>
         <w:numPr>
           <w:ilvl w:val="0"/>
-          <w:numId w:val="1022"/>
+          <w:numId w:val="1021"/>
         </w:numPr>
         <w:pStyle w:val="Compact"/>
       </w:pPr>
@@ -11759,7 +11745,7 @@
       <w:pPr>
         <w:numPr>
           <w:ilvl w:val="0"/>
-          <w:numId w:val="1022"/>
+          <w:numId w:val="1021"/>
         </w:numPr>
         <w:pStyle w:val="Compact"/>
       </w:pPr>
@@ -11791,7 +11777,7 @@
       <w:pPr>
         <w:numPr>
           <w:ilvl w:val="0"/>
-          <w:numId w:val="1024"/>
+          <w:numId w:val="1023"/>
         </w:numPr>
         <w:pStyle w:val="Compact"/>
       </w:pPr>
@@ -11813,7 +11799,7 @@
       <w:pPr>
         <w:numPr>
           <w:ilvl w:val="0"/>
-          <w:numId w:val="1024"/>
+          <w:numId w:val="1023"/>
         </w:numPr>
         <w:pStyle w:val="Compact"/>
       </w:pPr>
@@ -11835,7 +11821,7 @@
       <w:pPr>
         <w:numPr>
           <w:ilvl w:val="0"/>
-          <w:numId w:val="1024"/>
+          <w:numId w:val="1023"/>
         </w:numPr>
         <w:pStyle w:val="Compact"/>
       </w:pPr>
@@ -11857,7 +11843,7 @@
       <w:pPr>
         <w:numPr>
           <w:ilvl w:val="0"/>
-          <w:numId w:val="1024"/>
+          <w:numId w:val="1023"/>
         </w:numPr>
         <w:pStyle w:val="Compact"/>
       </w:pPr>
@@ -11879,7 +11865,7 @@
       <w:pPr>
         <w:numPr>
           <w:ilvl w:val="0"/>
-          <w:numId w:val="1024"/>
+          <w:numId w:val="1023"/>
         </w:numPr>
         <w:pStyle w:val="Compact"/>
       </w:pPr>
@@ -11901,7 +11887,7 @@
       <w:pPr>
         <w:numPr>
           <w:ilvl w:val="0"/>
-          <w:numId w:val="1024"/>
+          <w:numId w:val="1023"/>
         </w:numPr>
         <w:pStyle w:val="Compact"/>
       </w:pPr>
@@ -11923,7 +11909,7 @@
       <w:pPr>
         <w:numPr>
           <w:ilvl w:val="0"/>
-          <w:numId w:val="1024"/>
+          <w:numId w:val="1023"/>
         </w:numPr>
         <w:pStyle w:val="Compact"/>
       </w:pPr>
@@ -12028,6 +12014,2044 @@
       </w:r>
     </w:p>
     <w:bookmarkEnd w:id="92"/>
+    <w:bookmarkStart w:id="116" w:name="X4659ac7e834cfb99fadfcc2d14a9491700242fd"/>
+    <w:p>
+      <w:pPr>
+        <w:pStyle w:val="Heading1"/>
+      </w:pPr>
+      <w:r>
+        <w:t xml:space="preserve">21. Vaste feiten uit de eerste versie van het manuscript</w:t>
+      </w:r>
+    </w:p>
+    <w:p>
+      <w:pPr>
+        <w:pStyle w:val="FirstParagraph"/>
+      </w:pPr>
+      <w:r>
+        <w:t xml:space="preserve">Deze feiten zijn bij het schrijven van de eerste versie ontstaan en gelden nu als vast. De dierenarts in het dorp is een man; de chirurgijn van de specialistische kliniek is een vrouw. Labradorwet 47 luidt:</w:t>
+      </w:r>
+      <w:r>
+        <w:t xml:space="preserve"> </w:t>
+      </w:r>
+      <w:r>
+        <w:t xml:space="preserve">“</w:t>
+      </w:r>
+      <w:r>
+        <w:t xml:space="preserve">Wandel elke dag, in elk weer, ook als je stijf bent. Op den duur vergeet je waarom je ooit begonnen bent. Dat is het goede moment om door te gaan.</w:t>
+      </w:r>
+      <w:r>
+        <w:t xml:space="preserve">”</w:t>
+      </w:r>
+    </w:p>
+    <w:bookmarkStart w:id="93" w:name="de-fokker-en-het-nest-hoofdstuk-1-tot-3"/>
+    <w:p>
+      <w:pPr>
+        <w:pStyle w:val="Heading2"/>
+      </w:pPr>
+      <w:r>
+        <w:t xml:space="preserve">De fokker en het nest (hoofdstuk 1 tot 3)</w:t>
+      </w:r>
+    </w:p>
+    <w:p>
+      <w:pPr>
+        <w:numPr>
+          <w:ilvl w:val="0"/>
+          <w:numId w:val="1024"/>
+        </w:numPr>
+        <w:pStyle w:val="Compact"/>
+      </w:pPr>
+      <w:r>
+        <w:t xml:space="preserve">De fokster is een grote vrouw met laarzen tot aan de knieën en haar haar in een elastiekje. Ze heeft een lage, hese stem, zegt</w:t>
+      </w:r>
+      <w:r>
+        <w:t xml:space="preserve"> </w:t>
+      </w:r>
+      <w:r>
+        <w:t xml:space="preserve">“</w:t>
+      </w:r>
+      <w:r>
+        <w:t xml:space="preserve">Allez, mannekes</w:t>
+      </w:r>
+      <w:r>
+        <w:t xml:space="preserve">”</w:t>
+      </w:r>
+      <w:r>
+        <w:t xml:space="preserve"> </w:t>
+      </w:r>
+      <w:r>
+        <w:t xml:space="preserve">en fokt al twintig jaar.</w:t>
+      </w:r>
+    </w:p>
+    <w:p>
+      <w:pPr>
+        <w:numPr>
+          <w:ilvl w:val="0"/>
+          <w:numId w:val="1024"/>
+        </w:numPr>
+        <w:pStyle w:val="Compact"/>
+      </w:pPr>
+      <w:r>
+        <w:t xml:space="preserve">Haar jas hangt aan een spijker in het kot. In het kot staat ook een kruiwagen met een lekke band.</w:t>
+      </w:r>
+    </w:p>
+    <w:p>
+      <w:pPr>
+        <w:numPr>
+          <w:ilvl w:val="0"/>
+          <w:numId w:val="1024"/>
+        </w:numPr>
+        <w:pStyle w:val="Compact"/>
+      </w:pPr>
+      <w:r>
+        <w:t xml:space="preserve">De moeder is zwart; de pups zijn (bijna allemaal) geel.</w:t>
+      </w:r>
+    </w:p>
+    <w:p>
+      <w:pPr>
+        <w:numPr>
+          <w:ilvl w:val="0"/>
+          <w:numId w:val="1024"/>
+        </w:numPr>
+        <w:pStyle w:val="Compact"/>
+      </w:pPr>
+      <w:r>
+        <w:t xml:space="preserve">Nestgenoten met een eigen geur:</w:t>
+      </w:r>
+    </w:p>
+    <w:p>
+      <w:pPr>
+        <w:numPr>
+          <w:ilvl w:val="1"/>
+          <w:numId w:val="1025"/>
+        </w:numPr>
+        <w:pStyle w:val="Compact"/>
+      </w:pPr>
+      <w:r>
+        <w:t xml:space="preserve">een pup met donkere oortjes, die naar natte steen ruikt en door een gezin met een jongetje wordt opgehaald;</w:t>
+      </w:r>
+    </w:p>
+    <w:p>
+      <w:pPr>
+        <w:numPr>
+          <w:ilvl w:val="1"/>
+          <w:numId w:val="1025"/>
+        </w:numPr>
+        <w:pStyle w:val="Compact"/>
+      </w:pPr>
+      <w:r>
+        <w:t xml:space="preserve">een sterke pup die altijd bovenop ligt en</w:t>
+      </w:r>
+      <w:r>
+        <w:t xml:space="preserve"> </w:t>
+      </w:r>
+      <w:r>
+        <w:t xml:space="preserve">“</w:t>
+      </w:r>
+      <w:r>
+        <w:t xml:space="preserve">onder de arm als een brood</w:t>
+      </w:r>
+      <w:r>
+        <w:t xml:space="preserve">”</w:t>
+      </w:r>
+      <w:r>
+        <w:t xml:space="preserve"> </w:t>
+      </w:r>
+      <w:r>
+        <w:t xml:space="preserve">wordt meegenomen;</w:t>
+      </w:r>
+    </w:p>
+    <w:p>
+      <w:pPr>
+        <w:numPr>
+          <w:ilvl w:val="1"/>
+          <w:numId w:val="1025"/>
+        </w:numPr>
+        <w:pStyle w:val="Compact"/>
+      </w:pPr>
+      <w:r>
+        <w:t xml:space="preserve">een pup die zuur ruikt en in een kartonnen doos met gaten vertrekt.</w:t>
+      </w:r>
+    </w:p>
+    <w:p>
+      <w:pPr>
+        <w:numPr>
+          <w:ilvl w:val="0"/>
+          <w:numId w:val="1024"/>
+        </w:numPr>
+        <w:pStyle w:val="Compact"/>
+      </w:pPr>
+      <w:r>
+        <w:t xml:space="preserve">Een dierenarts met een koffertje zet de chip, zittend op een omgekeerde emmer.</w:t>
+      </w:r>
+    </w:p>
+    <w:bookmarkEnd w:id="93"/>
+    <w:bookmarkStart w:id="94" w:name="bij-de-komst-hoofdstuk-3-en-4"/>
+    <w:p>
+      <w:pPr>
+        <w:pStyle w:val="Heading2"/>
+      </w:pPr>
+      <w:r>
+        <w:t xml:space="preserve">Bij de komst (hoofdstuk 3 en 4)</w:t>
+      </w:r>
+    </w:p>
+    <w:p>
+      <w:pPr>
+        <w:numPr>
+          <w:ilvl w:val="0"/>
+          <w:numId w:val="1026"/>
+        </w:numPr>
+        <w:pStyle w:val="Compact"/>
+      </w:pPr>
+      <w:r>
+        <w:t xml:space="preserve">Lode komt met een papiertje vol vragen. Hij vraagt naar heupen en ellebogen (</w:t>
+      </w:r>
+      <w:r>
+        <w:t xml:space="preserve">“</w:t>
+      </w:r>
+      <w:r>
+        <w:t xml:space="preserve">getest</w:t>
+      </w:r>
+      <w:r>
+        <w:t xml:space="preserve">”</w:t>
+      </w:r>
+      <w:r>
+        <w:t xml:space="preserve">).</w:t>
+      </w:r>
+    </w:p>
+    <w:p>
+      <w:pPr>
+        <w:numPr>
+          <w:ilvl w:val="0"/>
+          <w:numId w:val="1026"/>
+        </w:numPr>
+        <w:pStyle w:val="Compact"/>
+      </w:pPr>
+      <w:r>
+        <w:t xml:space="preserve">Het strootje uit hoofdstuk 3 ligt daarna lang op de vensterbank naast de voordeur.</w:t>
+      </w:r>
+    </w:p>
+    <w:p>
+      <w:pPr>
+        <w:numPr>
+          <w:ilvl w:val="0"/>
+          <w:numId w:val="1026"/>
+        </w:numPr>
+        <w:pStyle w:val="Compact"/>
+      </w:pPr>
+      <w:r>
+        <w:t xml:space="preserve">Op ’t hof</w:t>
+      </w:r>
+      <w:r>
+        <w:t xml:space="preserve"> </w:t>
+      </w:r>
+      <w:r>
+        <w:t xml:space="preserve">“</w:t>
+      </w:r>
+      <w:r>
+        <w:t xml:space="preserve">heetten ze allemaal Bobby</w:t>
+      </w:r>
+      <w:r>
+        <w:t xml:space="preserve">”</w:t>
+      </w:r>
+      <w:r>
+        <w:t xml:space="preserve">. Lodes vader gebruikte de opgerolde krant (</w:t>
+      </w:r>
+      <w:r>
+        <w:t xml:space="preserve">“</w:t>
+      </w:r>
+      <w:r>
+        <w:t xml:space="preserve">Zo deed mijn vader dat</w:t>
+      </w:r>
+      <w:r>
+        <w:t xml:space="preserve">”</w:t>
+      </w:r>
+      <w:r>
+        <w:t xml:space="preserve">).</w:t>
+      </w:r>
+    </w:p>
+    <w:p>
+      <w:pPr>
+        <w:numPr>
+          <w:ilvl w:val="0"/>
+          <w:numId w:val="1026"/>
+        </w:numPr>
+        <w:pStyle w:val="Compact"/>
+      </w:pPr>
+      <w:r>
+        <w:t xml:space="preserve">Mira’s eerste mep is zonder nagels.</w:t>
+      </w:r>
+    </w:p>
+    <w:p>
+      <w:pPr>
+        <w:numPr>
+          <w:ilvl w:val="0"/>
+          <w:numId w:val="1026"/>
+        </w:numPr>
+        <w:pStyle w:val="Compact"/>
+      </w:pPr>
+      <w:r>
+        <w:t xml:space="preserve">De bench staat de eerste nacht in de keuken, naast de koelkast.</w:t>
+      </w:r>
+    </w:p>
+    <w:bookmarkEnd w:id="94"/>
+    <w:bookmarkStart w:id="95" w:name="het-dekentje"/>
+    <w:p>
+      <w:pPr>
+        <w:pStyle w:val="Heading2"/>
+      </w:pPr>
+      <w:r>
+        <w:t xml:space="preserve">Het dekentje</w:t>
+      </w:r>
+    </w:p>
+    <w:p>
+      <w:pPr>
+        <w:numPr>
+          <w:ilvl w:val="0"/>
+          <w:numId w:val="1027"/>
+        </w:numPr>
+        <w:pStyle w:val="Compact"/>
+      </w:pPr>
+      <w:r>
+        <w:t xml:space="preserve">Het dekentje uit de auto ligt van hoofdstuk 4 tot 10 in de bench en daarna in de mand.</w:t>
+      </w:r>
+    </w:p>
+    <w:p>
+      <w:pPr>
+        <w:numPr>
+          <w:ilvl w:val="0"/>
+          <w:numId w:val="1027"/>
+        </w:numPr>
+        <w:pStyle w:val="Compact"/>
+      </w:pPr>
+      <w:r>
+        <w:t xml:space="preserve">Zodra de pantoffel zijn plaats inneemt, ligt het weer achterin de auto (hoofdstuk 16, 24, 25 en 26).</w:t>
+      </w:r>
+    </w:p>
+    <w:p>
+      <w:pPr>
+        <w:numPr>
+          <w:ilvl w:val="0"/>
+          <w:numId w:val="1027"/>
+        </w:numPr>
+        <w:pStyle w:val="Compact"/>
+      </w:pPr>
+      <w:r>
+        <w:t xml:space="preserve">Aan het einde ruikt het naar Tara (hoofdstuk 26).</w:t>
+      </w:r>
+    </w:p>
+    <w:bookmarkEnd w:id="95"/>
+    <w:bookmarkStart w:id="96" w:name="de-rode-bal"/>
+    <w:p>
+      <w:pPr>
+        <w:pStyle w:val="Heading2"/>
+      </w:pPr>
+      <w:r>
+        <w:t xml:space="preserve">De rode bal</w:t>
+      </w:r>
+    </w:p>
+    <w:p>
+      <w:pPr>
+        <w:numPr>
+          <w:ilvl w:val="0"/>
+          <w:numId w:val="1028"/>
+        </w:numPr>
+        <w:pStyle w:val="Compact"/>
+      </w:pPr>
+      <w:r>
+        <w:t xml:space="preserve">Gekocht in de dierenwinkel. Hij piept niet.</w:t>
+      </w:r>
+    </w:p>
+    <w:p>
+      <w:pPr>
+        <w:numPr>
+          <w:ilvl w:val="0"/>
+          <w:numId w:val="1028"/>
+        </w:numPr>
+        <w:pStyle w:val="Compact"/>
+      </w:pPr>
+      <w:r>
+        <w:t xml:space="preserve">Eerst ligt hij in een mandje bij de kapstok (hoofdstuk 6 en 8).</w:t>
+      </w:r>
+    </w:p>
+    <w:p>
+      <w:pPr>
+        <w:numPr>
+          <w:ilvl w:val="0"/>
+          <w:numId w:val="1028"/>
+        </w:numPr>
+        <w:pStyle w:val="Compact"/>
+      </w:pPr>
+      <w:r>
+        <w:t xml:space="preserve">Vanaf Deel III ligt hij in de mand (de overgang staat in hoofdstuk 19).</w:t>
+      </w:r>
+    </w:p>
+    <w:p>
+      <w:pPr>
+        <w:numPr>
+          <w:ilvl w:val="0"/>
+          <w:numId w:val="1028"/>
+        </w:numPr>
+        <w:pStyle w:val="Compact"/>
+      </w:pPr>
+      <w:r>
+        <w:t xml:space="preserve">Hij is roze geworden (hoofdstuk 22).</w:t>
+      </w:r>
+    </w:p>
+    <w:p>
+      <w:pPr>
+        <w:numPr>
+          <w:ilvl w:val="0"/>
+          <w:numId w:val="1028"/>
+        </w:numPr>
+        <w:pStyle w:val="Compact"/>
+      </w:pPr>
+      <w:r>
+        <w:t xml:space="preserve">Met Kerstmis krijgt Tara van Bram een blauwe bal, die ze niet mee naar de mand neemt (dossier 72).</w:t>
+      </w:r>
+    </w:p>
+    <w:bookmarkEnd w:id="96"/>
+    <w:bookmarkStart w:id="97" w:name="de-pantoffels"/>
+    <w:p>
+      <w:pPr>
+        <w:pStyle w:val="Heading2"/>
+      </w:pPr>
+      <w:r>
+        <w:t xml:space="preserve">De pantoffels</w:t>
+      </w:r>
+    </w:p>
+    <w:p>
+      <w:pPr>
+        <w:numPr>
+          <w:ilvl w:val="0"/>
+          <w:numId w:val="1029"/>
+        </w:numPr>
+        <w:pStyle w:val="Compact"/>
+      </w:pPr>
+      <w:r>
+        <w:t xml:space="preserve">Lodes eerste pantoffels zijn van bruin vilt. Tara vernielt de linker en slaapt met de rechter.</w:t>
+      </w:r>
+    </w:p>
+    <w:p>
+      <w:pPr>
+        <w:numPr>
+          <w:ilvl w:val="0"/>
+          <w:numId w:val="1029"/>
+        </w:numPr>
+        <w:pStyle w:val="Compact"/>
+      </w:pPr>
+      <w:r>
+        <w:t xml:space="preserve">Lode koopt een nieuw, grijs paar.</w:t>
+      </w:r>
+    </w:p>
+    <w:p>
+      <w:pPr>
+        <w:numPr>
+          <w:ilvl w:val="0"/>
+          <w:numId w:val="1029"/>
+        </w:numPr>
+        <w:pStyle w:val="Compact"/>
+      </w:pPr>
+      <w:r>
+        <w:t xml:space="preserve">De oude rechterpantoffel slijt helemaal op en wordt door Mieke weggedaan (nieuw in hoofdstuk 19).</w:t>
+      </w:r>
+    </w:p>
+    <w:bookmarkEnd w:id="97"/>
+    <w:bookmarkStart w:id="98" w:name="lezen-en-schrijven"/>
+    <w:p>
+      <w:pPr>
+        <w:pStyle w:val="Heading2"/>
+      </w:pPr>
+      <w:r>
+        <w:t xml:space="preserve">Lezen en schrijven</w:t>
+      </w:r>
+    </w:p>
+    <w:p>
+      <w:pPr>
+        <w:numPr>
+          <w:ilvl w:val="0"/>
+          <w:numId w:val="1030"/>
+        </w:numPr>
+        <w:pStyle w:val="Compact"/>
+      </w:pPr>
+      <w:r>
+        <w:t xml:space="preserve">Sinds hoofdstuk 7 leest Lode op een tablet, voor Tara</w:t>
+      </w:r>
+      <w:r>
+        <w:t xml:space="preserve"> </w:t>
+      </w:r>
+      <w:r>
+        <w:t xml:space="preserve">“</w:t>
+      </w:r>
+      <w:r>
+        <w:t xml:space="preserve">het platte lichte ding</w:t>
+      </w:r>
+      <w:r>
+        <w:t xml:space="preserve">”</w:t>
+      </w:r>
+      <w:r>
+        <w:t xml:space="preserve">.</w:t>
+      </w:r>
+    </w:p>
+    <w:p>
+      <w:pPr>
+        <w:numPr>
+          <w:ilvl w:val="0"/>
+          <w:numId w:val="1030"/>
+        </w:numPr>
+        <w:pStyle w:val="Compact"/>
+      </w:pPr>
+      <w:r>
+        <w:t xml:space="preserve">Hoofdstuk 26 en de epiloog schrijft Lode in een schrift.</w:t>
+      </w:r>
+    </w:p>
+    <w:bookmarkEnd w:id="98"/>
+    <w:bookmarkStart w:id="99" w:name="mensen-rond-lode"/>
+    <w:p>
+      <w:pPr>
+        <w:pStyle w:val="Heading2"/>
+      </w:pPr>
+      <w:r>
+        <w:t xml:space="preserve">Mensen rond Lode</w:t>
+      </w:r>
+    </w:p>
+    <w:p>
+      <w:pPr>
+        <w:numPr>
+          <w:ilvl w:val="0"/>
+          <w:numId w:val="1031"/>
+        </w:numPr>
+        <w:pStyle w:val="Compact"/>
+      </w:pPr>
+      <w:r>
+        <w:rPr>
+          <w:bCs/>
+          <w:b/>
+        </w:rPr>
+        <w:t xml:space="preserve">Dirk:</w:t>
+      </w:r>
+      <w:r>
+        <w:t xml:space="preserve"> </w:t>
+      </w:r>
+      <w:r>
+        <w:t xml:space="preserve">een collega van Lode in Antwerpen. Hij leent hem het boek over de alfa (met een wolf op de kaft, van</w:t>
+      </w:r>
+      <w:r>
+        <w:t xml:space="preserve"> </w:t>
+      </w:r>
+      <w:r>
+        <w:t xml:space="preserve">“</w:t>
+      </w:r>
+      <w:r>
+        <w:t xml:space="preserve">een Amerikaan</w:t>
+      </w:r>
+      <w:r>
+        <w:t xml:space="preserve">”</w:t>
+      </w:r>
+      <w:r>
+        <w:t xml:space="preserve">) en heeft twee Mechelaars. In hoofdstuk 8 wordt hij ontslagen; Lode zelf niet.</w:t>
+      </w:r>
+    </w:p>
+    <w:p>
+      <w:pPr>
+        <w:numPr>
+          <w:ilvl w:val="0"/>
+          <w:numId w:val="1031"/>
+        </w:numPr>
+        <w:pStyle w:val="Compact"/>
+      </w:pPr>
+      <w:r>
+        <w:rPr>
+          <w:bCs/>
+          <w:b/>
+        </w:rPr>
+        <w:t xml:space="preserve">Een oude man met pet:</w:t>
+      </w:r>
+      <w:r>
+        <w:t xml:space="preserve"> </w:t>
+      </w:r>
+      <w:r>
+        <w:t xml:space="preserve">zit op de bank bij het grasveld aan het fietspad en voert de duiven (hoofdstuk 7).</w:t>
+      </w:r>
+    </w:p>
+    <w:p>
+      <w:pPr>
+        <w:numPr>
+          <w:ilvl w:val="0"/>
+          <w:numId w:val="1031"/>
+        </w:numPr>
+        <w:pStyle w:val="Compact"/>
+      </w:pPr>
+      <w:r>
+        <w:rPr>
+          <w:bCs/>
+          <w:b/>
+        </w:rPr>
+        <w:t xml:space="preserve">Jef:</w:t>
+      </w:r>
+      <w:r>
+        <w:t xml:space="preserve"> </w:t>
+      </w:r>
+      <w:r>
+        <w:t xml:space="preserve">de buurman met de rode kater. De kater is twaalf jaar (hoofdstuk 11). Jef draagt een overall en heeft een schuur. Achteraan in Lodes tuin staat een houten schutting.</w:t>
+      </w:r>
+    </w:p>
+    <w:bookmarkEnd w:id="99"/>
+    <w:bookmarkStart w:id="100" w:name="huis-tuin-en-dagelijkse-gewoontes"/>
+    <w:p>
+      <w:pPr>
+        <w:pStyle w:val="Heading2"/>
+      </w:pPr>
+      <w:r>
+        <w:t xml:space="preserve">Huis, tuin en dagelijkse gewoontes</w:t>
+      </w:r>
+    </w:p>
+    <w:p>
+      <w:pPr>
+        <w:numPr>
+          <w:ilvl w:val="0"/>
+          <w:numId w:val="1032"/>
+        </w:numPr>
+        <w:pStyle w:val="Compact"/>
+      </w:pPr>
+      <w:r>
+        <w:t xml:space="preserve">In de tuin staan een appelboom en groentebakken met Miekes tomaten. Na zijn pensioen heeft Lode achteraan, bij de compostbak, tomaten en boontjes (hoofdstuk 21).</w:t>
+      </w:r>
+    </w:p>
+    <w:p>
+      <w:pPr>
+        <w:numPr>
+          <w:ilvl w:val="0"/>
+          <w:numId w:val="1032"/>
+        </w:numPr>
+        <w:pStyle w:val="Compact"/>
+      </w:pPr>
+      <w:r>
+        <w:t xml:space="preserve">De zandweg achter de laatste huizen loopt tussen weiden en een maïsveld naar het dennenbos en een ven. Er staat een paal met een verroest bordje; daar gaat de lijn los.</w:t>
+      </w:r>
+    </w:p>
+    <w:p>
+      <w:pPr>
+        <w:numPr>
+          <w:ilvl w:val="0"/>
+          <w:numId w:val="1032"/>
+        </w:numPr>
+        <w:pStyle w:val="Compact"/>
+      </w:pPr>
+      <w:r>
+        <w:t xml:space="preserve">In hoofdstuk 15 gaat de lijn los bij een slagboom. Er is een herder van de hoeve aan de overkant, en er is een beekweg.</w:t>
+      </w:r>
+    </w:p>
+    <w:p>
+      <w:pPr>
+        <w:numPr>
+          <w:ilvl w:val="0"/>
+          <w:numId w:val="1032"/>
+        </w:numPr>
+        <w:pStyle w:val="Compact"/>
+      </w:pPr>
+      <w:r>
+        <w:t xml:space="preserve">Het kleedje voor</w:t>
+      </w:r>
+      <w:r>
+        <w:t xml:space="preserve"> </w:t>
+      </w:r>
+      <w:r>
+        <w:t xml:space="preserve">“</w:t>
+      </w:r>
+      <w:r>
+        <w:t xml:space="preserve">plaats</w:t>
+      </w:r>
+      <w:r>
+        <w:t xml:space="preserve">”</w:t>
+      </w:r>
+      <w:r>
+        <w:t xml:space="preserve"> </w:t>
+      </w:r>
+      <w:r>
+        <w:t xml:space="preserve">is grijs, met een rubberen onderkant. Lode oefent zes maanden, eerst thuis en dan op het lege terras.</w:t>
+      </w:r>
+    </w:p>
+    <w:p>
+      <w:pPr>
+        <w:numPr>
+          <w:ilvl w:val="0"/>
+          <w:numId w:val="1032"/>
+        </w:numPr>
+        <w:pStyle w:val="Compact"/>
+      </w:pPr>
+      <w:r>
+        <w:t xml:space="preserve">Er is een kast met glazen deurtjes voor sterke drank, en een muziekinstallatie in de woonkamer.</w:t>
+      </w:r>
+    </w:p>
+    <w:p>
+      <w:pPr>
+        <w:numPr>
+          <w:ilvl w:val="0"/>
+          <w:numId w:val="1032"/>
+        </w:numPr>
+        <w:pStyle w:val="Compact"/>
+      </w:pPr>
+      <w:r>
+        <w:t xml:space="preserve">In de gang, naast de kapstok, hangt een spiegel (dossier 103).</w:t>
+      </w:r>
+    </w:p>
+    <w:p>
+      <w:pPr>
+        <w:numPr>
+          <w:ilvl w:val="0"/>
+          <w:numId w:val="1032"/>
+        </w:numPr>
+        <w:pStyle w:val="Compact"/>
+      </w:pPr>
+      <w:r>
+        <w:t xml:space="preserve">Onder de garantiebewijzen in de lade van het dressoir liggen het verweerschrift en de papieren.</w:t>
+      </w:r>
+    </w:p>
+    <w:p>
+      <w:pPr>
+        <w:numPr>
+          <w:ilvl w:val="0"/>
+          <w:numId w:val="1032"/>
+        </w:numPr>
+        <w:pStyle w:val="Compact"/>
+      </w:pPr>
+      <w:r>
+        <w:t xml:space="preserve">Lode neemt sinds Deel III elke ochtend een pilletje. Tara krijgt een gewrichtspilletje in een blokje kaas.</w:t>
+      </w:r>
+    </w:p>
+    <w:p>
+      <w:pPr>
+        <w:numPr>
+          <w:ilvl w:val="0"/>
+          <w:numId w:val="1032"/>
+        </w:numPr>
+        <w:pStyle w:val="Compact"/>
+      </w:pPr>
+      <w:r>
+        <w:t xml:space="preserve">Lode zit vanaf Deel III bijna altijd op de grond, met zijn rug tegen de zetel. Mieke legt er een kussen.</w:t>
+      </w:r>
+    </w:p>
+    <w:bookmarkEnd w:id="100"/>
+    <w:bookmarkStart w:id="101" w:name="het-dorp-en-de-omgeving"/>
+    <w:p>
+      <w:pPr>
+        <w:pStyle w:val="Heading2"/>
+      </w:pPr>
+      <w:r>
+        <w:t xml:space="preserve">Het dorp en de omgeving</w:t>
+      </w:r>
+    </w:p>
+    <w:p>
+      <w:pPr>
+        <w:numPr>
+          <w:ilvl w:val="0"/>
+          <w:numId w:val="1033"/>
+        </w:numPr>
+        <w:pStyle w:val="Compact"/>
+      </w:pPr>
+      <w:r>
+        <w:t xml:space="preserve">Op het dorpsplein van Heultje staan een café, een frituur aan de overkant, de kerk en een bakker. De uitbater van het café draagt een voorschoot en zet ongevraagd een koffie neer.</w:t>
+      </w:r>
+    </w:p>
+    <w:p>
+      <w:pPr>
+        <w:numPr>
+          <w:ilvl w:val="0"/>
+          <w:numId w:val="1033"/>
+        </w:numPr>
+        <w:pStyle w:val="Compact"/>
+      </w:pPr>
+      <w:r>
+        <w:t xml:space="preserve">Bruno is een jonge krullenhond aan een lijn op het terras (hoofdstuk 12).</w:t>
+      </w:r>
+    </w:p>
+    <w:p>
+      <w:pPr>
+        <w:numPr>
+          <w:ilvl w:val="0"/>
+          <w:numId w:val="1033"/>
+        </w:numPr>
+        <w:pStyle w:val="Compact"/>
+      </w:pPr>
+      <w:r>
+        <w:t xml:space="preserve">In de straat achter de kerk woont een reu achter een zwarte ijzeren poort (hoofdstuk 17).</w:t>
+      </w:r>
+    </w:p>
+    <w:p>
+      <w:pPr>
+        <w:numPr>
+          <w:ilvl w:val="0"/>
+          <w:numId w:val="1033"/>
+        </w:numPr>
+        <w:pStyle w:val="Compact"/>
+      </w:pPr>
+      <w:r>
+        <w:t xml:space="preserve">Er is een grasveld achter de kerk; daar leerde Sofie fietsen,</w:t>
+      </w:r>
+      <w:r>
+        <w:t xml:space="preserve"> </w:t>
+      </w:r>
+      <w:r>
+        <w:t xml:space="preserve">“</w:t>
+      </w:r>
+      <w:r>
+        <w:t xml:space="preserve">met roepen</w:t>
+      </w:r>
+      <w:r>
+        <w:t xml:space="preserve">”</w:t>
+      </w:r>
+      <w:r>
+        <w:t xml:space="preserve"> </w:t>
+      </w:r>
+      <w:r>
+        <w:t xml:space="preserve">(hoofdstuk 23).</w:t>
+      </w:r>
+    </w:p>
+    <w:bookmarkEnd w:id="101"/>
+    <w:bookmarkStart w:id="102" w:name="gasten-op-het-etentje-hoofdstuk-13-en-14"/>
+    <w:p>
+      <w:pPr>
+        <w:pStyle w:val="Heading2"/>
+      </w:pPr>
+      <w:r>
+        <w:t xml:space="preserve">Gasten op het etentje (hoofdstuk 13 en 14)</w:t>
+      </w:r>
+    </w:p>
+    <w:p>
+      <w:pPr>
+        <w:numPr>
+          <w:ilvl w:val="0"/>
+          <w:numId w:val="1034"/>
+        </w:numPr>
+        <w:pStyle w:val="Compact"/>
+      </w:pPr>
+      <w:r>
+        <w:rPr>
+          <w:bCs/>
+          <w:b/>
+        </w:rPr>
+        <w:t xml:space="preserve">Rik:</w:t>
+      </w:r>
+      <w:r>
+        <w:t xml:space="preserve"> </w:t>
+      </w:r>
+      <w:r>
+        <w:t xml:space="preserve">een oude collega van de firma in Antwerpen. Hij ruikt naar lederen autozetels, oude sigaren en een te zoet parfum, en vertelt het verhaal van de directeur die zijn auto niet meer vond. Bij het afscheid zegt hij</w:t>
+      </w:r>
+      <w:r>
+        <w:t xml:space="preserve"> </w:t>
+      </w:r>
+      <w:r>
+        <w:t xml:space="preserve">“</w:t>
+      </w:r>
+      <w:r>
+        <w:t xml:space="preserve">Merci, juffrouw</w:t>
+      </w:r>
+      <w:r>
+        <w:t xml:space="preserve">”</w:t>
+      </w:r>
+      <w:r>
+        <w:t xml:space="preserve">.</w:t>
+      </w:r>
+    </w:p>
+    <w:p>
+      <w:pPr>
+        <w:numPr>
+          <w:ilvl w:val="0"/>
+          <w:numId w:val="1034"/>
+        </w:numPr>
+        <w:pStyle w:val="Compact"/>
+      </w:pPr>
+      <w:r>
+        <w:rPr>
+          <w:bCs/>
+          <w:b/>
+        </w:rPr>
+        <w:t xml:space="preserve">Annemie:</w:t>
+      </w:r>
+      <w:r>
+        <w:t xml:space="preserve"> </w:t>
+      </w:r>
+      <w:r>
+        <w:t xml:space="preserve">Riks vrouw. Ze heeft thuis een kleine hond en brengt likeur mee van vakantie.</w:t>
+      </w:r>
+    </w:p>
+    <w:p>
+      <w:pPr>
+        <w:numPr>
+          <w:ilvl w:val="0"/>
+          <w:numId w:val="1034"/>
+        </w:numPr>
+        <w:pStyle w:val="Compact"/>
+      </w:pPr>
+      <w:r>
+        <w:rPr>
+          <w:bCs/>
+          <w:b/>
+        </w:rPr>
+        <w:t xml:space="preserve">Greet:</w:t>
+      </w:r>
+      <w:r>
+        <w:t xml:space="preserve"> </w:t>
+      </w:r>
+      <w:r>
+        <w:t xml:space="preserve">een collega van Mieke op school. Zij vindt het stukje vlees aan tafel</w:t>
+      </w:r>
+      <w:r>
+        <w:t xml:space="preserve"> </w:t>
+      </w:r>
+      <w:r>
+        <w:t xml:space="preserve">“</w:t>
+      </w:r>
+      <w:r>
+        <w:t xml:space="preserve">geen goed idee</w:t>
+      </w:r>
+      <w:r>
+        <w:t xml:space="preserve">”</w:t>
+      </w:r>
+      <w:r>
+        <w:t xml:space="preserve">.</w:t>
+      </w:r>
+    </w:p>
+    <w:p>
+      <w:pPr>
+        <w:numPr>
+          <w:ilvl w:val="0"/>
+          <w:numId w:val="1034"/>
+        </w:numPr>
+        <w:pStyle w:val="Compact"/>
+      </w:pPr>
+      <w:r>
+        <w:rPr>
+          <w:bCs/>
+          <w:b/>
+        </w:rPr>
+        <w:t xml:space="preserve">Paul:</w:t>
+      </w:r>
+      <w:r>
+        <w:t xml:space="preserve"> </w:t>
+      </w:r>
+      <w:r>
+        <w:t xml:space="preserve">Greets man, mager en stil, met lange armen.</w:t>
+      </w:r>
+    </w:p>
+    <w:bookmarkEnd w:id="102"/>
+    <w:bookmarkStart w:id="103" w:name="X7e44871bc355aa45702a1e82bfba99d12c1c2db"/>
+    <w:p>
+      <w:pPr>
+        <w:pStyle w:val="Heading2"/>
+      </w:pPr>
+      <w:r>
+        <w:t xml:space="preserve">De man met het brood en de postbodes (hoofdstuk 15)</w:t>
+      </w:r>
+    </w:p>
+    <w:p>
+      <w:pPr>
+        <w:numPr>
+          <w:ilvl w:val="0"/>
+          <w:numId w:val="1035"/>
+        </w:numPr>
+        <w:pStyle w:val="Compact"/>
+      </w:pPr>
+      <w:r>
+        <w:t xml:space="preserve">De man met het brood is bang voor honden. Na eenendertig wandelingen zegt hij</w:t>
+      </w:r>
+      <w:r>
+        <w:t xml:space="preserve"> </w:t>
+      </w:r>
+      <w:r>
+        <w:t xml:space="preserve">“</w:t>
+      </w:r>
+      <w:r>
+        <w:t xml:space="preserve">Dag, Tara</w:t>
+      </w:r>
+      <w:r>
+        <w:t xml:space="preserve">”</w:t>
+      </w:r>
+      <w:r>
+        <w:t xml:space="preserve">.</w:t>
+      </w:r>
+    </w:p>
+    <w:p>
+      <w:pPr>
+        <w:numPr>
+          <w:ilvl w:val="0"/>
+          <w:numId w:val="1035"/>
+        </w:numPr>
+        <w:pStyle w:val="Compact"/>
+      </w:pPr>
+      <w:r>
+        <w:t xml:space="preserve">De eerste postbode rook naar sigaretten en natte fietsbanden, de tweede naar nieuwe schoenen en pepermunt. Een derde wordt verwacht (dossier 89).</w:t>
+      </w:r>
+    </w:p>
+    <w:bookmarkEnd w:id="103"/>
+    <w:bookmarkStart w:id="104" w:name="het-park-in-westerlo-hoofdstuk-16"/>
+    <w:p>
+      <w:pPr>
+        <w:pStyle w:val="Heading2"/>
+      </w:pPr>
+      <w:r>
+        <w:t xml:space="preserve">Het park in Westerlo (hoofdstuk 16)</w:t>
+      </w:r>
+    </w:p>
+    <w:p>
+      <w:pPr>
+        <w:numPr>
+          <w:ilvl w:val="0"/>
+          <w:numId w:val="1036"/>
+        </w:numPr>
+        <w:pStyle w:val="Compact"/>
+      </w:pPr>
+      <w:r>
+        <w:t xml:space="preserve">Het kasteelpark in Westerlo heeft een vijver. Lode haalt er een papier met een stempel.</w:t>
+      </w:r>
+    </w:p>
+    <w:p>
+      <w:pPr>
+        <w:numPr>
+          <w:ilvl w:val="0"/>
+          <w:numId w:val="1036"/>
+        </w:numPr>
+        <w:pStyle w:val="Compact"/>
+      </w:pPr>
+      <w:r>
+        <w:t xml:space="preserve">De vreemde man heeft vroeger een Mechelse herder gehad, aan de ketting achter het huis.</w:t>
+      </w:r>
+    </w:p>
+    <w:bookmarkEnd w:id="104"/>
+    <w:bookmarkStart w:id="105" w:name="sofie-en-jonas-1"/>
+    <w:p>
+      <w:pPr>
+        <w:pStyle w:val="Heading2"/>
+      </w:pPr>
+      <w:r>
+        <w:t xml:space="preserve">Sofie en Jonas</w:t>
+      </w:r>
+    </w:p>
+    <w:p>
+      <w:pPr>
+        <w:numPr>
+          <w:ilvl w:val="0"/>
+          <w:numId w:val="1037"/>
+        </w:numPr>
+        <w:pStyle w:val="Compact"/>
+      </w:pPr>
+      <w:r>
+        <w:t xml:space="preserve">Sofie rijdt een kleine blauwe auto, later met een rammelend schildje onder de motor dat Jonas al jaren zou vastzetten.</w:t>
+      </w:r>
+    </w:p>
+    <w:p>
+      <w:pPr>
+        <w:numPr>
+          <w:ilvl w:val="0"/>
+          <w:numId w:val="1037"/>
+        </w:numPr>
+        <w:pStyle w:val="Compact"/>
+      </w:pPr>
+      <w:r>
+        <w:t xml:space="preserve">Achter Sofies huis in Herentals ligt een park langs de Nete, met populieren. Aan de derde struik vindt Tara het spoor van het zusje (hoofdstuk 18), en later niet meer (hoofdstuk 22).</w:t>
+      </w:r>
+    </w:p>
+    <w:p>
+      <w:pPr>
+        <w:numPr>
+          <w:ilvl w:val="0"/>
+          <w:numId w:val="1037"/>
+        </w:numPr>
+        <w:pStyle w:val="Compact"/>
+      </w:pPr>
+      <w:r>
+        <w:t xml:space="preserve">Het zusje heeft zelf pups gehad (hoofdstuk 18).</w:t>
+      </w:r>
+    </w:p>
+    <w:p>
+      <w:pPr>
+        <w:numPr>
+          <w:ilvl w:val="0"/>
+          <w:numId w:val="1037"/>
+        </w:numPr>
+        <w:pStyle w:val="Compact"/>
+      </w:pPr>
+      <w:r>
+        <w:t xml:space="preserve">De hond van Jonas’ ouders sliep op hun bed; ze probeerden het af te leren met een waterpistool.</w:t>
+      </w:r>
+    </w:p>
+    <w:bookmarkEnd w:id="105"/>
+    <w:bookmarkStart w:id="106" w:name="de-kleinkinderen"/>
+    <w:p>
+      <w:pPr>
+        <w:pStyle w:val="Heading2"/>
+      </w:pPr>
+      <w:r>
+        <w:t xml:space="preserve">De kleinkinderen</w:t>
+      </w:r>
+    </w:p>
+    <w:p>
+      <w:pPr>
+        <w:numPr>
+          <w:ilvl w:val="0"/>
+          <w:numId w:val="1038"/>
+        </w:numPr>
+        <w:pStyle w:val="Compact"/>
+      </w:pPr>
+      <w:r>
+        <w:rPr>
+          <w:bCs/>
+          <w:b/>
+        </w:rPr>
+        <w:t xml:space="preserve">Draagmanden:</w:t>
+      </w:r>
+      <w:r>
+        <w:t xml:space="preserve"> </w:t>
+      </w:r>
+      <w:r>
+        <w:t xml:space="preserve">Brams draagmand is grijs (hoofdstuk 9), die van Lotte blauw (hoofdstuk 17).</w:t>
+      </w:r>
+    </w:p>
+    <w:p>
+      <w:pPr>
+        <w:numPr>
+          <w:ilvl w:val="0"/>
+          <w:numId w:val="1038"/>
+        </w:numPr>
+        <w:pStyle w:val="Compact"/>
+      </w:pPr>
+      <w:r>
+        <w:rPr>
+          <w:bCs/>
+          <w:b/>
+        </w:rPr>
+        <w:t xml:space="preserve">Brams konijn:</w:t>
+      </w:r>
+      <w:r>
+        <w:t xml:space="preserve"> </w:t>
+      </w:r>
+      <w:r>
+        <w:t xml:space="preserve">een stoffen konijn met één oor. Tara bewaakt ook dat.</w:t>
+      </w:r>
+    </w:p>
+    <w:p>
+      <w:pPr>
+        <w:numPr>
+          <w:ilvl w:val="0"/>
+          <w:numId w:val="1038"/>
+        </w:numPr>
+        <w:pStyle w:val="Compact"/>
+      </w:pPr>
+      <w:r>
+        <w:rPr>
+          <w:bCs/>
+          <w:b/>
+        </w:rPr>
+        <w:t xml:space="preserve">Lode op woensdag:</w:t>
+      </w:r>
+      <w:r>
+        <w:t xml:space="preserve"> </w:t>
+      </w:r>
+      <w:r>
+        <w:t xml:space="preserve">Lode vraagt zijn woensdagnamiddagen vrij zodra Bram er is.</w:t>
+      </w:r>
+    </w:p>
+    <w:p>
+      <w:pPr>
+        <w:numPr>
+          <w:ilvl w:val="0"/>
+          <w:numId w:val="1038"/>
+        </w:numPr>
+        <w:pStyle w:val="Compact"/>
+      </w:pPr>
+      <w:r>
+        <w:rPr>
+          <w:bCs/>
+          <w:b/>
+        </w:rPr>
+        <w:t xml:space="preserve">Bram:</w:t>
+      </w:r>
+    </w:p>
+    <w:p>
+      <w:pPr>
+        <w:numPr>
+          <w:ilvl w:val="1"/>
+          <w:numId w:val="1039"/>
+        </w:numPr>
+        <w:pStyle w:val="Compact"/>
+      </w:pPr>
+      <w:r>
+        <w:t xml:space="preserve">voetbalt tegen de garagepoort en eet chips paprika;</w:t>
+      </w:r>
+    </w:p>
+    <w:p>
+      <w:pPr>
+        <w:numPr>
+          <w:ilvl w:val="1"/>
+          <w:numId w:val="1039"/>
+        </w:numPr>
+        <w:pStyle w:val="Compact"/>
+      </w:pPr>
+      <w:r>
+        <w:t xml:space="preserve">heeft een rapport rekenen van 55 op 100 en oefent met Lode met koekjes;</w:t>
+      </w:r>
+    </w:p>
+    <w:p>
+      <w:pPr>
+        <w:numPr>
+          <w:ilvl w:val="1"/>
+          <w:numId w:val="1039"/>
+        </w:numPr>
+        <w:pStyle w:val="Compact"/>
+      </w:pPr>
+      <w:r>
+        <w:t xml:space="preserve">schrijft voor school</w:t>
+      </w:r>
+      <w:r>
+        <w:t xml:space="preserve"> </w:t>
+      </w:r>
+      <w:r>
+        <w:t xml:space="preserve">“</w:t>
+      </w:r>
+      <w:r>
+        <w:t xml:space="preserve">ze heeft mij gekozen</w:t>
+      </w:r>
+      <w:r>
+        <w:t xml:space="preserve">”</w:t>
+      </w:r>
+      <w:r>
+        <w:t xml:space="preserve"> </w:t>
+      </w:r>
+      <w:r>
+        <w:t xml:space="preserve">in zijn schrift (hoofdstuk 23).</w:t>
+      </w:r>
+    </w:p>
+    <w:p>
+      <w:pPr>
+        <w:numPr>
+          <w:ilvl w:val="0"/>
+          <w:numId w:val="1038"/>
+        </w:numPr>
+        <w:pStyle w:val="Compact"/>
+      </w:pPr>
+      <w:r>
+        <w:rPr>
+          <w:bCs/>
+          <w:b/>
+        </w:rPr>
+        <w:t xml:space="preserve">Lotte:</w:t>
+      </w:r>
+    </w:p>
+    <w:p>
+      <w:pPr>
+        <w:numPr>
+          <w:ilvl w:val="1"/>
+          <w:numId w:val="1040"/>
+        </w:numPr>
+        <w:pStyle w:val="Compact"/>
+      </w:pPr>
+      <w:r>
+        <w:t xml:space="preserve">zet Tara haarspeldjes op en noemt haar een</w:t>
+      </w:r>
+      <w:r>
+        <w:t xml:space="preserve"> </w:t>
+      </w:r>
+      <w:r>
+        <w:t xml:space="preserve">“</w:t>
+      </w:r>
+      <w:r>
+        <w:t xml:space="preserve">Labrador-prinses</w:t>
+      </w:r>
+      <w:r>
+        <w:t xml:space="preserve">”</w:t>
+      </w:r>
+      <w:r>
+        <w:t xml:space="preserve">;</w:t>
+      </w:r>
+    </w:p>
+    <w:p>
+      <w:pPr>
+        <w:numPr>
+          <w:ilvl w:val="1"/>
+          <w:numId w:val="1040"/>
+        </w:numPr>
+        <w:pStyle w:val="Compact"/>
+      </w:pPr>
+      <w:r>
+        <w:t xml:space="preserve">leert fietsen met Lode (hoofdstuk 23).</w:t>
+      </w:r>
+    </w:p>
+    <w:bookmarkEnd w:id="106"/>
+    <w:bookmarkStart w:id="107" w:name="de-slaapkamer-hoofdstuk-18-en-21"/>
+    <w:p>
+      <w:pPr>
+        <w:pStyle w:val="Heading2"/>
+      </w:pPr>
+      <w:r>
+        <w:t xml:space="preserve">De slaapkamer (hoofdstuk 18 en 21)</w:t>
+      </w:r>
+    </w:p>
+    <w:p>
+      <w:pPr>
+        <w:numPr>
+          <w:ilvl w:val="0"/>
+          <w:numId w:val="1041"/>
+        </w:numPr>
+        <w:pStyle w:val="Compact"/>
+      </w:pPr>
+      <w:r>
+        <w:t xml:space="preserve">Op de overloop ligt een loper van grof touw.</w:t>
+      </w:r>
+    </w:p>
+    <w:p>
+      <w:pPr>
+        <w:numPr>
+          <w:ilvl w:val="0"/>
+          <w:numId w:val="1041"/>
+        </w:numPr>
+        <w:pStyle w:val="Compact"/>
+      </w:pPr>
+      <w:r>
+        <w:t xml:space="preserve">De slaapkamerdeur wordt opengehouden door een deurstopper: een zandzakje in de vorm van een kat.</w:t>
+      </w:r>
+    </w:p>
+    <w:p>
+      <w:pPr>
+        <w:numPr>
+          <w:ilvl w:val="0"/>
+          <w:numId w:val="1041"/>
+        </w:numPr>
+        <w:pStyle w:val="Compact"/>
+      </w:pPr>
+      <w:r>
+        <w:t xml:space="preserve">Op de drempel ligt een houten lat.</w:t>
+      </w:r>
+    </w:p>
+    <w:p>
+      <w:pPr>
+        <w:numPr>
+          <w:ilvl w:val="0"/>
+          <w:numId w:val="1041"/>
+        </w:numPr>
+        <w:pStyle w:val="Compact"/>
+      </w:pPr>
+      <w:r>
+        <w:t xml:space="preserve">Sofies oude kamer staat vol dozen en een strijkplank.</w:t>
+      </w:r>
+    </w:p>
+    <w:p>
+      <w:pPr>
+        <w:numPr>
+          <w:ilvl w:val="0"/>
+          <w:numId w:val="1041"/>
+        </w:numPr>
+        <w:pStyle w:val="Compact"/>
+      </w:pPr>
+      <w:r>
+        <w:t xml:space="preserve">Tijdens een onweersnacht zit Lode op de overloop met zijn rug tegen de muur.</w:t>
+      </w:r>
+    </w:p>
+    <w:bookmarkEnd w:id="107"/>
+    <w:bookmarkStart w:id="108" w:name="de-heide-en-de-boswachter"/>
+    <w:p>
+      <w:pPr>
+        <w:pStyle w:val="Heading2"/>
+      </w:pPr>
+      <w:r>
+        <w:t xml:space="preserve">De heide en de boswachter</w:t>
+      </w:r>
+    </w:p>
+    <w:p>
+      <w:pPr>
+        <w:numPr>
+          <w:ilvl w:val="0"/>
+          <w:numId w:val="1042"/>
+        </w:numPr>
+        <w:pStyle w:val="Compact"/>
+      </w:pPr>
+      <w:r>
+        <w:t xml:space="preserve">De heide heeft:</w:t>
+      </w:r>
+    </w:p>
+    <w:p>
+      <w:pPr>
+        <w:numPr>
+          <w:ilvl w:val="1"/>
+          <w:numId w:val="1043"/>
+        </w:numPr>
+        <w:pStyle w:val="Compact"/>
+      </w:pPr>
+      <w:r>
+        <w:t xml:space="preserve">een parking van zand met een houten paal en een bordje;</w:t>
+      </w:r>
+    </w:p>
+    <w:p>
+      <w:pPr>
+        <w:numPr>
+          <w:ilvl w:val="1"/>
+          <w:numId w:val="1043"/>
+        </w:numPr>
+        <w:pStyle w:val="Compact"/>
+      </w:pPr>
+      <w:r>
+        <w:t xml:space="preserve">een zandheuvel met kromme dennen voorbij het ven;</w:t>
+      </w:r>
+    </w:p>
+    <w:p>
+      <w:pPr>
+        <w:numPr>
+          <w:ilvl w:val="1"/>
+          <w:numId w:val="1043"/>
+        </w:numPr>
+        <w:pStyle w:val="Compact"/>
+      </w:pPr>
+      <w:r>
+        <w:t xml:space="preserve">brem, die voor Tara geel is;</w:t>
+      </w:r>
+    </w:p>
+    <w:p>
+      <w:pPr>
+        <w:numPr>
+          <w:ilvl w:val="1"/>
+          <w:numId w:val="1043"/>
+        </w:numPr>
+        <w:pStyle w:val="Compact"/>
+      </w:pPr>
+      <w:r>
+        <w:t xml:space="preserve">een oude den met een kromme voet, waar Tara altijd bleef staan (epiloog).</w:t>
+      </w:r>
+    </w:p>
+    <w:p>
+      <w:pPr>
+        <w:numPr>
+          <w:ilvl w:val="0"/>
+          <w:numId w:val="1042"/>
+        </w:numPr>
+        <w:pStyle w:val="Compact"/>
+      </w:pPr>
+      <w:r>
+        <w:t xml:space="preserve">De boswachter draagt groen en heeft twee eigen honden, een oude en een jonge. In hoofdstuk 22 is de oude weg en is er een nieuwe jonge. Hij noteert in een boekje met een harde kaft.</w:t>
+      </w:r>
+    </w:p>
+    <w:p>
+      <w:pPr>
+        <w:numPr>
+          <w:ilvl w:val="0"/>
+          <w:numId w:val="1042"/>
+        </w:numPr>
+        <w:pStyle w:val="Compact"/>
+      </w:pPr>
+      <w:r>
+        <w:t xml:space="preserve">Het reekalfje uit de open keuze is gebruikt in hoofdstuk 19 (Tara ruikt het, Lode niet). Open keuze 1 in sectie 17 van de bible kan dus dicht.</w:t>
+      </w:r>
+    </w:p>
+    <w:bookmarkEnd w:id="108"/>
+    <w:bookmarkStart w:id="109" w:name="lodes-gezondheid"/>
+    <w:p>
+      <w:pPr>
+        <w:pStyle w:val="Heading2"/>
+      </w:pPr>
+      <w:r>
+        <w:t xml:space="preserve">Lodes gezondheid</w:t>
+      </w:r>
+    </w:p>
+    <w:p>
+      <w:pPr>
+        <w:numPr>
+          <w:ilvl w:val="0"/>
+          <w:numId w:val="1044"/>
+        </w:numPr>
+        <w:pStyle w:val="Compact"/>
+      </w:pPr>
+      <w:r>
+        <w:t xml:space="preserve">De plek op Lodes rug zit op zijn linkerschouderblad. In de tuin draagt hij een marcelleke.</w:t>
+      </w:r>
+    </w:p>
+    <w:p>
+      <w:pPr>
+        <w:numPr>
+          <w:ilvl w:val="0"/>
+          <w:numId w:val="1044"/>
+        </w:numPr>
+        <w:pStyle w:val="Compact"/>
+      </w:pPr>
+      <w:r>
+        <w:t xml:space="preserve">Mieke stuurt hem naar de dokter met</w:t>
+      </w:r>
+      <w:r>
+        <w:t xml:space="preserve"> </w:t>
+      </w:r>
+      <w:r>
+        <w:t xml:space="preserve">“</w:t>
+      </w:r>
+      <w:r>
+        <w:t xml:space="preserve">Voor mij</w:t>
+      </w:r>
+      <w:r>
+        <w:t xml:space="preserve">”</w:t>
+      </w:r>
+      <w:r>
+        <w:t xml:space="preserve">. Het is iets kleins op de huid, en het is weggenomen.</w:t>
+      </w:r>
+    </w:p>
+    <w:p>
+      <w:pPr>
+        <w:numPr>
+          <w:ilvl w:val="0"/>
+          <w:numId w:val="1044"/>
+        </w:numPr>
+        <w:pStyle w:val="Compact"/>
+      </w:pPr>
+      <w:r>
+        <w:t xml:space="preserve">Bij zijn controle is zijn bloeddruk 130 op 80 (</w:t>
+      </w:r>
+      <w:r>
+        <w:t xml:space="preserve">“</w:t>
+      </w:r>
+      <w:r>
+        <w:t xml:space="preserve">Ik heb een hond</w:t>
+      </w:r>
+      <w:r>
+        <w:t xml:space="preserve">”</w:t>
+      </w:r>
+      <w:r>
+        <w:t xml:space="preserve">).</w:t>
+      </w:r>
+    </w:p>
+    <w:bookmarkEnd w:id="109"/>
+    <w:bookmarkStart w:id="110" w:name="mieke-later"/>
+    <w:p>
+      <w:pPr>
+        <w:pStyle w:val="Heading2"/>
+      </w:pPr>
+      <w:r>
+        <w:t xml:space="preserve">Mieke later</w:t>
+      </w:r>
+    </w:p>
+    <w:p>
+      <w:pPr>
+        <w:numPr>
+          <w:ilvl w:val="0"/>
+          <w:numId w:val="1045"/>
+        </w:numPr>
+        <w:pStyle w:val="Compact"/>
+      </w:pPr>
+      <w:r>
+        <w:t xml:space="preserve">Mieke is in Deel III met pensioen (</w:t>
+      </w:r>
+      <w:r>
+        <w:t xml:space="preserve">“</w:t>
+      </w:r>
+      <w:r>
+        <w:t xml:space="preserve">al een tijd niet meer voor een klas</w:t>
+      </w:r>
+      <w:r>
+        <w:t xml:space="preserve">”</w:t>
+      </w:r>
+      <w:r>
+        <w:t xml:space="preserve">).</w:t>
+      </w:r>
+    </w:p>
+    <w:p>
+      <w:pPr>
+        <w:numPr>
+          <w:ilvl w:val="0"/>
+          <w:numId w:val="1045"/>
+        </w:numPr>
+        <w:pStyle w:val="Compact"/>
+      </w:pPr>
+      <w:r>
+        <w:t xml:space="preserve">Ze rijdt zelf met de auto, onder meer naar de markt.</w:t>
+      </w:r>
+    </w:p>
+    <w:bookmarkEnd w:id="110"/>
+    <w:bookmarkStart w:id="111" w:name="nieuws"/>
+    <w:p>
+      <w:pPr>
+        <w:pStyle w:val="Heading2"/>
+      </w:pPr>
+      <w:r>
+        <w:t xml:space="preserve">Nieuws</w:t>
+      </w:r>
+    </w:p>
+    <w:p>
+      <w:pPr>
+        <w:numPr>
+          <w:ilvl w:val="0"/>
+          <w:numId w:val="1046"/>
+        </w:numPr>
+        <w:pStyle w:val="Compact"/>
+      </w:pPr>
+      <w:r>
+        <w:t xml:space="preserve">In Deel III hebben de wolven in de Kempen vijf jongen gekregen (Lode leest het voor).</w:t>
+      </w:r>
+    </w:p>
+    <w:bookmarkEnd w:id="111"/>
+    <w:bookmarkStart w:id="112" w:name="de-dierenartsen-en-de-kliniek"/>
+    <w:p>
+      <w:pPr>
+        <w:pStyle w:val="Heading2"/>
+      </w:pPr>
+      <w:r>
+        <w:t xml:space="preserve">De dierenartsen en de kliniek</w:t>
+      </w:r>
+    </w:p>
+    <w:p>
+      <w:pPr>
+        <w:numPr>
+          <w:ilvl w:val="0"/>
+          <w:numId w:val="1047"/>
+        </w:numPr>
+        <w:pStyle w:val="Compact"/>
+      </w:pPr>
+      <w:r>
+        <w:t xml:space="preserve">De dierenarts in het dorp is een man.</w:t>
+      </w:r>
+    </w:p>
+    <w:p>
+      <w:pPr>
+        <w:numPr>
+          <w:ilvl w:val="0"/>
+          <w:numId w:val="1047"/>
+        </w:numPr>
+        <w:pStyle w:val="Compact"/>
+      </w:pPr>
+      <w:r>
+        <w:t xml:space="preserve">De chirurgijn is een vrouw met kalme handen. Zij stelt ook de diagnose in hoofdstuk 24.</w:t>
+      </w:r>
+    </w:p>
+    <w:p>
+      <w:pPr>
+        <w:numPr>
+          <w:ilvl w:val="0"/>
+          <w:numId w:val="1047"/>
+        </w:numPr>
+        <w:pStyle w:val="Compact"/>
+      </w:pPr>
+      <w:r>
+        <w:t xml:space="preserve">De jonge dierenarts op de intensieve zorg is een vrouw, met haar haar in een elastiek en een pen in haar borstzakje.</w:t>
+      </w:r>
+    </w:p>
+    <w:p>
+      <w:pPr>
+        <w:numPr>
+          <w:ilvl w:val="0"/>
+          <w:numId w:val="1047"/>
+        </w:numPr>
+        <w:pStyle w:val="Compact"/>
+      </w:pPr>
+      <w:r>
+        <w:t xml:space="preserve">Er is een verpleegster die de bal uit Tara’s mond neemt en later de halsband brengt.</w:t>
+      </w:r>
+    </w:p>
+    <w:p>
+      <w:pPr>
+        <w:numPr>
+          <w:ilvl w:val="0"/>
+          <w:numId w:val="1047"/>
+        </w:numPr>
+        <w:pStyle w:val="Compact"/>
+      </w:pPr>
+      <w:r>
+        <w:t xml:space="preserve">De datum van de operatie hangt als papiertje met een rode cirkel op de koelkast.</w:t>
+      </w:r>
+    </w:p>
+    <w:bookmarkEnd w:id="112"/>
+    <w:bookmarkStart w:id="113" w:name="het-einde"/>
+    <w:p>
+      <w:pPr>
+        <w:pStyle w:val="Heading2"/>
+      </w:pPr>
+      <w:r>
+        <w:t xml:space="preserve">Het einde</w:t>
+      </w:r>
+    </w:p>
+    <w:p>
+      <w:pPr>
+        <w:numPr>
+          <w:ilvl w:val="0"/>
+          <w:numId w:val="1048"/>
+        </w:numPr>
+        <w:pStyle w:val="Compact"/>
+      </w:pPr>
+      <w:r>
+        <w:t xml:space="preserve">Hoofdstuk 26: Lode geeft Tara om acht uur af. De chirurgijn belt om tien over elf. Mira ligt de hele dag in de mand.</w:t>
+      </w:r>
+    </w:p>
+    <w:p>
+      <w:pPr>
+        <w:numPr>
+          <w:ilvl w:val="0"/>
+          <w:numId w:val="1048"/>
+        </w:numPr>
+        <w:pStyle w:val="Compact"/>
+      </w:pPr>
+      <w:r>
+        <w:t xml:space="preserve">Epiloog:</w:t>
+      </w:r>
+    </w:p>
+    <w:p>
+      <w:pPr>
+        <w:numPr>
+          <w:ilvl w:val="1"/>
+          <w:numId w:val="1049"/>
+        </w:numPr>
+        <w:pStyle w:val="Compact"/>
+      </w:pPr>
+      <w:r>
+        <w:t xml:space="preserve">het is vijf weken later;</w:t>
+      </w:r>
+    </w:p>
+    <w:p>
+      <w:pPr>
+        <w:numPr>
+          <w:ilvl w:val="1"/>
+          <w:numId w:val="1049"/>
+        </w:numPr>
+        <w:pStyle w:val="Compact"/>
+      </w:pPr>
+      <w:r>
+        <w:t xml:space="preserve">Lode wordt wakker om tien voor zeven;</w:t>
+      </w:r>
+    </w:p>
+    <w:p>
+      <w:pPr>
+        <w:numPr>
+          <w:ilvl w:val="1"/>
+          <w:numId w:val="1049"/>
+        </w:numPr>
+        <w:pStyle w:val="Compact"/>
+      </w:pPr>
+      <w:r>
+        <w:t xml:space="preserve">de halsband zit in zijn rechterjaszak;</w:t>
+      </w:r>
+    </w:p>
+    <w:p>
+      <w:pPr>
+        <w:numPr>
+          <w:ilvl w:val="1"/>
+          <w:numId w:val="1049"/>
+        </w:numPr>
+        <w:pStyle w:val="Compact"/>
+      </w:pPr>
+      <w:r>
+        <w:t xml:space="preserve">Miekes wollen deken ligt gewassen en gevouwen in de mand;</w:t>
+      </w:r>
+    </w:p>
+    <w:p>
+      <w:pPr>
+        <w:numPr>
+          <w:ilvl w:val="1"/>
+          <w:numId w:val="1049"/>
+        </w:numPr>
+        <w:pStyle w:val="Compact"/>
+      </w:pPr>
+      <w:r>
+        <w:t xml:space="preserve">de etensbak staat gewassen onder het aanrecht.</w:t>
+      </w:r>
+    </w:p>
+    <w:bookmarkEnd w:id="113"/>
+    <w:bookmarkStart w:id="114" w:name="rubrieken"/>
+    <w:p>
+      <w:pPr>
+        <w:pStyle w:val="Heading2"/>
+      </w:pPr>
+      <w:r>
+        <w:t xml:space="preserve">Rubrieken</w:t>
+      </w:r>
+    </w:p>
+    <w:p>
+      <w:pPr>
+        <w:numPr>
+          <w:ilvl w:val="0"/>
+          <w:numId w:val="1050"/>
+        </w:numPr>
+        <w:pStyle w:val="Compact"/>
+      </w:pPr>
+      <w:r>
+        <w:rPr>
+          <w:bCs/>
+          <w:b/>
+        </w:rPr>
+        <w:t xml:space="preserve">Labradorwet nr. 47</w:t>
+      </w:r>
+      <w:r>
+        <w:t xml:space="preserve"> </w:t>
+      </w:r>
+      <w:r>
+        <w:t xml:space="preserve">(hoofdstuk 23):</w:t>
+      </w:r>
+      <w:r>
+        <w:t xml:space="preserve"> </w:t>
+      </w:r>
+      <w:r>
+        <w:t xml:space="preserve">“</w:t>
+      </w:r>
+      <w:r>
+        <w:t xml:space="preserve">Wandel elke dag, in elk weer, ook als je stijf bent. Op den duur vergeet je waarom je ooit begonnen bent. Dat is het goede moment om door te gaan.</w:t>
+      </w:r>
+      <w:r>
+        <w:t xml:space="preserve">”</w:t>
+      </w:r>
+    </w:p>
+    <w:p>
+      <w:pPr>
+        <w:numPr>
+          <w:ilvl w:val="0"/>
+          <w:numId w:val="1050"/>
+        </w:numPr>
+        <w:pStyle w:val="Compact"/>
+      </w:pPr>
+      <w:r>
+        <w:rPr>
+          <w:bCs/>
+          <w:b/>
+        </w:rPr>
+        <w:t xml:space="preserve">Nieuwe of aangevulde dossierteksten</w:t>
+      </w:r>
+      <w:r>
+        <w:t xml:space="preserve"> </w:t>
+      </w:r>
+      <w:r>
+        <w:t xml:space="preserve">voor de bijlage:</w:t>
+      </w:r>
+    </w:p>
+    <w:p>
+      <w:pPr>
+        <w:numPr>
+          <w:ilvl w:val="1"/>
+          <w:numId w:val="1051"/>
+        </w:numPr>
+        <w:pStyle w:val="Compact"/>
+      </w:pPr>
+      <w:r>
+        <w:t xml:space="preserve">dossier 2 (</w:t>
+      </w:r>
+      <w:r>
+        <w:t xml:space="preserve">“</w:t>
+      </w:r>
+      <w:r>
+        <w:t xml:space="preserve">drie keer, voor het ontbijt</w:t>
+      </w:r>
+      <w:r>
+        <w:t xml:space="preserve">”</w:t>
+      </w:r>
+      <w:r>
+        <w:t xml:space="preserve">);</w:t>
+      </w:r>
+    </w:p>
+    <w:p>
+      <w:pPr>
+        <w:numPr>
+          <w:ilvl w:val="1"/>
+          <w:numId w:val="1051"/>
+        </w:numPr>
+        <w:pStyle w:val="Compact"/>
+      </w:pPr>
+      <w:r>
+        <w:t xml:space="preserve">dossier 41, Deel I (</w:t>
+      </w:r>
+      <w:r>
+        <w:t xml:space="preserve">“</w:t>
+      </w:r>
+      <w:r>
+        <w:t xml:space="preserve">Uitzondering: als er een pakje ligt</w:t>
+      </w:r>
+      <w:r>
+        <w:t xml:space="preserve">”</w:t>
+      </w:r>
+      <w:r>
+        <w:t xml:space="preserve">);</w:t>
+      </w:r>
+    </w:p>
+    <w:p>
+      <w:pPr>
+        <w:numPr>
+          <w:ilvl w:val="1"/>
+          <w:numId w:val="1051"/>
+        </w:numPr>
+        <w:pStyle w:val="Compact"/>
+      </w:pPr>
+      <w:r>
+        <w:t xml:space="preserve">dossier 41, Deel III (</w:t>
+      </w:r>
+      <w:r>
+        <w:t xml:space="preserve">“</w:t>
+      </w:r>
+      <w:r>
+        <w:t xml:space="preserve">Het gevaar is overgegaan</w:t>
+      </w:r>
+      <w:r>
+        <w:t xml:space="preserve">”</w:t>
+      </w:r>
+      <w:r>
+        <w:t xml:space="preserve">);</w:t>
+      </w:r>
+    </w:p>
+    <w:p>
+      <w:pPr>
+        <w:numPr>
+          <w:ilvl w:val="1"/>
+          <w:numId w:val="1051"/>
+        </w:numPr>
+        <w:pStyle w:val="Compact"/>
+      </w:pPr>
+      <w:r>
+        <w:t xml:space="preserve">dossier 64 (de testgroepen);</w:t>
+      </w:r>
+    </w:p>
+    <w:p>
+      <w:pPr>
+        <w:numPr>
+          <w:ilvl w:val="1"/>
+          <w:numId w:val="1051"/>
+        </w:numPr>
+        <w:pStyle w:val="Compact"/>
+      </w:pPr>
+      <w:r>
+        <w:t xml:space="preserve">dossier 72 (de blauwe bal);</w:t>
+      </w:r>
+    </w:p>
+    <w:p>
+      <w:pPr>
+        <w:numPr>
+          <w:ilvl w:val="1"/>
+          <w:numId w:val="1051"/>
+        </w:numPr>
+        <w:pStyle w:val="Compact"/>
+      </w:pPr>
+      <w:r>
+        <w:t xml:space="preserve">dossier 103 (de spiegel met de pantoffel);</w:t>
+      </w:r>
+    </w:p>
+    <w:p>
+      <w:pPr>
+        <w:numPr>
+          <w:ilvl w:val="1"/>
+          <w:numId w:val="1051"/>
+        </w:numPr>
+        <w:pStyle w:val="Compact"/>
+      </w:pPr>
+      <w:r>
+        <w:t xml:space="preserve">dossier 110.</w:t>
+      </w:r>
+    </w:p>
+    <w:bookmarkEnd w:id="114"/>
+    <w:bookmarkStart w:id="115" w:name="ritme-en-vaste-uitdrukkingen"/>
+    <w:p>
+      <w:pPr>
+        <w:pStyle w:val="Heading2"/>
+      </w:pPr>
+      <w:r>
+        <w:t xml:space="preserve">Ritme en vaste uitdrukkingen</w:t>
+      </w:r>
+    </w:p>
+    <w:p>
+      <w:pPr>
+        <w:numPr>
+          <w:ilvl w:val="0"/>
+          <w:numId w:val="1052"/>
+        </w:numPr>
+        <w:pStyle w:val="Compact"/>
+      </w:pPr>
+      <w:r>
+        <w:rPr>
+          <w:bCs/>
+          <w:b/>
+        </w:rPr>
+        <w:t xml:space="preserve">De trap:</w:t>
+      </w:r>
+      <w:r>
+        <w:t xml:space="preserve"> </w:t>
+      </w:r>
+      <w:r>
+        <w:t xml:space="preserve">veertien treden, de zevende piept, Lode zet zijn linkervoet eerst. Dit staat in de schrijfbrief, nog niet in de bible.</w:t>
+      </w:r>
+    </w:p>
+    <w:p>
+      <w:pPr>
+        <w:numPr>
+          <w:ilvl w:val="0"/>
+          <w:numId w:val="1052"/>
+        </w:numPr>
+        <w:pStyle w:val="Compact"/>
+      </w:pPr>
+      <w:r>
+        <w:rPr>
+          <w:bCs/>
+          <w:b/>
+        </w:rPr>
+        <w:t xml:space="preserve">“</w:t>
+      </w:r>
+      <w:r>
+        <w:rPr>
+          <w:bCs/>
+          <w:b/>
+        </w:rPr>
+        <w:t xml:space="preserve">Kinderdag</w:t>
+      </w:r>
+      <w:r>
+        <w:rPr>
+          <w:bCs/>
+          <w:b/>
+        </w:rPr>
+        <w:t xml:space="preserve">”</w:t>
+      </w:r>
+      <w:r>
+        <w:rPr>
+          <w:bCs/>
+          <w:b/>
+        </w:rPr>
+        <w:t xml:space="preserve">:</w:t>
+      </w:r>
+      <w:r>
+        <w:t xml:space="preserve"> </w:t>
+      </w:r>
+      <w:r>
+        <w:t xml:space="preserve">herkenbaar aan Sofies auto op de oprit, in de middag. Lode komt dan vroeger thuis.</w:t>
+      </w:r>
+    </w:p>
+    <w:p>
+      <w:pPr>
+        <w:numPr>
+          <w:ilvl w:val="0"/>
+          <w:numId w:val="1052"/>
+        </w:numPr>
+        <w:pStyle w:val="Compact"/>
+      </w:pPr>
+      <w:r>
+        <w:rPr>
+          <w:bCs/>
+          <w:b/>
+        </w:rPr>
+        <w:t xml:space="preserve">“</w:t>
+      </w:r>
+      <w:r>
+        <w:rPr>
+          <w:bCs/>
+          <w:b/>
+        </w:rPr>
+        <w:t xml:space="preserve">Ik had werk</w:t>
+      </w:r>
+      <w:r>
+        <w:rPr>
+          <w:bCs/>
+          <w:b/>
+        </w:rPr>
+        <w:t xml:space="preserve">”</w:t>
+      </w:r>
+      <w:r>
+        <w:rPr>
+          <w:bCs/>
+          <w:b/>
+        </w:rPr>
+        <w:t xml:space="preserve">:</w:t>
+      </w:r>
+      <w:r>
+        <w:t xml:space="preserve"> </w:t>
+      </w:r>
+      <w:r>
+        <w:t xml:space="preserve">Tara’s antwoord als Mieke zegt dat ze gerust mag gaan liggen (hoofdstuk 6 en 8).</w:t>
+      </w:r>
+    </w:p>
+    <w:bookmarkEnd w:id="115"/>
+    <w:bookmarkEnd w:id="116"/>
     <w:sectPr/>
   </w:body>
 </w:document>
@@ -12524,6 +14548,9 @@
     </w:lvlOverride>
   </w:num>
   <w:num w:numId="1022">
+    <w:abstractNumId w:val="991"/>
+  </w:num>
+  <w:num w:numId="1023">
     <w:abstractNumId w:val="99411"/>
     <w:lvlOverride w:ilvl="0">
       <w:startOverride w:val="1"/>
@@ -12553,38 +14580,92 @@
       <w:startOverride w:val="1"/>
     </w:lvlOverride>
   </w:num>
-  <w:num w:numId="1023">
+  <w:num w:numId="1024">
     <w:abstractNumId w:val="991"/>
   </w:num>
-  <w:num w:numId="1024">
-    <w:abstractNumId w:val="99411"/>
-    <w:lvlOverride w:ilvl="0">
-      <w:startOverride w:val="1"/>
-    </w:lvlOverride>
-    <w:lvlOverride w:ilvl="1">
-      <w:startOverride w:val="1"/>
-    </w:lvlOverride>
-    <w:lvlOverride w:ilvl="2">
-      <w:startOverride w:val="1"/>
-    </w:lvlOverride>
-    <w:lvlOverride w:ilvl="3">
-      <w:startOverride w:val="1"/>
-    </w:lvlOverride>
-    <w:lvlOverride w:ilvl="4">
-      <w:startOverride w:val="1"/>
-    </w:lvlOverride>
-    <w:lvlOverride w:ilvl="5">
-      <w:startOverride w:val="1"/>
-    </w:lvlOverride>
-    <w:lvlOverride w:ilvl="6">
-      <w:startOverride w:val="1"/>
-    </w:lvlOverride>
-    <w:lvlOverride w:ilvl="7">
-      <w:startOverride w:val="1"/>
-    </w:lvlOverride>
-    <w:lvlOverride w:ilvl="8">
-      <w:startOverride w:val="1"/>
-    </w:lvlOverride>
+  <w:num w:numId="1025">
+    <w:abstractNumId w:val="991"/>
+  </w:num>
+  <w:num w:numId="1026">
+    <w:abstractNumId w:val="991"/>
+  </w:num>
+  <w:num w:numId="1027">
+    <w:abstractNumId w:val="991"/>
+  </w:num>
+  <w:num w:numId="1028">
+    <w:abstractNumId w:val="991"/>
+  </w:num>
+  <w:num w:numId="1029">
+    <w:abstractNumId w:val="991"/>
+  </w:num>
+  <w:num w:numId="1030">
+    <w:abstractNumId w:val="991"/>
+  </w:num>
+  <w:num w:numId="1031">
+    <w:abstractNumId w:val="991"/>
+  </w:num>
+  <w:num w:numId="1032">
+    <w:abstractNumId w:val="991"/>
+  </w:num>
+  <w:num w:numId="1033">
+    <w:abstractNumId w:val="991"/>
+  </w:num>
+  <w:num w:numId="1034">
+    <w:abstractNumId w:val="991"/>
+  </w:num>
+  <w:num w:numId="1035">
+    <w:abstractNumId w:val="991"/>
+  </w:num>
+  <w:num w:numId="1036">
+    <w:abstractNumId w:val="991"/>
+  </w:num>
+  <w:num w:numId="1037">
+    <w:abstractNumId w:val="991"/>
+  </w:num>
+  <w:num w:numId="1038">
+    <w:abstractNumId w:val="991"/>
+  </w:num>
+  <w:num w:numId="1039">
+    <w:abstractNumId w:val="991"/>
+  </w:num>
+  <w:num w:numId="1040">
+    <w:abstractNumId w:val="991"/>
+  </w:num>
+  <w:num w:numId="1041">
+    <w:abstractNumId w:val="991"/>
+  </w:num>
+  <w:num w:numId="1042">
+    <w:abstractNumId w:val="991"/>
+  </w:num>
+  <w:num w:numId="1043">
+    <w:abstractNumId w:val="991"/>
+  </w:num>
+  <w:num w:numId="1044">
+    <w:abstractNumId w:val="991"/>
+  </w:num>
+  <w:num w:numId="1045">
+    <w:abstractNumId w:val="991"/>
+  </w:num>
+  <w:num w:numId="1046">
+    <w:abstractNumId w:val="991"/>
+  </w:num>
+  <w:num w:numId="1047">
+    <w:abstractNumId w:val="991"/>
+  </w:num>
+  <w:num w:numId="1048">
+    <w:abstractNumId w:val="991"/>
+  </w:num>
+  <w:num w:numId="1049">
+    <w:abstractNumId w:val="991"/>
+  </w:num>
+  <w:num w:numId="1050">
+    <w:abstractNumId w:val="991"/>
+  </w:num>
+  <w:num w:numId="1051">
+    <w:abstractNumId w:val="991"/>
+  </w:num>
+  <w:num w:numId="1052">
+    <w:abstractNumId w:val="991"/>
   </w:num>
 </w:numbering>
 </file>

</xml_diff>

<commit_message>
Tara, een Hondenleven: manuscript v2
Nieuw hoofdstuk 13 (Het Water), communicatie in 18 en 19, muizengif in 25,
twijfel in 27, uitgebreide epiloog, tweede continuïteitsronde en story
bible v7 bijgewerkt.

Co-Authored-By: Claude Opus 5.5 <noreply@anthropic.com>
Claude-Session: https://claude.ai/code/session_011xXeHb7kuJsamVtPUp8TTz
</commit_message>
<xml_diff>
--- a/tara-een-hondenleven/story-bible/Story_Bible_Tara_een_Hondenleven.docx
+++ b/tara-een-hondenleven/story-bible/Story_Bible_Tara_een_Hondenleven.docx
@@ -45,7 +45,7 @@
         <w:t xml:space="preserve"> </w:t>
       </w:r>
       <w:r>
-        <w:t xml:space="preserve">6</w:t>
+        <w:t xml:space="preserve">7</w:t>
       </w:r>
       <w:r>
         <w:t xml:space="preserve"> </w:t>
@@ -1040,7 +1040,7 @@
               <w:jc w:val="left"/>
             </w:pPr>
             <w:r>
-              <w:t xml:space="preserve">10 tot 18</w:t>
+              <w:t xml:space="preserve">10 tot 19</w:t>
             </w:r>
           </w:p>
         </w:tc>
@@ -1064,19 +1064,19 @@
               <w:jc w:val="left"/>
             </w:pPr>
             <w:r>
-              <w:t xml:space="preserve">19.800</w:t>
-            </w:r>
-          </w:p>
-        </w:tc>
-        <w:tc>
-          <w:tcPr/>
-          <w:p>
-            <w:pPr>
-              <w:pStyle w:val="Compact"/>
-              <w:jc w:val="left"/>
-            </w:pPr>
-            <w:r>
-              <w:t xml:space="preserve">73</w:t>
+              <w:t xml:space="preserve">22.000</w:t>
+            </w:r>
+          </w:p>
+        </w:tc>
+        <w:tc>
+          <w:tcPr/>
+          <w:p>
+            <w:pPr>
+              <w:pStyle w:val="Compact"/>
+              <w:jc w:val="left"/>
+            </w:pPr>
+            <w:r>
+              <w:t xml:space="preserve">81</w:t>
             </w:r>
           </w:p>
         </w:tc>
@@ -1102,7 +1102,7 @@
               <w:jc w:val="left"/>
             </w:pPr>
             <w:r>
-              <w:t xml:space="preserve">19 tot 24</w:t>
+              <w:t xml:space="preserve">20 tot 25</w:t>
             </w:r>
           </w:p>
         </w:tc>
@@ -1164,7 +1164,7 @@
               <w:jc w:val="left"/>
             </w:pPr>
             <w:r>
-              <w:t xml:space="preserve">25 en 26</w:t>
+              <w:t xml:space="preserve">26 en 27</w:t>
             </w:r>
           </w:p>
         </w:tc>
@@ -1346,7 +1346,7 @@
               <w:jc w:val="left"/>
             </w:pPr>
             <w:r>
-              <w:t xml:space="preserve">26 hoofdstukken</w:t>
+              <w:t xml:space="preserve">27 hoofdstukken</w:t>
             </w:r>
           </w:p>
         </w:tc>
@@ -1397,7 +1397,7 @@
         <w:pStyle w:val="BodyText"/>
       </w:pPr>
       <w:r>
-        <w:t xml:space="preserve">De marge ligt tussen 180 en 220 bladzijden. Het einde (hoofdstuk 25 en 26) is bewust kort. Verdriet leest beter in weinig woorden.</w:t>
+        <w:t xml:space="preserve">De marge ligt tussen 180 en 220 bladzijden. Het einde (hoofdstuk 26 en 27) is bewust kort. Verdriet leest beter in weinig woorden.</w:t>
       </w:r>
     </w:p>
     <w:bookmarkEnd w:id="26"/>
@@ -1574,7 +1574,7 @@
         <w:t xml:space="preserve"> </w:t>
       </w:r>
       <w:r>
-        <w:t xml:space="preserve">De enige uitzondering is de proloog, die in de laatste mist speelt (zie hoofdstuk 25).</w:t>
+        <w:t xml:space="preserve">De enige uitzondering is de proloog, die in de laatste mist speelt (zie hoofdstuk 26).</w:t>
       </w:r>
     </w:p>
     <w:p>
@@ -1767,7 +1767,7 @@
         <w:t xml:space="preserve"> </w:t>
       </w:r>
       <w:r>
-        <w:t xml:space="preserve">Het hele boek wordt door Tara verteld, op één hoofdstuk na. Hoofdstuk 26 is het enige deel in Lodes stem, omdat Tara het niet meer kan vertellen. Het staat in het boek als</w:t>
+        <w:t xml:space="preserve">Het hele boek wordt door Tara verteld, op één hoofdstuk na. Hoofdstuk 27 is het enige deel in Lodes stem, omdat Tara het niet meer kan vertellen. Het staat in het boek als</w:t>
       </w:r>
       <w:r>
         <w:t xml:space="preserve"> </w:t>
@@ -2087,7 +2087,7 @@
               <w:jc w:val="left"/>
             </w:pPr>
             <w:r>
-              <w:t xml:space="preserve">14. De Dronken Gast</w:t>
+              <w:t xml:space="preserve">15. De Dronken Gast</w:t>
             </w:r>
           </w:p>
         </w:tc>
@@ -2125,7 +2125,7 @@
               <w:jc w:val="left"/>
             </w:pPr>
             <w:r>
-              <w:t xml:space="preserve">21. De Plek op Zijn Rug</w:t>
+              <w:t xml:space="preserve">22. De Plek op Zijn Rug</w:t>
             </w:r>
           </w:p>
         </w:tc>
@@ -2163,7 +2163,7 @@
               <w:jc w:val="left"/>
             </w:pPr>
             <w:r>
-              <w:t xml:space="preserve">24. De Neus Die Zweeg</w:t>
+              <w:t xml:space="preserve">25. De Neus Die Zweeg</w:t>
             </w:r>
           </w:p>
         </w:tc>
@@ -2201,7 +2201,7 @@
               <w:jc w:val="left"/>
             </w:pPr>
             <w:r>
-              <w:t xml:space="preserve">25. De Laatste Avond</w:t>
+              <w:t xml:space="preserve">26. De Laatste Avond</w:t>
             </w:r>
           </w:p>
         </w:tc>
@@ -2239,7 +2239,7 @@
               <w:jc w:val="left"/>
             </w:pPr>
             <w:r>
-              <w:t xml:space="preserve">26. Laatste Observatie</w:t>
+              <w:t xml:space="preserve">27. Laatste Observatie</w:t>
             </w:r>
           </w:p>
         </w:tc>
@@ -3001,7 +3001,7 @@
               <w:jc w:val="left"/>
             </w:pPr>
             <w:r>
-              <w:t xml:space="preserve">13</w:t>
+              <w:t xml:space="preserve">14</w:t>
             </w:r>
           </w:p>
         </w:tc>
@@ -3051,7 +3051,7 @@
               <w:jc w:val="left"/>
             </w:pPr>
             <w:r>
-              <w:t xml:space="preserve">16</w:t>
+              <w:t xml:space="preserve">17</w:t>
             </w:r>
           </w:p>
         </w:tc>
@@ -3101,7 +3101,7 @@
               <w:jc w:val="left"/>
             </w:pPr>
             <w:r>
-              <w:t xml:space="preserve">18</w:t>
+              <w:t xml:space="preserve">19</w:t>
             </w:r>
           </w:p>
         </w:tc>
@@ -3139,7 +3139,7 @@
               <w:jc w:val="left"/>
             </w:pPr>
             <w:r>
-              <w:t xml:space="preserve">19</w:t>
+              <w:t xml:space="preserve">20</w:t>
             </w:r>
           </w:p>
         </w:tc>
@@ -3177,7 +3177,7 @@
               <w:jc w:val="left"/>
             </w:pPr>
             <w:r>
-              <w:t xml:space="preserve">23</w:t>
+              <w:t xml:space="preserve">24</w:t>
             </w:r>
           </w:p>
         </w:tc>
@@ -3215,7 +3215,7 @@
               <w:jc w:val="left"/>
             </w:pPr>
             <w:r>
-              <w:t xml:space="preserve">26</w:t>
+              <w:t xml:space="preserve">27</w:t>
             </w:r>
           </w:p>
         </w:tc>
@@ -3383,7 +3383,7 @@
         <w:t xml:space="preserve">”</w:t>
       </w:r>
       <w:r>
-        <w:t xml:space="preserve">. Dat is een karaktertrek, geen les van het boek. Tara noteert het als feit over haar proefpersoon. Hoofdstuk 19 brengt de botsing met de boswachter (zie sectie 9).</w:t>
+        <w:t xml:space="preserve">. Dat is een karaktertrek, geen les van het boek. Tara noteert het als feit over haar proefpersoon. Hoofdstuk 20 brengt de botsing met de boswachter (zie sectie 9).</w:t>
       </w:r>
     </w:p>
     <w:p>
@@ -4217,7 +4217,7 @@
               <w:jc w:val="left"/>
             </w:pPr>
             <w:r>
-              <w:t xml:space="preserve">10 tot 18</w:t>
+              <w:t xml:space="preserve">10 tot 19</w:t>
             </w:r>
           </w:p>
         </w:tc>
@@ -4267,7 +4267,7 @@
               <w:jc w:val="left"/>
             </w:pPr>
             <w:r>
-              <w:t xml:space="preserve">19</w:t>
+              <w:t xml:space="preserve">20</w:t>
             </w:r>
           </w:p>
         </w:tc>
@@ -4317,7 +4317,7 @@
               <w:jc w:val="left"/>
             </w:pPr>
             <w:r>
-              <w:t xml:space="preserve">20, 21</w:t>
+              <w:t xml:space="preserve">21, 22</w:t>
             </w:r>
           </w:p>
         </w:tc>
@@ -4367,7 +4367,7 @@
               <w:jc w:val="left"/>
             </w:pPr>
             <w:r>
-              <w:t xml:space="preserve">22, 23</w:t>
+              <w:t xml:space="preserve">23, 24</w:t>
             </w:r>
           </w:p>
         </w:tc>
@@ -4417,7 +4417,7 @@
               <w:jc w:val="left"/>
             </w:pPr>
             <w:r>
-              <w:t xml:space="preserve">24</w:t>
+              <w:t xml:space="preserve">25</w:t>
             </w:r>
           </w:p>
         </w:tc>
@@ -4467,7 +4467,7 @@
               <w:jc w:val="left"/>
             </w:pPr>
             <w:r>
-              <w:t xml:space="preserve">25, 26</w:t>
+              <w:t xml:space="preserve">26, 27</w:t>
             </w:r>
           </w:p>
         </w:tc>
@@ -4644,7 +4644,7 @@
               <w:jc w:val="left"/>
             </w:pPr>
             <w:r>
-              <w:t xml:space="preserve">Proloog en hoofdstuk 25: de geur komt terug in de mist</w:t>
+              <w:t xml:space="preserve">Proloog en hoofdstuk 26: de geur komt terug in de mist</w:t>
             </w:r>
           </w:p>
         </w:tc>
@@ -4690,7 +4690,7 @@
               <w:jc w:val="left"/>
             </w:pPr>
             <w:r>
-              <w:t xml:space="preserve">Hoofdstuk 25: in de mist na de operatie is er weer alleen warmte, aanraking en één geur. Het leven eindigt zoals het begon.</w:t>
+              <w:t xml:space="preserve">Hoofdstuk 26: in de mist na de operatie is er weer alleen warmte, aanraking en één geur. Het leven eindigt zoals het begon.</w:t>
             </w:r>
           </w:p>
         </w:tc>
@@ -4740,7 +4740,7 @@
               <w:jc w:val="left"/>
             </w:pPr>
             <w:r>
-              <w:t xml:space="preserve">Hoofdstuk 26: bij het tweede bezoek legt Lode zijn hand door de spijlen van het hok op de intensieve zorg, net als die eerste nacht</w:t>
+              <w:t xml:space="preserve">Hoofdstuk 27: bij het tweede bezoek legt Lode zijn hand door de spijlen van het hok op de intensieve zorg, net als die eerste nacht</w:t>
             </w:r>
           </w:p>
         </w:tc>
@@ -4840,7 +4840,7 @@
               <w:jc w:val="left"/>
             </w:pPr>
             <w:r>
-              <w:t xml:space="preserve">Hoofdstuk 22: de klok loopt achter. Hoofdstuk 24: zonder neus is er geen klok meer</w:t>
+              <w:t xml:space="preserve">Hoofdstuk 23: de klok loopt achter. Hoofdstuk 25: zonder neus is er geen klok meer</w:t>
             </w:r>
           </w:p>
         </w:tc>
@@ -4878,19 +4878,19 @@
               <w:jc w:val="left"/>
             </w:pPr>
             <w:r>
-              <w:t xml:space="preserve">Hoofdstuk 17 en 18</w:t>
-            </w:r>
-          </w:p>
-        </w:tc>
-        <w:tc>
-          <w:tcPr/>
-          <w:p>
-            <w:pPr>
-              <w:pStyle w:val="Compact"/>
-              <w:jc w:val="left"/>
-            </w:pPr>
-            <w:r>
-              <w:t xml:space="preserve">Hoofdstuk 21: Tara ruikt een ziekte bij Lode. Hoofdstuk 24: haar eigen ziekte zit precies in dat instrument</w:t>
+              <w:t xml:space="preserve">Hoofdstuk 18 en 19</w:t>
+            </w:r>
+          </w:p>
+        </w:tc>
+        <w:tc>
+          <w:tcPr/>
+          <w:p>
+            <w:pPr>
+              <w:pStyle w:val="Compact"/>
+              <w:jc w:val="left"/>
+            </w:pPr>
+            <w:r>
+              <w:t xml:space="preserve">Hoofdstuk 22: Tara ruikt een ziekte bij Lode. Hoofdstuk 25: haar eigen ziekte zit precies in dat instrument</w:t>
             </w:r>
           </w:p>
         </w:tc>
@@ -4940,7 +4940,7 @@
               <w:jc w:val="left"/>
             </w:pPr>
             <w:r>
-              <w:t xml:space="preserve">Hoofdstuk 26: in de wachtzaal van de kliniek ligt een krant; Lode raakt hem niet aan</w:t>
+              <w:t xml:space="preserve">Hoofdstuk 27: in de wachtzaal van de kliniek ligt een krant; Lode raakt hem niet aan</w:t>
             </w:r>
           </w:p>
         </w:tc>
@@ -4966,7 +4966,7 @@
               <w:jc w:val="left"/>
             </w:pPr>
             <w:r>
-              <w:t xml:space="preserve">Hoofdstuk 13: het laatste stukje van zijn bord</w:t>
+              <w:t xml:space="preserve">Hoofdstuk 14: het laatste stukje van zijn bord</w:t>
             </w:r>
           </w:p>
         </w:tc>
@@ -4990,7 +4990,7 @@
               <w:jc w:val="left"/>
             </w:pPr>
             <w:r>
-              <w:t xml:space="preserve">Hoofdstuk 25: Tara wil niet meer eten; Lode legt het stukje toch naast haar neus</w:t>
+              <w:t xml:space="preserve">Hoofdstuk 26: Tara wil niet meer eten; Lode legt het stukje toch naast haar neus</w:t>
             </w:r>
           </w:p>
         </w:tc>
@@ -5040,7 +5040,7 @@
               <w:jc w:val="left"/>
             </w:pPr>
             <w:r>
-              <w:t xml:space="preserve">Hoofdstuk 23:</w:t>
+              <w:t xml:space="preserve">Hoofdstuk 24:</w:t>
             </w:r>
             <w:r>
               <w:t xml:space="preserve"> </w:t>
@@ -5158,7 +5158,7 @@
               <w:jc w:val="left"/>
             </w:pPr>
             <w:r>
-              <w:t xml:space="preserve">Hoofdstuk 26: de halsband zit in zijn jaszak als hij naar buiten komt. Epiloog: de lijn hangt nog aan de kapstok</w:t>
+              <w:t xml:space="preserve">Hoofdstuk 27: de halsband zit in zijn jaszak als hij naar buiten komt. Epiloog: de lijn hangt nog aan de kapstok</w:t>
             </w:r>
           </w:p>
         </w:tc>
@@ -5208,7 +5208,7 @@
               <w:jc w:val="left"/>
             </w:pPr>
             <w:r>
-              <w:t xml:space="preserve">Hoofdstuk 25: Mira slaapt de laatste avond tegen Tara aan. Epiloog: Mira ligt in de lege mand</w:t>
+              <w:t xml:space="preserve">Hoofdstuk 26: Mira slaapt de laatste avond tegen Tara aan. Epiloog: Mira ligt in de lege mand</w:t>
             </w:r>
           </w:p>
         </w:tc>
@@ -5258,7 +5258,7 @@
               <w:jc w:val="left"/>
             </w:pPr>
             <w:r>
-              <w:t xml:space="preserve">Hoofdstuk 25: de ochtend van de operatie moet ze nuchter blijven en krijgt ze geen eten. Ze zingt toch, zacht, met de rode bal in haar bek. In de kliniek neemt een verpleegkundige de bal uit haar mond, en het lied stopt. Epiloog: Lode wordt elke ochtend wakker op het uur van het lied</w:t>
+              <w:t xml:space="preserve">Hoofdstuk 26: de ochtend van de operatie moet ze nuchter blijven en krijgt ze geen eten. Ze zingt toch, zacht, met de rode bal in haar bek. In de kliniek neemt een verpleegkundige de bal uit haar mond, en het lied stopt. Epiloog: Lode wordt elke ochtend wakker op het uur van het lied</w:t>
             </w:r>
           </w:p>
         </w:tc>
@@ -5308,7 +5308,7 @@
               <w:jc w:val="left"/>
             </w:pPr>
             <w:r>
-              <w:t xml:space="preserve">Hoofdstuk 25: de laatste avond neemt ze de bal nog mee naar de mand. Hoofdstuk 26: Lode legt de bal bij haar snuit in het hok; ze neemt hem niet. Epiloog: de bal ligt in de lege mand, met Mira ernaast</w:t>
+              <w:t xml:space="preserve">Hoofdstuk 26: de laatste avond neemt ze de bal nog mee naar de mand. Hoofdstuk 27: Lode legt de bal bij haar snuit in het hok; ze neemt hem niet. Epiloog: de bal ligt in de lege mand, met Mira ernaast</w:t>
             </w:r>
           </w:p>
         </w:tc>
@@ -5358,7 +5358,7 @@
               <w:jc w:val="left"/>
             </w:pPr>
             <w:r>
-              <w:t xml:space="preserve">Hoofdstuk 26: de bal komt mee naar huis in Lodes jaszak, samen met de halsband. Epiloog: terug in de mand</w:t>
+              <w:t xml:space="preserve">Hoofdstuk 27: de bal komt mee naar huis in Lodes jaszak, samen met de halsband. Epiloog: terug in de mand</w:t>
             </w:r>
           </w:p>
         </w:tc>
@@ -5408,7 +5408,7 @@
               <w:jc w:val="left"/>
             </w:pPr>
             <w:r>
-              <w:t xml:space="preserve">Hoofdstuk 25: in de mist is dat de enige geur die nog doorkomt</w:t>
+              <w:t xml:space="preserve">Hoofdstuk 26: in de mist is dat de enige geur die nog doorkomt</w:t>
             </w:r>
           </w:p>
         </w:tc>
@@ -5504,7 +5504,7 @@
               <w:jc w:val="left"/>
             </w:pPr>
             <w:r>
-              <w:t xml:space="preserve">Hoofdstuk 25: de laatste notitie die Tara nog maakt</w:t>
+              <w:t xml:space="preserve">Hoofdstuk 26: de laatste notitie die Tara nog maakt</w:t>
             </w:r>
           </w:p>
         </w:tc>
@@ -5737,7 +5737,7 @@
           <w:bCs/>
           <w:b/>
         </w:rPr>
-        <w:t xml:space="preserve">De heide en het bos (hoofdstuk 19, 22, epiloog).</w:t>
+        <w:t xml:space="preserve">De heide en het bos (hoofdstuk 20, 23, epiloog).</w:t>
       </w:r>
       <w:r>
         <w:t xml:space="preserve"> </w:t>
@@ -5773,7 +5773,7 @@
           <w:bCs/>
           <w:b/>
         </w:rPr>
-        <w:t xml:space="preserve">De specialistische dierenkliniek (hoofdstuk 25 en 26).</w:t>
+        <w:t xml:space="preserve">De specialistische dierenkliniek (hoofdstuk 26 en 27).</w:t>
       </w:r>
       <w:r>
         <w:t xml:space="preserve"> </w:t>
@@ -5879,7 +5879,7 @@
           <w:bCs/>
           <w:b/>
         </w:rPr>
-        <w:t xml:space="preserve">De houtkachel in de laatste winter (hoofdstuk 25).</w:t>
+        <w:t xml:space="preserve">De houtkachel in de laatste winter (hoofdstuk 26).</w:t>
       </w:r>
       <w:r>
         <w:t xml:space="preserve"> </w:t>
@@ -5912,7 +5912,7 @@
         <w:pStyle w:val="FirstParagraph"/>
       </w:pPr>
       <w:r>
-        <w:t xml:space="preserve">Een donkere, warme plek. Er is geen beeld en geen geluid, alleen warmte, een zachte druk tegen de flank, en een geur van melk en droog stro. De lezer denkt aan een nest. Pas in hoofdstuk 25 blijkt waar dit is: de mist na de operatie. Tara’s hele leven komt van daaruit nog één keer terug. (Ongeveer 600 woorden, kort en zintuiglijk, in de tegenwoordige tijd.)</w:t>
+        <w:t xml:space="preserve">Een donkere, warme plek. Er is geen beeld en geen geluid, alleen warmte, een zachte druk tegen de flank, en een geur van melk en droog stro. De lezer denkt aan een nest. Pas in hoofdstuk 26 blijkt waar dit is: de mist na de operatie. Tara’s hele leven komt van daaruit nog één keer terug. (Ongeveer 600 woorden, kort en zintuiglijk, in de tegenwoordige tijd.)</w:t>
       </w:r>
     </w:p>
     <w:bookmarkEnd w:id="42"/>
@@ -6344,58 +6344,7 @@
           <w:bCs/>
           <w:b/>
         </w:rPr>
-        <w:t xml:space="preserve">Hoofdstuk 13. Het Etentje.</w:t>
-      </w:r>
-      <w:r>
-        <w:t xml:space="preserve"> </w:t>
-      </w:r>
-      <w:r>
-        <w:t xml:space="preserve">Bestek, gesprekstechniek, en de wet van het gevallen eten. Na het dessert krijgt Tara het laatste stukje vlees van Lodes bord. Een gast vindt dat</w:t>
-      </w:r>
-      <w:r>
-        <w:t xml:space="preserve"> </w:t>
-      </w:r>
-      <w:r>
-        <w:t xml:space="preserve">“</w:t>
-      </w:r>
-      <w:r>
-        <w:t xml:space="preserve">geen goed idee</w:t>
-      </w:r>
-      <w:r>
-        <w:t xml:space="preserve">”</w:t>
-      </w:r>
-      <w:r>
-        <w:t xml:space="preserve">; Lode legt het principe van de roedel uit. Tara’s honger vertekent haar waarneming.</w:t>
-      </w:r>
-    </w:p>
-    <w:p>
-      <w:pPr>
-        <w:pStyle w:val="BodyText"/>
-      </w:pPr>
-      <w:r>
-        <w:rPr>
-          <w:bCs/>
-          <w:b/>
-        </w:rPr>
-        <w:t xml:space="preserve">Hoofdstuk 14. De Dronken Gast.</w:t>
-      </w:r>
-      <w:r>
-        <w:t xml:space="preserve"> </w:t>
-      </w:r>
-      <w:r>
-        <w:t xml:space="preserve">Dezelfde avond. De gast wil Tara leren dansen. Het schema loopt vast.</w:t>
-      </w:r>
-    </w:p>
-    <w:p>
-      <w:pPr>
-        <w:pStyle w:val="BodyText"/>
-      </w:pPr>
-      <w:r>
-        <w:rPr>
-          <w:bCs/>
-          <w:b/>
-        </w:rPr>
-        <w:t xml:space="preserve">Hoofdstuk 15. De Angst voor Honden.</w:t>
+        <w:t xml:space="preserve">Hoofdstuk 13. Het Water (nieuw in versie 7).</w:t>
       </w:r>
       <w:r>
         <w:t xml:space="preserve"> </w:t>
@@ -6405,6 +6354,142 @@
           <w:iCs/>
           <w:i/>
         </w:rPr>
+        <w:t xml:space="preserve">Dogtime.</w:t>
+      </w:r>
+      <w:r>
+        <w:t xml:space="preserve"> </w:t>
+      </w:r>
+      <w:r>
+        <w:t xml:space="preserve">Tara op haar sterkst, drie à vier jaar.</w:t>
+      </w:r>
+      <w:r>
+        <w:t xml:space="preserve"> </w:t>
+      </w:r>
+      <w:r>
+        <w:t xml:space="preserve">- Plonsjes in het ven en in de Nete; Lode gooit een tak in het water en Tara haalt hem terug.</w:t>
+      </w:r>
+      <w:r>
+        <w:t xml:space="preserve"> </w:t>
+      </w:r>
+      <w:r>
+        <w:t xml:space="preserve">-</w:t>
+      </w:r>
+      <w:r>
+        <w:t xml:space="preserve"> </w:t>
+      </w:r>
+      <w:r>
+        <w:t xml:space="preserve">“</w:t>
+      </w:r>
+      <w:r>
+        <w:t xml:space="preserve">Zoek een stok</w:t>
+      </w:r>
+      <w:r>
+        <w:t xml:space="preserve">”</w:t>
+      </w:r>
+      <w:r>
+        <w:t xml:space="preserve">: Tara zoekt plichtsbewust, en als er geen stok is, begint ze een jong boompje uit te rukken.</w:t>
+      </w:r>
+      <w:r>
+        <w:t xml:space="preserve"> </w:t>
+      </w:r>
+      <w:r>
+        <w:t xml:space="preserve">- Met dorst loopt ze van ver recht naar het water. Water ruikt niet, wat erin leeft wel.</w:t>
+      </w:r>
+      <w:r>
+        <w:t xml:space="preserve"> </w:t>
+      </w:r>
+      <w:r>
+        <w:t xml:space="preserve">- Het balletje vindt ze met de neus, als de wind goed zit.</w:t>
+      </w:r>
+      <w:r>
+        <w:t xml:space="preserve"> </w:t>
+      </w:r>
+      <w:r>
+        <w:t xml:space="preserve">- Bij Dirk en zijn Mechelaars wordt het een wedstrijd, en de baasjes zijn even fel als de honden.</w:t>
+      </w:r>
+      <w:r>
+        <w:t xml:space="preserve"> </w:t>
+      </w:r>
+      <w:r>
+        <w:t xml:space="preserve">- Climax: de zee in het late najaar, op het lege strand tussen Zeebrugge en Blankenberge. Tara trotseert zonder angst de golven om het balletje terug te halen.</w:t>
+      </w:r>
+      <w:r>
+        <w:t xml:space="preserve"> </w:t>
+      </w:r>
+      <w:r>
+        <w:t xml:space="preserve">- Rubriek: Dossier 33, water.</w:t>
+      </w:r>
+    </w:p>
+    <w:p>
+      <w:pPr>
+        <w:pStyle w:val="BodyText"/>
+      </w:pPr>
+      <w:r>
+        <w:rPr>
+          <w:bCs/>
+          <w:b/>
+        </w:rPr>
+        <w:t xml:space="preserve">Hoofdstuk 14. Het Etentje.</w:t>
+      </w:r>
+      <w:r>
+        <w:t xml:space="preserve"> </w:t>
+      </w:r>
+      <w:r>
+        <w:t xml:space="preserve">Bestek, gesprekstechniek, en de wet van het gevallen eten. Na het dessert krijgt Tara het laatste stukje vlees van Lodes bord. Een gast vindt dat</w:t>
+      </w:r>
+      <w:r>
+        <w:t xml:space="preserve"> </w:t>
+      </w:r>
+      <w:r>
+        <w:t xml:space="preserve">“</w:t>
+      </w:r>
+      <w:r>
+        <w:t xml:space="preserve">geen goed idee</w:t>
+      </w:r>
+      <w:r>
+        <w:t xml:space="preserve">”</w:t>
+      </w:r>
+      <w:r>
+        <w:t xml:space="preserve">; Lode legt het principe van de roedel uit. Tara’s honger vertekent haar waarneming.</w:t>
+      </w:r>
+    </w:p>
+    <w:p>
+      <w:pPr>
+        <w:pStyle w:val="BodyText"/>
+      </w:pPr>
+      <w:r>
+        <w:rPr>
+          <w:bCs/>
+          <w:b/>
+        </w:rPr>
+        <w:t xml:space="preserve">Hoofdstuk 15. De Dronken Gast.</w:t>
+      </w:r>
+      <w:r>
+        <w:t xml:space="preserve"> </w:t>
+      </w:r>
+      <w:r>
+        <w:t xml:space="preserve">Dezelfde avond. De gast wil Tara leren dansen. Het schema loopt vast.</w:t>
+      </w:r>
+    </w:p>
+    <w:p>
+      <w:pPr>
+        <w:pStyle w:val="BodyText"/>
+      </w:pPr>
+      <w:r>
+        <w:rPr>
+          <w:bCs/>
+          <w:b/>
+        </w:rPr>
+        <w:t xml:space="preserve">Hoofdstuk 16. De Angst voor Honden.</w:t>
+      </w:r>
+      <w:r>
+        <w:t xml:space="preserve"> </w:t>
+      </w:r>
+      <w:r>
+        <w:rPr>
+          <w:iCs/>
+          <w:i/>
+        </w:rPr>
         <w:t xml:space="preserve">Dogtime, afgebroken tot meewandelen.</w:t>
       </w:r>
       <w:r>
@@ -6423,7 +6508,7 @@
           <w:bCs/>
           <w:b/>
         </w:rPr>
-        <w:t xml:space="preserve">Hoofdstuk 16. Kalmerende Signalen.</w:t>
+        <w:t xml:space="preserve">Hoofdstuk 17. Kalmerende Signalen.</w:t>
       </w:r>
       <w:r>
         <w:t xml:space="preserve"> </w:t>
@@ -6441,7 +6526,7 @@
           <w:bCs/>
           <w:b/>
         </w:rPr>
-        <w:t xml:space="preserve">Hoofdstuk 17. De Kracht van Oogcontact.</w:t>
+        <w:t xml:space="preserve">Hoofdstuk 18. De Kracht van Oogcontact.</w:t>
       </w:r>
       <w:r>
         <w:t xml:space="preserve"> </w:t>
@@ -6459,7 +6544,7 @@
           <w:bCs/>
           <w:b/>
         </w:rPr>
-        <w:t xml:space="preserve">Hoofdstuk 18. De Liefdesband.</w:t>
+        <w:t xml:space="preserve">Hoofdstuk 19. De Liefdesband.</w:t>
       </w:r>
       <w:r>
         <w:t xml:space="preserve"> </w:t>
@@ -6487,7 +6572,7 @@
           <w:bCs/>
           <w:b/>
         </w:rPr>
-        <w:t xml:space="preserve">Hoofdstuk 19. De Boswachter versus de Wolf.</w:t>
+        <w:t xml:space="preserve">Hoofdstuk 20. De Boswachter versus de Wolf.</w:t>
       </w:r>
       <w:r>
         <w:t xml:space="preserve"> </w:t>
@@ -6602,7 +6687,7 @@
           <w:bCs/>
           <w:b/>
         </w:rPr>
-        <w:t xml:space="preserve">Hoofdstuk 20. De Kleinkinderen Groeien Op.</w:t>
+        <w:t xml:space="preserve">Hoofdstuk 21. De Kleinkinderen Groeien Op.</w:t>
       </w:r>
       <w:r>
         <w:t xml:space="preserve"> </w:t>
@@ -6620,7 +6705,7 @@
           <w:bCs/>
           <w:b/>
         </w:rPr>
-        <w:t xml:space="preserve">Hoofdstuk 21. De Plek op Zijn Rug.</w:t>
+        <w:t xml:space="preserve">Hoofdstuk 22. De Plek op Zijn Rug.</w:t>
       </w:r>
       <w:r>
         <w:t xml:space="preserve"> </w:t>
@@ -6638,7 +6723,7 @@
           <w:bCs/>
           <w:b/>
         </w:rPr>
-        <w:t xml:space="preserve">Hoofdstuk 22. Langzamere Wandelingen.</w:t>
+        <w:t xml:space="preserve">Hoofdstuk 23. Langzamere Wandelingen.</w:t>
       </w:r>
       <w:r>
         <w:t xml:space="preserve"> </w:t>
@@ -6656,7 +6741,7 @@
           <w:bCs/>
           <w:b/>
         </w:rPr>
-        <w:t xml:space="preserve">Hoofdstuk 23. De Hond als Spiegel.</w:t>
+        <w:t xml:space="preserve">Hoofdstuk 24. De Hond als Spiegel.</w:t>
       </w:r>
       <w:r>
         <w:t xml:space="preserve"> </w:t>
@@ -6674,7 +6759,7 @@
           <w:bCs/>
           <w:b/>
         </w:rPr>
-        <w:t xml:space="preserve">Hoofdstuk 24. De Neus Die Zweeg.</w:t>
+        <w:t xml:space="preserve">Hoofdstuk 25. De Neus Die Zweeg.</w:t>
       </w:r>
       <w:r>
         <w:t xml:space="preserve"> </w:t>
@@ -6780,7 +6865,7 @@
           <w:bCs/>
           <w:b/>
         </w:rPr>
-        <w:t xml:space="preserve">Hoofdstuk 25. De Laatste Avond.</w:t>
+        <w:t xml:space="preserve">Hoofdstuk 26. De Laatste Avond.</w:t>
       </w:r>
     </w:p>
     <w:p>
@@ -6896,7 +6981,7 @@
         <w:pStyle w:val="BodyText"/>
       </w:pPr>
       <w:r>
-        <w:t xml:space="preserve">De hartstilstand wordt hier niet beschreven. Tara merkt er niets van. De lezer leert het pas in hoofdstuk 26.</w:t>
+        <w:t xml:space="preserve">De hartstilstand wordt hier niet beschreven. Tara merkt er niets van. De lezer leert het pas in hoofdstuk 27.</w:t>
       </w:r>
     </w:p>
     <w:p>
@@ -6908,7 +6993,7 @@
           <w:bCs/>
           <w:b/>
         </w:rPr>
-        <w:t xml:space="preserve">Hoofdstuk 26. Laatste Observatie, Genoteerd door de Proefpersoon.</w:t>
+        <w:t xml:space="preserve">Hoofdstuk 27. Laatste Observatie, Genoteerd door de Proefpersoon.</w:t>
       </w:r>
       <w:r>
         <w:t xml:space="preserve"> </w:t>
@@ -7084,7 +7169,7 @@
         <w:pStyle w:val="FirstParagraph"/>
       </w:pPr>
       <w:r>
-        <w:t xml:space="preserve">Enkele weken later, in Lodes stem, in dezelfde sobere toon als hoofdstuk 26.</w:t>
+        <w:t xml:space="preserve">Enkele weken later, in Lodes stem, in dezelfde sobere toon als hoofdstuk 27.</w:t>
       </w:r>
       <w:r>
         <w:t xml:space="preserve"> </w:t>
@@ -7258,7 +7343,7 @@
         <w:t xml:space="preserve"> </w:t>
       </w:r>
       <w:r>
-        <w:t xml:space="preserve">het verloop in hoofdstuk 24 en 25 klopt daarmee. Hoe ver de behandeling gaat, is aan de auteur.</w:t>
+        <w:t xml:space="preserve">het verloop in hoofdstuk 25 en 26 klopt daarmee. Hoe ver de behandeling gaat, is aan de auteur.</w:t>
       </w:r>
       <w:r>
         <w:t xml:space="preserve"> </w:t>
@@ -7377,7 +7462,7 @@
         <w:t xml:space="preserve"> </w:t>
       </w:r>
       <w:r>
-        <w:t xml:space="preserve">het scenario van hoofdstuk 26 is medisch geloofwaardig.</w:t>
+        <w:t xml:space="preserve">het scenario van hoofdstuk 27 is medisch geloofwaardig.</w:t>
       </w:r>
       <w:r>
         <w:t xml:space="preserve"> </w:t>
@@ -7532,7 +7617,7 @@
         <w:t xml:space="preserve"> </w:t>
       </w:r>
       <w:r>
-        <w:t xml:space="preserve">dit is de feitelijke achtergrond van hoofdstuk 19. Het boek neemt geen standpunt in; het is Lodes mening tegen het bordje van de boswachter. Als de auteur een kleine nuance wil zonder te preken: Tara kan in het hoge gras de geur van een reekalfje ruiken, waar Lode niets van merkt.</w:t>
+        <w:t xml:space="preserve">dit is de feitelijke achtergrond van hoofdstuk 20. Het boek neemt geen standpunt in; het is Lodes mening tegen het bordje van de boswachter. Als de auteur een kleine nuance wil zonder te preken: Tara kan in het hoge gras de geur van een reekalfje ruiken, waar Lode niets van merkt.</w:t>
       </w:r>
       <w:r>
         <w:t xml:space="preserve"> </w:t>
@@ -8799,7 +8884,7 @@
               <w:jc w:val="left"/>
             </w:pPr>
             <w:r>
-              <w:t xml:space="preserve">Hoofdstuk 26</w:t>
+              <w:t xml:space="preserve">Hoofdstuk 27</w:t>
             </w:r>
           </w:p>
         </w:tc>
@@ -8837,7 +8922,7 @@
               <w:jc w:val="left"/>
             </w:pPr>
             <w:r>
-              <w:t xml:space="preserve">Hoofdstuk 19</w:t>
+              <w:t xml:space="preserve">Hoofdstuk 20</w:t>
             </w:r>
           </w:p>
         </w:tc>
@@ -9032,7 +9117,7 @@
         <w:t xml:space="preserve"> </w:t>
       </w:r>
       <w:r>
-        <w:t xml:space="preserve">Hoofdstuk 25 en 26 samen zijn hoogstens 3.600 woorden. Witregels en korte alinea’s doen het werk.</w:t>
+        <w:t xml:space="preserve">Hoofdstuk 26 en 27 samen zijn hoogstens 3.600 woorden. Witregels en korte alinea’s doen het werk.</w:t>
       </w:r>
     </w:p>
     <w:p>
@@ -9054,7 +9139,7 @@
         <w:t xml:space="preserve"> </w:t>
       </w:r>
       <w:r>
-        <w:t xml:space="preserve">staat in Lodes stem, als voortzetting van hoofdstuk 26. Het ontbrekende lied draagt de epiloog: het verdriet zit in de stilte op het uur waarop zij altijd zong.</w:t>
+        <w:t xml:space="preserve">staat in Lodes stem, als voortzetting van hoofdstuk 27. Het ontbrekende lied draagt de epiloog: het verdriet zit in de stilte op het uur waarop zij altijd zong.</w:t>
       </w:r>
     </w:p>
     <w:bookmarkStart w:id="78" w:name="Xead231bbf92b2b64993506410400f6d97d1b6d5"/>
@@ -9667,7 +9752,7 @@
         <w:t xml:space="preserve"> </w:t>
       </w:r>
       <w:r>
-        <w:t xml:space="preserve">nog steeds geen sluitende verklaring gevonden. De studie wordt afgesloten door de proefpersoon (hoofdstuk 26).</w:t>
+        <w:t xml:space="preserve">nog steeds geen sluitende verklaring gevonden. De studie wordt afgesloten door de proefpersoon (hoofdstuk 27).</w:t>
       </w:r>
     </w:p>
     <w:bookmarkEnd w:id="83"/>
@@ -9895,7 +9980,7 @@
               <w:jc w:val="left"/>
             </w:pPr>
             <w:r>
-              <w:t xml:space="preserve">15. De Angst voor Honden</w:t>
+              <w:t xml:space="preserve">16. De Angst voor Honden</w:t>
             </w:r>
           </w:p>
         </w:tc>
@@ -9971,7 +10056,7 @@
               <w:jc w:val="left"/>
             </w:pPr>
             <w:r>
-              <w:t xml:space="preserve">19. De Boswachter versus de Wolf</w:t>
+              <w:t xml:space="preserve">20. De Boswachter versus de Wolf</w:t>
             </w:r>
           </w:p>
         </w:tc>
@@ -10009,7 +10094,7 @@
               <w:jc w:val="left"/>
             </w:pPr>
             <w:r>
-              <w:t xml:space="preserve">22. Langzamere Wandelingen</w:t>
+              <w:t xml:space="preserve">23. Langzamere Wandelingen</w:t>
             </w:r>
           </w:p>
         </w:tc>
@@ -10047,7 +10132,7 @@
               <w:jc w:val="left"/>
             </w:pPr>
             <w:r>
-              <w:t xml:space="preserve">24. De Neus Die Zweeg</w:t>
+              <w:t xml:space="preserve">25. De Neus Die Zweeg</w:t>
             </w:r>
           </w:p>
         </w:tc>
@@ -10198,7 +10283,7 @@
           <w:bCs/>
           <w:b/>
         </w:rPr>
-        <w:t xml:space="preserve">Hoofdstuk 26 krijgt een andere vormgeving:</w:t>
+        <w:t xml:space="preserve">Hoofdstuk 27 krijgt een andere vormgeving:</w:t>
       </w:r>
       <w:r>
         <w:t xml:space="preserve"> </w:t>
@@ -11359,7 +11444,7 @@
         <w:pStyle w:val="BodyText"/>
       </w:pPr>
       <w:r>
-        <w:t xml:space="preserve">Het reekalfje staat in hoofdstuk 19 en is daarmee ook vastgelegd.</w:t>
+        <w:t xml:space="preserve">Het reekalfje staat in hoofdstuk 20 en is daarmee ook vastgelegd.</w:t>
       </w:r>
     </w:p>
     <w:p>
@@ -11494,7 +11579,7 @@
         <w:t xml:space="preserve"> </w:t>
       </w:r>
       <w:r>
-        <w:t xml:space="preserve">zijn een karaktertrek van Lode. Hoofdstuk 19 is herschreven, met de feiten van het ANB als achtergrond.</w:t>
+        <w:t xml:space="preserve">zijn een karaktertrek van Lode. Hoofdstuk 20 is herschreven, met de feiten van het ANB als achtergrond.</w:t>
       </w:r>
     </w:p>
     <w:p>
@@ -11544,7 +11629,7 @@
         <w:pStyle w:val="Compact"/>
       </w:pPr>
       <w:r>
-        <w:t xml:space="preserve">hoofdstuk 24</w:t>
+        <w:t xml:space="preserve">hoofdstuk 25</w:t>
       </w:r>
       <w:r>
         <w:t xml:space="preserve"> </w:t>
@@ -11572,7 +11657,7 @@
         <w:pStyle w:val="Compact"/>
       </w:pPr>
       <w:r>
-        <w:t xml:space="preserve">hoofdstuk 25</w:t>
+        <w:t xml:space="preserve">hoofdstuk 26</w:t>
       </w:r>
       <w:r>
         <w:t xml:space="preserve"> </w:t>
@@ -11600,7 +11685,7 @@
         <w:pStyle w:val="Compact"/>
       </w:pPr>
       <w:r>
-        <w:t xml:space="preserve">hoofdstuk 26</w:t>
+        <w:t xml:space="preserve">hoofdstuk 27</w:t>
       </w:r>
       <w:r>
         <w:t xml:space="preserve"> </w:t>
@@ -11628,7 +11713,7 @@
         <w:pStyle w:val="Compact"/>
       </w:pPr>
       <w:r>
-        <w:t xml:space="preserve">Het boek telt nu 26 hoofdstukken.</w:t>
+        <w:t xml:space="preserve">Het boek telde toen 26 hoofdstukken; sinds versie 7 zijn het er 27.</w:t>
       </w:r>
     </w:p>
     <w:p>
@@ -11650,7 +11735,7 @@
         <w:t xml:space="preserve"> </w:t>
       </w:r>
       <w:r>
-        <w:t xml:space="preserve">speelt niet meer bij de haard, maar in de mist na de operatie. De lezer ontdekt dat pas in hoofdstuk 25.</w:t>
+        <w:t xml:space="preserve">speelt niet meer bij de haard, maar in de mist na de operatie. De lezer ontdekt dat pas in hoofdstuk 26.</w:t>
       </w:r>
     </w:p>
     <w:p>
@@ -11814,7 +11899,7 @@
         <w:t xml:space="preserve"> </w:t>
       </w:r>
       <w:r>
-        <w:t xml:space="preserve">is een doorlopende draad: elke ochtend bij het ontbijt, alleen met iets in haar mond, ontdekt door Lode in hoofdstuk 10, en voor het laatst gezongen op de ochtend van de operatie (hoofdstuk 25).</w:t>
+        <w:t xml:space="preserve">is een doorlopende draad: elke ochtend bij het ontbijt, alleen met iets in haar mond, ontdekt door Lode in hoofdstuk 10, en voor het laatst gezongen op de ochtend van de operatie (hoofdstuk 26).</w:t>
       </w:r>
     </w:p>
     <w:p>
@@ -12324,7 +12409,7 @@
         <w:pStyle w:val="Compact"/>
       </w:pPr>
       <w:r>
-        <w:t xml:space="preserve">Zodra de pantoffel zijn plaats inneemt, ligt het weer achterin de auto (hoofdstuk 16, 24, 25 en 26).</w:t>
+        <w:t xml:space="preserve">Zodra de pantoffel zijn plaats inneemt, ligt het weer achterin de auto (hoofdstuk 17, 25, 26 en 27).</w:t>
       </w:r>
     </w:p>
     <w:p>
@@ -12336,7 +12421,7 @@
         <w:pStyle w:val="Compact"/>
       </w:pPr>
       <w:r>
-        <w:t xml:space="preserve">Aan het einde ruikt het naar Tara (hoofdstuk 26).</w:t>
+        <w:t xml:space="preserve">Aan het einde ruikt het naar Tara (hoofdstuk 27).</w:t>
       </w:r>
     </w:p>
     <w:bookmarkEnd w:id="95"/>
@@ -12382,7 +12467,7 @@
         <w:pStyle w:val="Compact"/>
       </w:pPr>
       <w:r>
-        <w:t xml:space="preserve">Vanaf Deel III ligt hij in de mand (de overgang staat in hoofdstuk 19).</w:t>
+        <w:t xml:space="preserve">Vanaf Deel III ligt hij in de mand (de overgang staat in hoofdstuk 20).</w:t>
       </w:r>
     </w:p>
     <w:p>
@@ -12394,7 +12479,7 @@
         <w:pStyle w:val="Compact"/>
       </w:pPr>
       <w:r>
-        <w:t xml:space="preserve">Hij is roze geworden (hoofdstuk 22).</w:t>
+        <w:t xml:space="preserve">Hij is roze geworden (hoofdstuk 23).</w:t>
       </w:r>
     </w:p>
     <w:p>
@@ -12452,7 +12537,7 @@
         <w:pStyle w:val="Compact"/>
       </w:pPr>
       <w:r>
-        <w:t xml:space="preserve">De oude rechterpantoffel slijt helemaal op en wordt door Mieke weggedaan (nieuw in hoofdstuk 19).</w:t>
+        <w:t xml:space="preserve">De oude rechterpantoffel slijt helemaal op en wordt door Mieke weggedaan (nieuw in hoofdstuk 20).</w:t>
       </w:r>
     </w:p>
     <w:bookmarkEnd w:id="97"/>
@@ -12501,7 +12586,7 @@
         <w:pStyle w:val="Compact"/>
       </w:pPr>
       <w:r>
-        <w:t xml:space="preserve">Hoofdstuk 26 en de epiloog schrijft Lode in een schrift.</w:t>
+        <w:t xml:space="preserve">Hoofdstuk 27 en de epiloog schrijft Lode in een schrift.</w:t>
       </w:r>
     </w:p>
     <w:bookmarkEnd w:id="98"/>
@@ -12614,7 +12699,7 @@
         <w:pStyle w:val="Compact"/>
       </w:pPr>
       <w:r>
-        <w:t xml:space="preserve">In de tuin staan een appelboom en groentebakken met Miekes tomaten. Na zijn pensioen heeft Lode achteraan, bij de compostbak, tomaten en boontjes (hoofdstuk 21).</w:t>
+        <w:t xml:space="preserve">In de tuin staan een appelboom en groentebakken met Miekes tomaten. Na zijn pensioen heeft Lode achteraan, bij de compostbak, tomaten en boontjes (hoofdstuk 22).</w:t>
       </w:r>
     </w:p>
     <w:p>
@@ -12638,7 +12723,7 @@
         <w:pStyle w:val="Compact"/>
       </w:pPr>
       <w:r>
-        <w:t xml:space="preserve">In hoofdstuk 15 gaat de lijn los bij een slagboom. Er is een herder van de hoeve aan de overkant, en er is een beekweg.</w:t>
+        <w:t xml:space="preserve">In hoofdstuk 16 gaat de lijn los bij een slagboom. Er is een herder van de hoeve aan de overkant, en er is een beekweg.</w:t>
       </w:r>
     </w:p>
     <w:p>
@@ -12774,7 +12859,7 @@
         <w:pStyle w:val="Compact"/>
       </w:pPr>
       <w:r>
-        <w:t xml:space="preserve">In de straat achter de kerk woont een reu achter een zwarte ijzeren poort (hoofdstuk 17).</w:t>
+        <w:t xml:space="preserve">In de straat achter de kerk woont een reu achter een zwarte ijzeren poort (hoofdstuk 18).</w:t>
       </w:r>
     </w:p>
     <w:p>
@@ -12804,17 +12889,17 @@
         <w:t xml:space="preserve"> </w:t>
       </w:r>
       <w:r>
-        <w:t xml:space="preserve">(hoofdstuk 23).</w:t>
+        <w:t xml:space="preserve">(hoofdstuk 24).</w:t>
       </w:r>
     </w:p>
     <w:bookmarkEnd w:id="101"/>
-    <w:bookmarkStart w:id="102" w:name="gasten-op-het-etentje-hoofdstuk-13-en-14"/>
+    <w:bookmarkStart w:id="102" w:name="gasten-op-het-etentje-hoofdstuk-14-en-15"/>
     <w:p>
       <w:pPr>
         <w:pStyle w:val="Heading2"/>
       </w:pPr>
       <w:r>
-        <w:t xml:space="preserve">Gasten op het etentje (hoofdstuk 13 en 14)</w:t>
+        <w:t xml:space="preserve">Gasten op het etentje (hoofdstuk 14 en 15)</w:t>
       </w:r>
     </w:p>
     <w:p>
@@ -12936,13 +13021,13 @@
       </w:r>
     </w:p>
     <w:bookmarkEnd w:id="102"/>
-    <w:bookmarkStart w:id="103" w:name="X7e44871bc355aa45702a1e82bfba99d12c1c2db"/>
+    <w:bookmarkStart w:id="103" w:name="X6d6db1cca22f274b5cd0fde9418f7f1bff1118f"/>
     <w:p>
       <w:pPr>
         <w:pStyle w:val="Heading2"/>
       </w:pPr>
       <w:r>
-        <w:t xml:space="preserve">De man met het brood en de postbodes (hoofdstuk 15)</w:t>
+        <w:t xml:space="preserve">De man met het brood en de postbodes (hoofdstuk 16)</w:t>
       </w:r>
     </w:p>
     <w:p>
@@ -12985,13 +13070,13 @@
       </w:r>
     </w:p>
     <w:bookmarkEnd w:id="103"/>
-    <w:bookmarkStart w:id="104" w:name="het-park-in-westerlo-hoofdstuk-16"/>
+    <w:bookmarkStart w:id="104" w:name="het-park-in-westerlo-hoofdstuk-17"/>
     <w:p>
       <w:pPr>
         <w:pStyle w:val="Heading2"/>
       </w:pPr>
       <w:r>
-        <w:t xml:space="preserve">Het park in Westerlo (hoofdstuk 16)</w:t>
+        <w:t xml:space="preserve">Het park in Westerlo (hoofdstuk 17)</w:t>
       </w:r>
     </w:p>
     <w:p>
@@ -13049,7 +13134,7 @@
         <w:pStyle w:val="Compact"/>
       </w:pPr>
       <w:r>
-        <w:t xml:space="preserve">Achter Sofies huis in Herentals ligt een park langs de Nete, met populieren. Aan de derde struik vindt Tara het spoor van het zusje (hoofdstuk 18), en later niet meer (hoofdstuk 22).</w:t>
+        <w:t xml:space="preserve">Achter Sofies huis in Herentals ligt een park langs de Nete, met populieren. Aan de derde struik vindt Tara het spoor van het zusje (hoofdstuk 19), en later niet meer (hoofdstuk 23).</w:t>
       </w:r>
     </w:p>
     <w:p>
@@ -13061,7 +13146,7 @@
         <w:pStyle w:val="Compact"/>
       </w:pPr>
       <w:r>
-        <w:t xml:space="preserve">Het zusje heeft zelf pups gehad (hoofdstuk 18).</w:t>
+        <w:t xml:space="preserve">Het zusje heeft zelf pups gehad (hoofdstuk 19).</w:t>
       </w:r>
     </w:p>
     <w:p>
@@ -13105,7 +13190,7 @@
         <w:t xml:space="preserve"> </w:t>
       </w:r>
       <w:r>
-        <w:t xml:space="preserve">Brams draagmand is grijs (hoofdstuk 9), die van Lotte blauw (hoofdstuk 17).</w:t>
+        <w:t xml:space="preserve">Brams draagmand is grijs (hoofdstuk 9), die van Lotte blauw (hoofdstuk 18).</w:t>
       </w:r>
     </w:p>
     <w:p>
@@ -13219,7 +13304,7 @@
         <w:t xml:space="preserve"> </w:t>
       </w:r>
       <w:r>
-        <w:t xml:space="preserve">in zijn schrift (hoofdstuk 23).</w:t>
+        <w:t xml:space="preserve">in zijn schrift (hoofdstuk 24).</w:t>
       </w:r>
     </w:p>
     <w:p>
@@ -13274,17 +13359,17 @@
         <w:pStyle w:val="Compact"/>
       </w:pPr>
       <w:r>
-        <w:t xml:space="preserve">leert fietsen met Lode (hoofdstuk 23).</w:t>
+        <w:t xml:space="preserve">leert fietsen met Lode (hoofdstuk 24).</w:t>
       </w:r>
     </w:p>
     <w:bookmarkEnd w:id="106"/>
-    <w:bookmarkStart w:id="107" w:name="de-slaapkamer-hoofdstuk-18-en-21"/>
+    <w:bookmarkStart w:id="107" w:name="de-slaapkamer-hoofdstuk-19-en-22"/>
     <w:p>
       <w:pPr>
         <w:pStyle w:val="Heading2"/>
       </w:pPr>
       <w:r>
-        <w:t xml:space="preserve">De slaapkamer (hoofdstuk 18 en 21)</w:t>
+        <w:t xml:space="preserve">De slaapkamer (hoofdstuk 19 en 22)</w:t>
       </w:r>
     </w:p>
     <w:p>
@@ -13426,7 +13511,7 @@
         <w:pStyle w:val="Compact"/>
       </w:pPr>
       <w:r>
-        <w:t xml:space="preserve">De boswachter draagt groen en heeft twee eigen honden, een oude en een jonge. In hoofdstuk 22 is de oude weg en is er een nieuwe jonge. Hij noteert in een boekje met een harde kaft.</w:t>
+        <w:t xml:space="preserve">De boswachter draagt groen en heeft twee eigen honden, een oude en een jonge. In hoofdstuk 23 is de oude weg en is er een nieuwe jonge. Hij noteert in een boekje met een harde kaft.</w:t>
       </w:r>
     </w:p>
     <w:p>
@@ -13438,7 +13523,7 @@
         <w:pStyle w:val="Compact"/>
       </w:pPr>
       <w:r>
-        <w:t xml:space="preserve">Het reekalfje uit de open keuze is gebruikt in hoofdstuk 19 (Tara ruikt het, Lode niet). Open keuze 1 in sectie 17 van de bible kan dus dicht.</w:t>
+        <w:t xml:space="preserve">Het reekalfje uit de open keuze is gebruikt in hoofdstuk 20 (Tara ruikt het, Lode niet). Open keuze 1 in sectie 17 van de bible kan dus dicht.</w:t>
       </w:r>
     </w:p>
     <w:bookmarkEnd w:id="108"/>
@@ -13613,7 +13698,7 @@
         <w:pStyle w:val="Compact"/>
       </w:pPr>
       <w:r>
-        <w:t xml:space="preserve">De chirurgijn is een vrouw met kalme handen. Zij stelt ook de diagnose in hoofdstuk 24.</w:t>
+        <w:t xml:space="preserve">De chirurgijn is een vrouw met kalme handen. Zij stelt ook de diagnose in hoofdstuk 25.</w:t>
       </w:r>
     </w:p>
     <w:p>
@@ -13671,7 +13756,7 @@
         <w:pStyle w:val="Compact"/>
       </w:pPr>
       <w:r>
-        <w:t xml:space="preserve">Hoofdstuk 26: Lode geeft Tara om acht uur af. De chirurgijn belt om tien over elf. Mira ligt de hele dag in de mand.</w:t>
+        <w:t xml:space="preserve">Hoofdstuk 27: Lode geeft Tara om acht uur af. De chirurgijn belt om tien over elf. Mira ligt de hele dag in de mand.</w:t>
       </w:r>
     </w:p>
     <w:p>
@@ -13775,7 +13860,7 @@
         <w:t xml:space="preserve"> </w:t>
       </w:r>
       <w:r>
-        <w:t xml:space="preserve">(hoofdstuk 23):</w:t>
+        <w:t xml:space="preserve">(hoofdstuk 24):</w:t>
       </w:r>
       <w:r>
         <w:t xml:space="preserve"> </w:t>
@@ -14052,6 +14137,1111 @@
     </w:p>
     <w:bookmarkEnd w:id="115"/>
     <w:bookmarkEnd w:id="116"/>
+    <w:bookmarkStart w:id="118" w:name="versie-7-aanvullingen-van-de-auteur"/>
+    <w:p>
+      <w:pPr>
+        <w:pStyle w:val="Heading1"/>
+      </w:pPr>
+      <w:r>
+        <w:t xml:space="preserve">22. Versie 7: aanvullingen van de auteur</w:t>
+      </w:r>
+    </w:p>
+    <w:p>
+      <w:pPr>
+        <w:pStyle w:val="FirstParagraph"/>
+      </w:pPr>
+      <w:r>
+        <w:t xml:space="preserve">Op aanwijzing van de auteur zijn in versie 7 deze dingen toegevoegd:</w:t>
+      </w:r>
+    </w:p>
+    <w:p>
+      <w:pPr>
+        <w:numPr>
+          <w:ilvl w:val="0"/>
+          <w:numId w:val="1053"/>
+        </w:numPr>
+        <w:pStyle w:val="Compact"/>
+      </w:pPr>
+      <w:r>
+        <w:rPr>
+          <w:bCs/>
+          <w:b/>
+        </w:rPr>
+        <w:t xml:space="preserve">Het nieuwe hoofdstuk 13, Het Water:</w:t>
+      </w:r>
+    </w:p>
+    <w:p>
+      <w:pPr>
+        <w:numPr>
+          <w:ilvl w:val="1"/>
+          <w:numId w:val="1054"/>
+        </w:numPr>
+        <w:pStyle w:val="Compact"/>
+      </w:pPr>
+      <w:r>
+        <w:t xml:space="preserve">het ven en de tak;</w:t>
+      </w:r>
+    </w:p>
+    <w:p>
+      <w:pPr>
+        <w:numPr>
+          <w:ilvl w:val="1"/>
+          <w:numId w:val="1054"/>
+        </w:numPr>
+        <w:pStyle w:val="Compact"/>
+      </w:pPr>
+      <w:r>
+        <w:t xml:space="preserve">“</w:t>
+      </w:r>
+      <w:r>
+        <w:t xml:space="preserve">zoek een stok</w:t>
+      </w:r>
+      <w:r>
+        <w:t xml:space="preserve">”</w:t>
+      </w:r>
+      <w:r>
+        <w:t xml:space="preserve"> </w:t>
+      </w:r>
+      <w:r>
+        <w:t xml:space="preserve">en het jonge berkje;</w:t>
+      </w:r>
+    </w:p>
+    <w:p>
+      <w:pPr>
+        <w:numPr>
+          <w:ilvl w:val="1"/>
+          <w:numId w:val="1054"/>
+        </w:numPr>
+        <w:pStyle w:val="Compact"/>
+      </w:pPr>
+      <w:r>
+        <w:t xml:space="preserve">water ruiken bij dorst;</w:t>
+      </w:r>
+    </w:p>
+    <w:p>
+      <w:pPr>
+        <w:numPr>
+          <w:ilvl w:val="1"/>
+          <w:numId w:val="1054"/>
+        </w:numPr>
+        <w:pStyle w:val="Compact"/>
+      </w:pPr>
+      <w:r>
+        <w:t xml:space="preserve">het balletje vinden met de wind;</w:t>
+      </w:r>
+    </w:p>
+    <w:p>
+      <w:pPr>
+        <w:numPr>
+          <w:ilvl w:val="1"/>
+          <w:numId w:val="1054"/>
+        </w:numPr>
+        <w:pStyle w:val="Compact"/>
+      </w:pPr>
+      <w:r>
+        <w:t xml:space="preserve">de wedstrijd bij Dirk, waarin de baasjes even fel worden als de honden;</w:t>
+      </w:r>
+    </w:p>
+    <w:p>
+      <w:pPr>
+        <w:numPr>
+          <w:ilvl w:val="1"/>
+          <w:numId w:val="1054"/>
+        </w:numPr>
+        <w:pStyle w:val="Compact"/>
+      </w:pPr>
+      <w:r>
+        <w:t xml:space="preserve">de zee.</w:t>
+      </w:r>
+    </w:p>
+    <w:p>
+      <w:pPr>
+        <w:numPr>
+          <w:ilvl w:val="0"/>
+          <w:numId w:val="1053"/>
+        </w:numPr>
+        <w:pStyle w:val="Compact"/>
+      </w:pPr>
+      <w:r>
+        <w:rPr>
+          <w:bCs/>
+          <w:b/>
+        </w:rPr>
+        <w:t xml:space="preserve">De communicatie tussen Tara en Lode</w:t>
+      </w:r>
+      <w:r>
+        <w:t xml:space="preserve"> </w:t>
+      </w:r>
+      <w:r>
+        <w:t xml:space="preserve">in hoofdstuk 18 en 19:</w:t>
+      </w:r>
+    </w:p>
+    <w:p>
+      <w:pPr>
+        <w:numPr>
+          <w:ilvl w:val="1"/>
+          <w:numId w:val="1055"/>
+        </w:numPr>
+        <w:pStyle w:val="Compact"/>
+      </w:pPr>
+      <w:r>
+        <w:t xml:space="preserve">de vragende blik;</w:t>
+      </w:r>
+    </w:p>
+    <w:p>
+      <w:pPr>
+        <w:numPr>
+          <w:ilvl w:val="1"/>
+          <w:numId w:val="1055"/>
+        </w:numPr>
+        <w:pStyle w:val="Compact"/>
+      </w:pPr>
+      <w:r>
+        <w:t xml:space="preserve">aan de deur staan;</w:t>
+      </w:r>
+    </w:p>
+    <w:p>
+      <w:pPr>
+        <w:numPr>
+          <w:ilvl w:val="1"/>
+          <w:numId w:val="1055"/>
+        </w:numPr>
+        <w:pStyle w:val="Compact"/>
+      </w:pPr>
+      <w:r>
+        <w:t xml:space="preserve">de kop op Lodes schoot om naar haar eten te vragen;</w:t>
+      </w:r>
+    </w:p>
+    <w:p>
+      <w:pPr>
+        <w:numPr>
+          <w:ilvl w:val="1"/>
+          <w:numId w:val="1055"/>
+        </w:numPr>
+        <w:pStyle w:val="Compact"/>
+      </w:pPr>
+      <w:r>
+        <w:t xml:space="preserve">de vele woorden die ze verstaat.</w:t>
+      </w:r>
+    </w:p>
+    <w:p>
+      <w:pPr>
+        <w:numPr>
+          <w:ilvl w:val="0"/>
+          <w:numId w:val="1053"/>
+        </w:numPr>
+        <w:pStyle w:val="Compact"/>
+      </w:pPr>
+      <w:r>
+        <w:rPr>
+          <w:bCs/>
+          <w:b/>
+        </w:rPr>
+        <w:t xml:space="preserve">Het muizengif</w:t>
+      </w:r>
+      <w:r>
+        <w:t xml:space="preserve"> </w:t>
+      </w:r>
+      <w:r>
+        <w:t xml:space="preserve">in hoofdstuk 25, vóór het niezen, en Lodes onbeantwoorde vraag in hoofdstuk 27:</w:t>
+      </w:r>
+      <w:r>
+        <w:t xml:space="preserve"> </w:t>
+      </w:r>
+      <w:r>
+        <w:t xml:space="preserve">“</w:t>
+      </w:r>
+      <w:r>
+        <w:t xml:space="preserve">Dat zullen we nooit weten.</w:t>
+      </w:r>
+      <w:r>
+        <w:t xml:space="preserve">”</w:t>
+      </w:r>
+    </w:p>
+    <w:p>
+      <w:pPr>
+        <w:numPr>
+          <w:ilvl w:val="0"/>
+          <w:numId w:val="1053"/>
+        </w:numPr>
+        <w:pStyle w:val="Compact"/>
+      </w:pPr>
+      <w:r>
+        <w:rPr>
+          <w:bCs/>
+          <w:b/>
+        </w:rPr>
+        <w:t xml:space="preserve">De epiloog</w:t>
+      </w:r>
+      <w:r>
+        <w:t xml:space="preserve"> </w:t>
+      </w:r>
+      <w:r>
+        <w:t xml:space="preserve">vertelt over de weggevallen gewoontes, en over de vraag waarom die zo’n pijn doen.</w:t>
+      </w:r>
+    </w:p>
+    <w:p>
+      <w:pPr>
+        <w:pStyle w:val="FirstParagraph"/>
+      </w:pPr>
+      <w:r>
+        <w:rPr>
+          <w:bCs/>
+          <w:b/>
+        </w:rPr>
+        <w:t xml:space="preserve">Omvang:</w:t>
+      </w:r>
+      <w:r>
+        <w:t xml:space="preserve"> </w:t>
+      </w:r>
+      <w:r>
+        <w:t xml:space="preserve">met dit hoofdstuk telt het boek 27 hoofdstukken en ongeveer 58.600 woorden, zo’n 215 bladzijden in het formaat 6 x 9 inch. Dat valt binnen de marge van 180 tot 220 bladzijden.</w:t>
+      </w:r>
+    </w:p>
+    <w:p>
+      <w:pPr>
+        <w:pStyle w:val="BodyText"/>
+      </w:pPr>
+      <w:r>
+        <w:rPr>
+          <w:bCs/>
+          <w:b/>
+        </w:rPr>
+        <w:t xml:space="preserve">Bestanden:</w:t>
+      </w:r>
+      <w:r>
+        <w:t xml:space="preserve"> </w:t>
+      </w:r>
+      <w:r>
+        <w:t xml:space="preserve">de epiloog heet nu 28_Epiloog.md.</w:t>
+      </w:r>
+    </w:p>
+    <w:bookmarkStart w:id="117" w:name="nieuwe-vaste-feiten-uit-versie-7"/>
+    <w:p>
+      <w:pPr>
+        <w:pStyle w:val="Heading2"/>
+      </w:pPr>
+      <w:r>
+        <w:t xml:space="preserve">Nieuwe vaste feiten uit versie 7</w:t>
+      </w:r>
+    </w:p>
+    <w:p>
+      <w:pPr>
+        <w:pStyle w:val="FirstParagraph"/>
+      </w:pPr>
+      <w:r>
+        <w:rPr>
+          <w:bCs/>
+          <w:b/>
+        </w:rPr>
+        <w:t xml:space="preserve">Hoofdstuk 13</w:t>
+      </w:r>
+      <w:r>
+        <w:t xml:space="preserve"> </w:t>
+      </w:r>
+      <w:r>
+        <w:t xml:space="preserve">- Tara is ongeveer drie. H13 speelt in hetzelfde jaar als H11 en H12.</w:t>
+      </w:r>
+      <w:r>
+        <w:t xml:space="preserve"> </w:t>
+      </w:r>
+      <w:r>
+        <w:t xml:space="preserve">- Het ven achter het dennenbos, aan het einde van de zandweg, ruikt naar ijzer, kikkers, riet en zwarte modder. Lode gooit er een dode dennentak in. Het spel stopt wanneer zijn arm</w:t>
+      </w:r>
+      <w:r>
+        <w:t xml:space="preserve"> </w:t>
+      </w:r>
+      <w:r>
+        <w:t xml:space="preserve">“</w:t>
+      </w:r>
+      <w:r>
+        <w:t xml:space="preserve">op</w:t>
+      </w:r>
+      <w:r>
+        <w:t xml:space="preserve">”</w:t>
+      </w:r>
+      <w:r>
+        <w:t xml:space="preserve"> </w:t>
+      </w:r>
+      <w:r>
+        <w:t xml:space="preserve">is.</w:t>
+      </w:r>
+      <w:r>
+        <w:t xml:space="preserve"> </w:t>
+      </w:r>
+      <w:r>
+        <w:t xml:space="preserve">- Bij</w:t>
+      </w:r>
+      <w:r>
+        <w:t xml:space="preserve"> </w:t>
+      </w:r>
+      <w:r>
+        <w:t xml:space="preserve">“</w:t>
+      </w:r>
+      <w:r>
+        <w:t xml:space="preserve">Zoek een stok</w:t>
+      </w:r>
+      <w:r>
+        <w:t xml:space="preserve">”</w:t>
+      </w:r>
+      <w:r>
+        <w:t xml:space="preserve"> </w:t>
+      </w:r>
+      <w:r>
+        <w:t xml:space="preserve">in een opgeruimd stuk bos trekt Tara een jonge berk half uit de grond. Lode lacht (</w:t>
+      </w:r>
+      <w:r>
+        <w:t xml:space="preserve">“</w:t>
+      </w:r>
+      <w:r>
+        <w:t xml:space="preserve">Nen stok, Tara! Geen heel bos!</w:t>
+      </w:r>
+      <w:r>
+        <w:t xml:space="preserve">”</w:t>
+      </w:r>
+      <w:r>
+        <w:t xml:space="preserve">), zet de berk recht en trapt het zand aan.</w:t>
+      </w:r>
+      <w:r>
+        <w:t xml:space="preserve"> </w:t>
+      </w:r>
+      <w:r>
+        <w:t xml:space="preserve">- Tara loopt bij dorst van de wandeling af naar sloten en drinkbakken. Lode:</w:t>
+      </w:r>
+      <w:r>
+        <w:t xml:space="preserve"> </w:t>
+      </w:r>
+      <w:r>
+        <w:t xml:space="preserve">“</w:t>
+      </w:r>
+      <w:r>
+        <w:t xml:space="preserve">Water ruikt naar niks.</w:t>
+      </w:r>
+      <w:r>
+        <w:t xml:space="preserve">”</w:t>
+      </w:r>
+      <w:r>
+        <w:t xml:space="preserve"> </w:t>
+      </w:r>
+      <w:r>
+        <w:t xml:space="preserve">Mieke:</w:t>
+      </w:r>
+      <w:r>
+        <w:t xml:space="preserve"> </w:t>
+      </w:r>
+      <w:r>
+        <w:t xml:space="preserve">“</w:t>
+      </w:r>
+      <w:r>
+        <w:t xml:space="preserve">Misschien ruikt het voor haar wel naar iets.</w:t>
+      </w:r>
+      <w:r>
+        <w:t xml:space="preserve">”</w:t>
+      </w:r>
+      <w:r>
+        <w:t xml:space="preserve"> </w:t>
+      </w:r>
+      <w:r>
+        <w:t xml:space="preserve">-</w:t>
+      </w:r>
+      <w:r>
+        <w:t xml:space="preserve"> </w:t>
+      </w:r>
+      <w:r>
+        <w:rPr>
+          <w:bCs/>
+          <w:b/>
+        </w:rPr>
+        <w:t xml:space="preserve">Dirk:</w:t>
+      </w:r>
+      <w:r>
+        <w:t xml:space="preserve"> </w:t>
+      </w:r>
+      <w:r>
+        <w:t xml:space="preserve">hij heeft een grijze baard, rookt en eet pepermunt, en woont voorbij Westerlo, in een huis met een lange weide die afloopt naar de Nete. Zijn Mechelaars heten Rex en Zara. Ze gehoorzamen</w:t>
+      </w:r>
+      <w:r>
+        <w:t xml:space="preserve"> </w:t>
+      </w:r>
+      <w:r>
+        <w:t xml:space="preserve">“</w:t>
+      </w:r>
+      <w:r>
+        <w:t xml:space="preserve">op een knip</w:t>
+      </w:r>
+      <w:r>
+        <w:t xml:space="preserve">”</w:t>
+      </w:r>
+      <w:r>
+        <w:t xml:space="preserve">. Na zijn ontslag heeft hij</w:t>
+      </w:r>
+      <w:r>
+        <w:t xml:space="preserve"> </w:t>
+      </w:r>
+      <w:r>
+        <w:t xml:space="preserve">“</w:t>
+      </w:r>
+      <w:r>
+        <w:t xml:space="preserve">tijd om te oefenen</w:t>
+      </w:r>
+      <w:r>
+        <w:t xml:space="preserve">”</w:t>
+      </w:r>
+      <w:r>
+        <w:t xml:space="preserve">.</w:t>
+      </w:r>
+      <w:r>
+        <w:t xml:space="preserve"> </w:t>
+      </w:r>
+      <w:r>
+        <w:t xml:space="preserve">- De wedstrijd aan de Nete: Lode gooit met de wind mee in het riet. Er volgt ruzie over regels die niet bestaan. De laatste worp gaat over de Nete, tussen de koeien. Lode heeft ’s avonds pijn aan zijn rechterarm.</w:t>
+      </w:r>
+      <w:r>
+        <w:t xml:space="preserve"> </w:t>
+      </w:r>
+      <w:r>
+        <w:t xml:space="preserve">-</w:t>
+      </w:r>
+      <w:r>
+        <w:t xml:space="preserve"> </w:t>
+      </w:r>
+      <w:r>
+        <w:rPr>
+          <w:bCs/>
+          <w:b/>
+        </w:rPr>
+        <w:t xml:space="preserve">Meetvoorwaarde:</w:t>
+      </w:r>
+      <w:r>
+        <w:t xml:space="preserve"> </w:t>
+      </w:r>
+      <w:r>
+        <w:t xml:space="preserve">Tara vindt iets alleen als de wind van het voorwerp naar haar neus waait.</w:t>
+      </w:r>
+      <w:r>
+        <w:t xml:space="preserve"> </w:t>
+      </w:r>
+      <w:r>
+        <w:t xml:space="preserve">-</w:t>
+      </w:r>
+      <w:r>
+        <w:t xml:space="preserve"> </w:t>
+      </w:r>
+      <w:r>
+        <w:rPr>
+          <w:bCs/>
+          <w:b/>
+        </w:rPr>
+        <w:t xml:space="preserve">De zee:</w:t>
+      </w:r>
+      <w:r>
+        <w:t xml:space="preserve"> </w:t>
+      </w:r>
+      <w:r>
+        <w:t xml:space="preserve">in het late najaar, op de dijk tussen Zeebrugge en Blankenberge, met een leeg strand. Lode haalt een geel balletje uit zijn jaszak (het is nieuw, en Tara kan het zien). Hij staat met opgerolde broekspijpen in het water. Tara drinkt zeewater. Mieke heeft een sjaal, een handdoek, een fles en een kommetje bij zich. Ze zegt</w:t>
+      </w:r>
+      <w:r>
+        <w:t xml:space="preserve"> </w:t>
+      </w:r>
+      <w:r>
+        <w:t xml:space="preserve">“</w:t>
+      </w:r>
+      <w:r>
+        <w:t xml:space="preserve">Ze speelt pakkertje met de zee</w:t>
+      </w:r>
+      <w:r>
+        <w:t xml:space="preserve">”</w:t>
+      </w:r>
+      <w:r>
+        <w:t xml:space="preserve">,</w:t>
+      </w:r>
+      <w:r>
+        <w:t xml:space="preserve"> </w:t>
+      </w:r>
+      <w:r>
+        <w:t xml:space="preserve">“</w:t>
+      </w:r>
+      <w:r>
+        <w:t xml:space="preserve">Gij zijt nen echte zeehond, gij</w:t>
+      </w:r>
+      <w:r>
+        <w:t xml:space="preserve">”</w:t>
+      </w:r>
+      <w:r>
+        <w:t xml:space="preserve"> </w:t>
+      </w:r>
+      <w:r>
+        <w:t xml:space="preserve">en</w:t>
+      </w:r>
+      <w:r>
+        <w:t xml:space="preserve"> </w:t>
+      </w:r>
+      <w:r>
+        <w:t xml:space="preserve">“</w:t>
+      </w:r>
+      <w:r>
+        <w:t xml:space="preserve">Die gaat stinken tot aan Kerstmis</w:t>
+      </w:r>
+      <w:r>
+        <w:t xml:space="preserve">”</w:t>
+      </w:r>
+      <w:r>
+        <w:t xml:space="preserve">.</w:t>
+      </w:r>
+      <w:r>
+        <w:t xml:space="preserve"> </w:t>
+      </w:r>
+      <w:r>
+        <w:t xml:space="preserve">- Het dekentje ligt in de koffer (de bible noemt H17, H25, H26 en H27; daar komt nu H13 bij).</w:t>
+      </w:r>
+      <w:r>
+        <w:t xml:space="preserve"> </w:t>
+      </w:r>
+      <w:r>
+        <w:t xml:space="preserve">- De tekst van dossier 33 (water) staat in H13.</w:t>
+      </w:r>
+    </w:p>
+    <w:p>
+      <w:pPr>
+        <w:pStyle w:val="BodyText"/>
+      </w:pPr>
+      <w:r>
+        <w:rPr>
+          <w:bCs/>
+          <w:b/>
+        </w:rPr>
+        <w:t xml:space="preserve">Hoofdstuk 18</w:t>
+      </w:r>
+      <w:r>
+        <w:t xml:space="preserve"> </w:t>
+      </w:r>
+      <w:r>
+        <w:t xml:space="preserve">- De vragende blik is</w:t>
+      </w:r>
+      <w:r>
+        <w:t xml:space="preserve"> </w:t>
+      </w:r>
+      <w:r>
+        <w:t xml:space="preserve">“</w:t>
+      </w:r>
+      <w:r>
+        <w:t xml:space="preserve">Lode, lijn, Lode</w:t>
+      </w:r>
+      <w:r>
+        <w:t xml:space="preserve">”</w:t>
+      </w:r>
+      <w:r>
+        <w:t xml:space="preserve">. Hij werkt ook bij de koekjestrommel (</w:t>
+      </w:r>
+      <w:r>
+        <w:t xml:space="preserve">“</w:t>
+      </w:r>
+      <w:r>
+        <w:t xml:space="preserve">Ééntje. En niet tegen haar zeggen.</w:t>
+      </w:r>
+      <w:r>
+        <w:t xml:space="preserve">”</w:t>
+      </w:r>
+      <w:r>
+        <w:t xml:space="preserve">) en bij de tuindeur. Bij Mira zegt Lode</w:t>
+      </w:r>
+      <w:r>
+        <w:t xml:space="preserve"> </w:t>
+      </w:r>
+      <w:r>
+        <w:t xml:space="preserve">“</w:t>
+      </w:r>
+      <w:r>
+        <w:t xml:space="preserve">Nee</w:t>
+      </w:r>
+      <w:r>
+        <w:t xml:space="preserve">”</w:t>
+      </w:r>
+      <w:r>
+        <w:t xml:space="preserve">. Tara meet in knipperingen.</w:t>
+      </w:r>
+    </w:p>
+    <w:p>
+      <w:pPr>
+        <w:pStyle w:val="BodyText"/>
+      </w:pPr>
+      <w:r>
+        <w:rPr>
+          <w:bCs/>
+          <w:b/>
+        </w:rPr>
+        <w:t xml:space="preserve">Hoofdstuk 19</w:t>
+      </w:r>
+      <w:r>
+        <w:t xml:space="preserve"> </w:t>
+      </w:r>
+      <w:r>
+        <w:t xml:space="preserve">- Wanneer Lode naar zijn werk vertrekt, hurkt hij en zegt hij</w:t>
+      </w:r>
+      <w:r>
+        <w:t xml:space="preserve"> </w:t>
+      </w:r>
+      <w:r>
+        <w:t xml:space="preserve">“</w:t>
+      </w:r>
+      <w:r>
+        <w:t xml:space="preserve">Ik kom terug, Tara. Seffens.</w:t>
+      </w:r>
+      <w:r>
+        <w:t xml:space="preserve">”</w:t>
+      </w:r>
+      <w:r>
+        <w:t xml:space="preserve"> </w:t>
+      </w:r>
+      <w:r>
+        <w:t xml:space="preserve">Dat gebeurde niet van in het begin.</w:t>
+      </w:r>
+      <w:r>
+        <w:t xml:space="preserve"> </w:t>
+      </w:r>
+      <w:r>
+        <w:t xml:space="preserve">- De woordenlijst:</w:t>
+      </w:r>
+      <w:r>
+        <w:t xml:space="preserve"> </w:t>
+      </w:r>
+      <w:r>
+        <w:rPr>
+          <w:iCs/>
+          <w:i/>
+        </w:rPr>
+        <w:t xml:space="preserve">wandelen</w:t>
+      </w:r>
+      <w:r>
+        <w:t xml:space="preserve">,</w:t>
+      </w:r>
+      <w:r>
+        <w:t xml:space="preserve"> </w:t>
+      </w:r>
+      <w:r>
+        <w:rPr>
+          <w:iCs/>
+          <w:i/>
+        </w:rPr>
+        <w:t xml:space="preserve">dogtime</w:t>
+      </w:r>
+      <w:r>
+        <w:t xml:space="preserve">,</w:t>
+      </w:r>
+      <w:r>
+        <w:t xml:space="preserve"> </w:t>
+      </w:r>
+      <w:r>
+        <w:rPr>
+          <w:iCs/>
+          <w:i/>
+        </w:rPr>
+        <w:t xml:space="preserve">bal</w:t>
+      </w:r>
+      <w:r>
+        <w:t xml:space="preserve">,</w:t>
+      </w:r>
+      <w:r>
+        <w:t xml:space="preserve"> </w:t>
+      </w:r>
+      <w:r>
+        <w:rPr>
+          <w:iCs/>
+          <w:i/>
+        </w:rPr>
+        <w:t xml:space="preserve">koekje</w:t>
+      </w:r>
+      <w:r>
+        <w:t xml:space="preserve">,</w:t>
+      </w:r>
+      <w:r>
+        <w:t xml:space="preserve"> </w:t>
+      </w:r>
+      <w:r>
+        <w:rPr>
+          <w:iCs/>
+          <w:i/>
+        </w:rPr>
+        <w:t xml:space="preserve">eten</w:t>
+      </w:r>
+      <w:r>
+        <w:t xml:space="preserve">,</w:t>
+      </w:r>
+      <w:r>
+        <w:t xml:space="preserve"> </w:t>
+      </w:r>
+      <w:r>
+        <w:rPr>
+          <w:iCs/>
+          <w:i/>
+        </w:rPr>
+        <w:t xml:space="preserve">auto</w:t>
+      </w:r>
+      <w:r>
+        <w:t xml:space="preserve">,</w:t>
+      </w:r>
+      <w:r>
+        <w:t xml:space="preserve"> </w:t>
+      </w:r>
+      <w:r>
+        <w:rPr>
+          <w:iCs/>
+          <w:i/>
+        </w:rPr>
+        <w:t xml:space="preserve">bad</w:t>
+      </w:r>
+      <w:r>
+        <w:t xml:space="preserve">,</w:t>
+      </w:r>
+      <w:r>
+        <w:t xml:space="preserve"> </w:t>
+      </w:r>
+      <w:r>
+        <w:rPr>
+          <w:iCs/>
+          <w:i/>
+        </w:rPr>
+        <w:t xml:space="preserve">straks</w:t>
+      </w:r>
+      <w:r>
+        <w:t xml:space="preserve">/</w:t>
+      </w:r>
+      <w:r>
+        <w:rPr>
+          <w:iCs/>
+          <w:i/>
+        </w:rPr>
+        <w:t xml:space="preserve">nu</w:t>
+      </w:r>
+      <w:r>
+        <w:t xml:space="preserve">,</w:t>
+      </w:r>
+      <w:r>
+        <w:t xml:space="preserve"> </w:t>
+      </w:r>
+      <w:r>
+        <w:rPr>
+          <w:iCs/>
+          <w:i/>
+        </w:rPr>
+        <w:t xml:space="preserve">kom</w:t>
+      </w:r>
+      <w:r>
+        <w:t xml:space="preserve">,</w:t>
+      </w:r>
+      <w:r>
+        <w:t xml:space="preserve"> </w:t>
+      </w:r>
+      <w:r>
+        <w:rPr>
+          <w:iCs/>
+          <w:i/>
+        </w:rPr>
+        <w:t xml:space="preserve">plaats</w:t>
+      </w:r>
+      <w:r>
+        <w:t xml:space="preserve">,</w:t>
+      </w:r>
+      <w:r>
+        <w:t xml:space="preserve"> </w:t>
+      </w:r>
+      <w:r>
+        <w:rPr>
+          <w:iCs/>
+          <w:i/>
+        </w:rPr>
+        <w:t xml:space="preserve">zoek</w:t>
+      </w:r>
+      <w:r>
+        <w:t xml:space="preserve">,</w:t>
+      </w:r>
+      <w:r>
+        <w:t xml:space="preserve"> </w:t>
+      </w:r>
+      <w:r>
+        <w:rPr>
+          <w:iCs/>
+          <w:i/>
+        </w:rPr>
+        <w:t xml:space="preserve">stok</w:t>
+      </w:r>
+      <w:r>
+        <w:t xml:space="preserve">,</w:t>
+      </w:r>
+      <w:r>
+        <w:t xml:space="preserve"> </w:t>
+      </w:r>
+      <w:r>
+        <w:rPr>
+          <w:iCs/>
+          <w:i/>
+        </w:rPr>
+        <w:t xml:space="preserve">Mieke</w:t>
+      </w:r>
+      <w:r>
+        <w:t xml:space="preserve">,</w:t>
+      </w:r>
+      <w:r>
+        <w:t xml:space="preserve"> </w:t>
+      </w:r>
+      <w:r>
+        <w:rPr>
+          <w:iCs/>
+          <w:i/>
+        </w:rPr>
+        <w:t xml:space="preserve">Sofie</w:t>
+      </w:r>
+      <w:r>
+        <w:t xml:space="preserve">,</w:t>
+      </w:r>
+      <w:r>
+        <w:t xml:space="preserve"> </w:t>
+      </w:r>
+      <w:r>
+        <w:rPr>
+          <w:iCs/>
+          <w:i/>
+        </w:rPr>
+        <w:t xml:space="preserve">Bram</w:t>
+      </w:r>
+      <w:r>
+        <w:t xml:space="preserve">,</w:t>
+      </w:r>
+      <w:r>
+        <w:t xml:space="preserve"> </w:t>
+      </w:r>
+      <w:r>
+        <w:rPr>
+          <w:iCs/>
+          <w:i/>
+        </w:rPr>
+        <w:t xml:space="preserve">Tara</w:t>
+      </w:r>
+      <w:r>
+        <w:t xml:space="preserve">.</w:t>
+      </w:r>
+      <w:r>
+        <w:t xml:space="preserve"> </w:t>
+      </w:r>
+      <w:r>
+        <w:t xml:space="preserve">- Lode spelt</w:t>
+      </w:r>
+      <w:r>
+        <w:t xml:space="preserve"> </w:t>
+      </w:r>
+      <w:r>
+        <w:t xml:space="preserve">“</w:t>
+      </w:r>
+      <w:r>
+        <w:t xml:space="preserve">w-a-n-d-e-l-e-n</w:t>
+      </w:r>
+      <w:r>
+        <w:t xml:space="preserve">”</w:t>
+      </w:r>
+      <w:r>
+        <w:t xml:space="preserve">. Tara leert de spelling, en daarna zegt hij</w:t>
+      </w:r>
+      <w:r>
+        <w:t xml:space="preserve"> </w:t>
+      </w:r>
+      <w:r>
+        <w:t xml:space="preserve">“</w:t>
+      </w:r>
+      <w:r>
+        <w:t xml:space="preserve">een toerke</w:t>
+      </w:r>
+      <w:r>
+        <w:t xml:space="preserve">”</w:t>
+      </w:r>
+      <w:r>
+        <w:t xml:space="preserve">. Mieke spelt nooit.</w:t>
+      </w:r>
+      <w:r>
+        <w:t xml:space="preserve"> </w:t>
+      </w:r>
+      <w:r>
+        <w:t xml:space="preserve">- Tara vraagt om buiten te gaan door stil aan de deur te staan, zonder te krabben of te blaffen.</w:t>
+      </w:r>
+      <w:r>
+        <w:t xml:space="preserve"> </w:t>
+      </w:r>
+      <w:r>
+        <w:t xml:space="preserve">- Voor het eten legt ze haar kop op Lodes schoot. Lode zegt dan</w:t>
+      </w:r>
+      <w:r>
+        <w:t xml:space="preserve"> </w:t>
+      </w:r>
+      <w:r>
+        <w:t xml:space="preserve">“</w:t>
+      </w:r>
+      <w:r>
+        <w:t xml:space="preserve">Allez, allez. Gij en uw bak.</w:t>
+      </w:r>
+      <w:r>
+        <w:t xml:space="preserve">”</w:t>
+      </w:r>
+      <w:r>
+        <w:t xml:space="preserve"> </w:t>
+      </w:r>
+      <w:r>
+        <w:t xml:space="preserve">- Jonas vraagt hoeveel woorden ze verstaat. Lode antwoordt</w:t>
+      </w:r>
+      <w:r>
+        <w:t xml:space="preserve"> </w:t>
+      </w:r>
+      <w:r>
+        <w:t xml:space="preserve">“</w:t>
+      </w:r>
+      <w:r>
+        <w:t xml:space="preserve">Meer dan ge denkt</w:t>
+      </w:r>
+      <w:r>
+        <w:t xml:space="preserve">”</w:t>
+      </w:r>
+      <w:r>
+        <w:t xml:space="preserve">.</w:t>
+      </w:r>
+    </w:p>
+    <w:p>
+      <w:pPr>
+        <w:pStyle w:val="BodyText"/>
+      </w:pPr>
+      <w:r>
+        <w:rPr>
+          <w:bCs/>
+          <w:b/>
+        </w:rPr>
+        <w:t xml:space="preserve">Hoofdstuk 25</w:t>
+      </w:r>
+      <w:r>
+        <w:t xml:space="preserve"> </w:t>
+      </w:r>
+      <w:r>
+        <w:t xml:space="preserve">- Er zitten muizen in de garage, voor de zak brokken. Daar staan ook de fietsen en Lodes laarzen.</w:t>
+      </w:r>
+      <w:r>
+        <w:t xml:space="preserve"> </w:t>
+      </w:r>
+      <w:r>
+        <w:t xml:space="preserve">- Lode legt vijf blauwe blokjes muizengif in een spleet in de achterste muur, achter het rek met de verfpotten. Tara eet ze op toen de zijdeur openstond.</w:t>
+      </w:r>
+      <w:r>
+        <w:t xml:space="preserve"> </w:t>
+      </w:r>
+      <w:r>
+        <w:t xml:space="preserve">- De dierenarts in het dorp geeft een spuitje om te braken, en daarna vier weken vitamine K, in een tweede blokje kaas. Na afloop is de bloedtest in orde.</w:t>
+      </w:r>
+      <w:r>
+        <w:t xml:space="preserve"> </w:t>
+      </w:r>
+      <w:r>
+        <w:t xml:space="preserve">- Lode metselt de spleet dicht en zet vallen met kaas.</w:t>
+      </w:r>
+      <w:r>
+        <w:t xml:space="preserve"> </w:t>
+      </w:r>
+      <w:r>
+        <w:t xml:space="preserve">- Bij de bloedneus doet de dierenarts een tweede bloedtest, die opnieuw in orde is. Daarna volgt de doorverwijzing naar de kliniek aan de steenweg.</w:t>
+      </w:r>
+      <w:r>
+        <w:t xml:space="preserve"> </w:t>
+      </w:r>
+      <w:r>
+        <w:t xml:space="preserve">- Lotte ligt naast de mand en kijkt naar Tara’s neus zonder te wijzen.</w:t>
+      </w:r>
+    </w:p>
+    <w:p>
+      <w:pPr>
+        <w:pStyle w:val="BodyText"/>
+      </w:pPr>
+      <w:r>
+        <w:rPr>
+          <w:bCs/>
+          <w:b/>
+        </w:rPr>
+        <w:t xml:space="preserve">Hoofdstuk 27</w:t>
+      </w:r>
+      <w:r>
+        <w:t xml:space="preserve"> </w:t>
+      </w:r>
+      <w:r>
+        <w:t xml:space="preserve">- Lode twijfelt of het gif Tara verzwakt heeft. Die vraag blijft open.</w:t>
+      </w:r>
+    </w:p>
+    <w:p>
+      <w:pPr>
+        <w:pStyle w:val="BodyText"/>
+      </w:pPr>
+      <w:r>
+        <w:rPr>
+          <w:bCs/>
+          <w:b/>
+        </w:rPr>
+        <w:t xml:space="preserve">Epiloog</w:t>
+      </w:r>
+      <w:r>
+        <w:t xml:space="preserve"> </w:t>
+      </w:r>
+      <w:r>
+        <w:t xml:space="preserve">- Lode zegt</w:t>
+      </w:r>
+      <w:r>
+        <w:t xml:space="preserve"> </w:t>
+      </w:r>
+      <w:r>
+        <w:t xml:space="preserve">“</w:t>
+      </w:r>
+      <w:r>
+        <w:t xml:space="preserve">Ik kom terug</w:t>
+      </w:r>
+      <w:r>
+        <w:t xml:space="preserve">”</w:t>
+      </w:r>
+      <w:r>
+        <w:t xml:space="preserve"> </w:t>
+      </w:r>
+      <w:r>
+        <w:t xml:space="preserve">als hij naar de bakker gaat.</w:t>
+      </w:r>
+      <w:r>
+        <w:t xml:space="preserve"> </w:t>
+      </w:r>
+      <w:r>
+        <w:t xml:space="preserve">- Bij etenstijd kijkt hij naar zijn schoot. ’s Avonds snijdt hij het laatste stukje vlees apart, en hij controleert of de bal in de mand ligt.</w:t>
+      </w:r>
+      <w:r>
+        <w:t xml:space="preserve"> </w:t>
+      </w:r>
+      <w:r>
+        <w:t xml:space="preserve">- Hij wandelt na de koffie, via de zandweg en de paal met het bordje, naar de heide met het grote ven. Daar zit een tak vast in het ijs.</w:t>
+      </w:r>
+      <w:r>
+        <w:t xml:space="preserve"> </w:t>
+      </w:r>
+      <w:r>
+        <w:t xml:space="preserve">- Bram vraagt of ze</w:t>
+      </w:r>
+      <w:r>
+        <w:t xml:space="preserve"> </w:t>
+      </w:r>
+      <w:r>
+        <w:t xml:space="preserve">“</w:t>
+      </w:r>
+      <w:r>
+        <w:t xml:space="preserve">deze zomer</w:t>
+      </w:r>
+      <w:r>
+        <w:t xml:space="preserve">”</w:t>
+      </w:r>
+      <w:r>
+        <w:t xml:space="preserve"> </w:t>
+      </w:r>
+      <w:r>
+        <w:t xml:space="preserve">naar zee gaan.</w:t>
+      </w:r>
+    </w:p>
+    <w:bookmarkEnd w:id="117"/>
+    <w:bookmarkEnd w:id="118"/>
     <w:sectPr/>
   </w:body>
 </w:document>
@@ -14665,6 +15855,42 @@
     <w:abstractNumId w:val="991"/>
   </w:num>
   <w:num w:numId="1052">
+    <w:abstractNumId w:val="991"/>
+  </w:num>
+  <w:num w:numId="1053">
+    <w:abstractNumId w:val="99411"/>
+    <w:lvlOverride w:ilvl="0">
+      <w:startOverride w:val="1"/>
+    </w:lvlOverride>
+    <w:lvlOverride w:ilvl="1">
+      <w:startOverride w:val="1"/>
+    </w:lvlOverride>
+    <w:lvlOverride w:ilvl="2">
+      <w:startOverride w:val="1"/>
+    </w:lvlOverride>
+    <w:lvlOverride w:ilvl="3">
+      <w:startOverride w:val="1"/>
+    </w:lvlOverride>
+    <w:lvlOverride w:ilvl="4">
+      <w:startOverride w:val="1"/>
+    </w:lvlOverride>
+    <w:lvlOverride w:ilvl="5">
+      <w:startOverride w:val="1"/>
+    </w:lvlOverride>
+    <w:lvlOverride w:ilvl="6">
+      <w:startOverride w:val="1"/>
+    </w:lvlOverride>
+    <w:lvlOverride w:ilvl="7">
+      <w:startOverride w:val="1"/>
+    </w:lvlOverride>
+    <w:lvlOverride w:ilvl="8">
+      <w:startOverride w:val="1"/>
+    </w:lvlOverride>
+  </w:num>
+  <w:num w:numId="1054">
+    <w:abstractNumId w:val="991"/>
+  </w:num>
+  <w:num w:numId="1055">
     <w:abstractNumId w:val="991"/>
   </w:num>
 </w:numbering>

</xml_diff>

<commit_message>
Tara, een Hondenleven: manuscript v3 na stijlronde
Stijlronde over het hele boek, bijlage toegevoegd, story bible v8 afgerond.

Co-Authored-By: Claude Opus 5.5 <noreply@anthropic.com>
Claude-Session: https://claude.ai/code/session_011xXeHb7kuJsamVtPUp8TTz
</commit_message>
<xml_diff>
--- a/tara-een-hondenleven/story-bible/Story_Bible_Tara_een_Hondenleven.docx
+++ b/tara-een-hondenleven/story-bible/Story_Bible_Tara_een_Hondenleven.docx
@@ -45,7 +45,7 @@
         <w:t xml:space="preserve"> </w:t>
       </w:r>
       <w:r>
-        <w:t xml:space="preserve">7</w:t>
+        <w:t xml:space="preserve">8</w:t>
       </w:r>
       <w:r>
         <w:t xml:space="preserve"> </w:t>
@@ -9498,6 +9498,28 @@
           <w:bCs/>
           <w:b/>
         </w:rPr>
+        <w:t xml:space="preserve">Dossier 33 (nieuw):</w:t>
+      </w:r>
+      <w:r>
+        <w:t xml:space="preserve"> </w:t>
+      </w:r>
+      <w:r>
+        <w:t xml:space="preserve">water. Status: reukloos, volgens mensen.</w:t>
+      </w:r>
+    </w:p>
+    <w:p>
+      <w:pPr>
+        <w:numPr>
+          <w:ilvl w:val="0"/>
+          <w:numId w:val="1017"/>
+        </w:numPr>
+        <w:pStyle w:val="Compact"/>
+      </w:pPr>
+      <w:r>
+        <w:rPr>
+          <w:bCs/>
+          <w:b/>
+        </w:rPr>
         <w:t xml:space="preserve">Dossier 41:</w:t>
       </w:r>
       <w:r>
@@ -15242,6 +15264,584 @@
     </w:p>
     <w:bookmarkEnd w:id="117"/>
     <w:bookmarkEnd w:id="118"/>
+    <w:bookmarkStart w:id="119" w:name="X6d7311707c3588d861f14df02f16dbfb37afcef"/>
+    <w:p>
+      <w:pPr>
+        <w:pStyle w:val="Heading1"/>
+      </w:pPr>
+      <w:r>
+        <w:t xml:space="preserve">23. Versie 8: aanvullingen uit de externe beoordelingen</w:t>
+      </w:r>
+    </w:p>
+    <w:p>
+      <w:pPr>
+        <w:pStyle w:val="FirstParagraph"/>
+      </w:pPr>
+      <w:r>
+        <w:t xml:space="preserve">Op basis van drie externe beoordelingen, met toestemming van de auteur, zijn deze verbeteringen doorgevoerd.</w:t>
+      </w:r>
+    </w:p>
+    <w:p>
+      <w:pPr>
+        <w:pStyle w:val="BodyText"/>
+      </w:pPr>
+      <w:r>
+        <w:rPr>
+          <w:bCs/>
+          <w:b/>
+        </w:rPr>
+        <w:t xml:space="preserve">Gecorrigeerd</w:t>
+      </w:r>
+      <w:r>
+        <w:t xml:space="preserve"> </w:t>
+      </w:r>
+      <w:r>
+        <w:t xml:space="preserve">-</w:t>
+      </w:r>
+      <w:r>
+        <w:t xml:space="preserve"> </w:t>
+      </w:r>
+      <w:r>
+        <w:rPr>
+          <w:bCs/>
+          <w:b/>
+        </w:rPr>
+        <w:t xml:space="preserve">De telfout in het nest (hoofdstuk 2):</w:t>
+      </w:r>
+      <w:r>
+        <w:t xml:space="preserve"> </w:t>
+      </w:r>
+      <w:r>
+        <w:t xml:space="preserve">zes pups staan in de schaal, twee liggen erin, en het zusje staat aan de rand.</w:t>
+      </w:r>
+      <w:r>
+        <w:t xml:space="preserve"> </w:t>
+      </w:r>
+      <w:r>
+        <w:t xml:space="preserve">-</w:t>
+      </w:r>
+      <w:r>
+        <w:t xml:space="preserve"> </w:t>
+      </w:r>
+      <w:r>
+        <w:rPr>
+          <w:bCs/>
+          <w:b/>
+        </w:rPr>
+        <w:t xml:space="preserve">Dossier 41</w:t>
+      </w:r>
+      <w:r>
+        <w:t xml:space="preserve"> </w:t>
+      </w:r>
+      <w:r>
+        <w:t xml:space="preserve">heet de tweede keer</w:t>
+      </w:r>
+      <w:r>
+        <w:t xml:space="preserve"> </w:t>
+      </w:r>
+      <w:r>
+        <w:t xml:space="preserve">“</w:t>
+      </w:r>
+      <w:r>
+        <w:t xml:space="preserve">41 (herzien)</w:t>
+      </w:r>
+      <w:r>
+        <w:t xml:space="preserve">”</w:t>
+      </w:r>
+      <w:r>
+        <w:t xml:space="preserve">.</w:t>
+      </w:r>
+      <w:r>
+        <w:t xml:space="preserve"> </w:t>
+      </w:r>
+      <w:r>
+        <w:t xml:space="preserve">-</w:t>
+      </w:r>
+      <w:r>
+        <w:t xml:space="preserve"> </w:t>
+      </w:r>
+      <w:r>
+        <w:rPr>
+          <w:bCs/>
+          <w:b/>
+        </w:rPr>
+        <w:t xml:space="preserve">De bijlage</w:t>
+      </w:r>
+      <w:r>
+        <w:t xml:space="preserve"> </w:t>
+      </w:r>
+      <w:r>
+        <w:t xml:space="preserve">(29_Bijlage.md) is geschreven. Ze verklaart de verspringende nummering en eindigt met</w:t>
+      </w:r>
+      <w:r>
+        <w:t xml:space="preserve"> </w:t>
+      </w:r>
+      <w:r>
+        <w:t xml:space="preserve">“</w:t>
+      </w:r>
+      <w:r>
+        <w:t xml:space="preserve">Status: afgesloten door de proefpersoon.</w:t>
+      </w:r>
+      <w:r>
+        <w:t xml:space="preserve">”</w:t>
+      </w:r>
+    </w:p>
+    <w:p>
+      <w:pPr>
+        <w:pStyle w:val="BodyText"/>
+      </w:pPr>
+      <w:r>
+        <w:rPr>
+          <w:bCs/>
+          <w:b/>
+        </w:rPr>
+        <w:t xml:space="preserve">Toegevoegd</w:t>
+      </w:r>
+      <w:r>
+        <w:t xml:space="preserve"> </w:t>
+      </w:r>
+      <w:r>
+        <w:t xml:space="preserve">-</w:t>
+      </w:r>
+      <w:r>
+        <w:t xml:space="preserve"> </w:t>
+      </w:r>
+      <w:r>
+        <w:rPr>
+          <w:bCs/>
+          <w:b/>
+        </w:rPr>
+        <w:t xml:space="preserve">Mieke krijgt een fout (hoofdstuk 21).</w:t>
+      </w:r>
+      <w:r>
+        <w:t xml:space="preserve"> </w:t>
+      </w:r>
+      <w:r>
+        <w:t xml:space="preserve">- Ze geeft Tara stiekem kaaskorstjes en koek, ook met de kinderen op kinderdag (</w:t>
+      </w:r>
+      <w:r>
+        <w:t xml:space="preserve">“</w:t>
+      </w:r>
+      <w:r>
+        <w:t xml:space="preserve">Niet aan opa zeggen</w:t>
+      </w:r>
+      <w:r>
+        <w:t xml:space="preserve">”</w:t>
+      </w:r>
+      <w:r>
+        <w:t xml:space="preserve">).</w:t>
+      </w:r>
+      <w:r>
+        <w:t xml:space="preserve"> </w:t>
+      </w:r>
+      <w:r>
+        <w:t xml:space="preserve">- Intussen berispt ze Lode als hij aan tafel deelt.</w:t>
+      </w:r>
+      <w:r>
+        <w:t xml:space="preserve"> </w:t>
+      </w:r>
+      <w:r>
+        <w:t xml:space="preserve">- De dierenarts heeft een zwarte rubberen weegplaat en zegt:</w:t>
+      </w:r>
+      <w:r>
+        <w:t xml:space="preserve"> </w:t>
+      </w:r>
+      <w:r>
+        <w:t xml:space="preserve">“</w:t>
+      </w:r>
+      <w:r>
+        <w:t xml:space="preserve">Ze mag er een paar kilo af.</w:t>
+      </w:r>
+      <w:r>
+        <w:t xml:space="preserve">”</w:t>
+      </w:r>
+      <w:r>
+        <w:t xml:space="preserve"> </w:t>
+      </w:r>
+      <w:r>
+        <w:t xml:space="preserve">- Lode betrapt haar, en eet het korstje zelf op:</w:t>
+      </w:r>
+      <w:r>
+        <w:t xml:space="preserve"> </w:t>
+      </w:r>
+      <w:r>
+        <w:t xml:space="preserve">“</w:t>
+      </w:r>
+      <w:r>
+        <w:t xml:space="preserve">Dan zijn we met twee. Dat heet een roedel.</w:t>
+      </w:r>
+      <w:r>
+        <w:t xml:space="preserve">”</w:t>
+      </w:r>
+      <w:r>
+        <w:t xml:space="preserve"> </w:t>
+      </w:r>
+      <w:r>
+        <w:t xml:space="preserve">-</w:t>
+      </w:r>
+      <w:r>
+        <w:t xml:space="preserve"> </w:t>
+      </w:r>
+      <w:r>
+        <w:rPr>
+          <w:bCs/>
+          <w:b/>
+        </w:rPr>
+        <w:t xml:space="preserve">De wolf komt terug (epiloog).</w:t>
+      </w:r>
+      <w:r>
+        <w:t xml:space="preserve"> </w:t>
+      </w:r>
+      <w:r>
+        <w:t xml:space="preserve">- Bij het ven ziet Lode een vers wolvenspoor met vorst in de randen.</w:t>
+      </w:r>
+      <w:r>
+        <w:t xml:space="preserve"> </w:t>
+      </w:r>
+      <w:r>
+        <w:t xml:space="preserve">- De afdrukken houden op een paar passen voor de oude den met de kromme voet.</w:t>
+      </w:r>
+      <w:r>
+        <w:t xml:space="preserve"> </w:t>
+      </w:r>
+      <w:r>
+        <w:t xml:space="preserve">- Lode brengt zijn neus er bewust niet bij.</w:t>
+      </w:r>
+      <w:r>
+        <w:t xml:space="preserve"> </w:t>
+      </w:r>
+      <w:r>
+        <w:t xml:space="preserve">-</w:t>
+      </w:r>
+      <w:r>
+        <w:t xml:space="preserve"> </w:t>
+      </w:r>
+      <w:r>
+        <w:rPr>
+          <w:bCs/>
+          <w:b/>
+        </w:rPr>
+        <w:t xml:space="preserve">Mira in de verhaaltekst:</w:t>
+      </w:r>
+      <w:r>
+        <w:t xml:space="preserve"> </w:t>
+      </w:r>
+      <w:r>
+        <w:t xml:space="preserve">-</w:t>
+      </w:r>
+      <w:r>
+        <w:t xml:space="preserve"> </w:t>
+      </w:r>
+      <w:r>
+        <w:rPr>
+          <w:bCs/>
+          <w:b/>
+        </w:rPr>
+        <w:t xml:space="preserve">hoofdstuk 11:</w:t>
+      </w:r>
+      <w:r>
+        <w:t xml:space="preserve"> </w:t>
+      </w:r>
+      <w:r>
+        <w:t xml:space="preserve">ze bekijkt de rode kater vanop de vensterbank aan de tuinkant;</w:t>
+      </w:r>
+      <w:r>
+        <w:t xml:space="preserve"> </w:t>
+      </w:r>
+      <w:r>
+        <w:t xml:space="preserve">-</w:t>
+      </w:r>
+      <w:r>
+        <w:t xml:space="preserve"> </w:t>
+      </w:r>
+      <w:r>
+        <w:rPr>
+          <w:bCs/>
+          <w:b/>
+        </w:rPr>
+        <w:t xml:space="preserve">hoofdstuk 16:</w:t>
+      </w:r>
+      <w:r>
+        <w:t xml:space="preserve"> </w:t>
+      </w:r>
+      <w:r>
+        <w:t xml:space="preserve">ze ligt in Tara’s mand, en Tara slaapt op de tegels;</w:t>
+      </w:r>
+      <w:r>
+        <w:t xml:space="preserve"> </w:t>
+      </w:r>
+      <w:r>
+        <w:t xml:space="preserve">-</w:t>
+      </w:r>
+      <w:r>
+        <w:t xml:space="preserve"> </w:t>
+      </w:r>
+      <w:r>
+        <w:rPr>
+          <w:bCs/>
+          <w:b/>
+        </w:rPr>
+        <w:t xml:space="preserve">hoofdstuk 22:</w:t>
+      </w:r>
+      <w:r>
+        <w:t xml:space="preserve"> </w:t>
+      </w:r>
+      <w:r>
+        <w:t xml:space="preserve">ze legt een poot op de plek op Lodes rug (</w:t>
+      </w:r>
+      <w:r>
+        <w:t xml:space="preserve">“</w:t>
+      </w:r>
+      <w:r>
+        <w:t xml:space="preserve">Gij ook al?</w:t>
+      </w:r>
+      <w:r>
+        <w:t xml:space="preserve">”</w:t>
+      </w:r>
+      <w:r>
+        <w:t xml:space="preserve">).</w:t>
+      </w:r>
+      <w:r>
+        <w:t xml:space="preserve"> </w:t>
+      </w:r>
+      <w:r>
+        <w:t xml:space="preserve">-</w:t>
+      </w:r>
+      <w:r>
+        <w:t xml:space="preserve"> </w:t>
+      </w:r>
+      <w:r>
+        <w:rPr>
+          <w:bCs/>
+          <w:b/>
+        </w:rPr>
+        <w:t xml:space="preserve">Sofie en haar vader (hoofdstuk 24).</w:t>
+      </w:r>
+      <w:r>
+        <w:t xml:space="preserve"> </w:t>
+      </w:r>
+      <w:r>
+        <w:t xml:space="preserve">- Als kind reed Sofie twee keer tegen de kerkmuur, terwijl Lode riep:</w:t>
+      </w:r>
+      <w:r>
+        <w:t xml:space="preserve"> </w:t>
+      </w:r>
+      <w:r>
+        <w:t xml:space="preserve">“</w:t>
+      </w:r>
+      <w:r>
+        <w:t xml:space="preserve">Trappen, Sofie.</w:t>
+      </w:r>
+      <w:r>
+        <w:t xml:space="preserve">”</w:t>
+      </w:r>
+      <w:r>
+        <w:t xml:space="preserve"> </w:t>
+      </w:r>
+      <w:r>
+        <w:t xml:space="preserve">- Nu erkent hij:</w:t>
+      </w:r>
+      <w:r>
+        <w:t xml:space="preserve"> </w:t>
+      </w:r>
+      <w:r>
+        <w:t xml:space="preserve">“</w:t>
+      </w:r>
+      <w:r>
+        <w:t xml:space="preserve">Ik wist het niet beter. Toen.</w:t>
+      </w:r>
+      <w:r>
+        <w:t xml:space="preserve">”</w:t>
+      </w:r>
+      <w:r>
+        <w:t xml:space="preserve"> </w:t>
+      </w:r>
+      <w:r>
+        <w:t xml:space="preserve">- Hij schuift zijn pink tegen de hare.</w:t>
+      </w:r>
+      <w:r>
+        <w:t xml:space="preserve"> </w:t>
+      </w:r>
+      <w:r>
+        <w:t xml:space="preserve">-</w:t>
+      </w:r>
+      <w:r>
+        <w:t xml:space="preserve"> </w:t>
+      </w:r>
+      <w:r>
+        <w:rPr>
+          <w:bCs/>
+          <w:b/>
+        </w:rPr>
+        <w:t xml:space="preserve">Leven zonder neus (hoofdstuk 25).</w:t>
+      </w:r>
+      <w:r>
+        <w:t xml:space="preserve"> </w:t>
+      </w:r>
+      <w:r>
+        <w:t xml:space="preserve">- De zevende trede piept onder Mieke kort en hoog, onder Lode lang en laag; daaraan herkent Tara hen nog.</w:t>
+      </w:r>
+      <w:r>
+        <w:t xml:space="preserve"> </w:t>
+      </w:r>
+      <w:r>
+        <w:t xml:space="preserve">- Ze blijft te lang op de drempel van de tuindeur staan, tot Lode zegt:</w:t>
+      </w:r>
+      <w:r>
+        <w:t xml:space="preserve"> </w:t>
+      </w:r>
+      <w:r>
+        <w:t xml:space="preserve">“</w:t>
+      </w:r>
+      <w:r>
+        <w:t xml:space="preserve">Ik ga mee.</w:t>
+      </w:r>
+      <w:r>
+        <w:t xml:space="preserve">”</w:t>
+      </w:r>
+      <w:r>
+        <w:t xml:space="preserve"> </w:t>
+      </w:r>
+      <w:r>
+        <w:t xml:space="preserve">- Als zijn hand haar in haar slaap verrast, trekt ze haar lippen op.</w:t>
+      </w:r>
+      <w:r>
+        <w:t xml:space="preserve"> </w:t>
+      </w:r>
+      <w:r>
+        <w:t xml:space="preserve">- Daarna kondigt Lode zich aan met twee keer klappen en</w:t>
+      </w:r>
+      <w:r>
+        <w:t xml:space="preserve"> </w:t>
+      </w:r>
+      <w:r>
+        <w:t xml:space="preserve">“</w:t>
+      </w:r>
+      <w:r>
+        <w:t xml:space="preserve">Tara. Ik ben het</w:t>
+      </w:r>
+      <w:r>
+        <w:t xml:space="preserve">”</w:t>
+      </w:r>
+      <w:r>
+        <w:t xml:space="preserve">. Op het grasveld zwaait hij met zijn pet in plaats van te fluiten.</w:t>
+      </w:r>
+    </w:p>
+    <w:p>
+      <w:pPr>
+        <w:pStyle w:val="BodyText"/>
+      </w:pPr>
+      <w:r>
+        <w:rPr>
+          <w:bCs/>
+          <w:b/>
+        </w:rPr>
+        <w:t xml:space="preserve">Afgerond:</w:t>
+      </w:r>
+      <w:r>
+        <w:t xml:space="preserve"> </w:t>
+      </w:r>
+      <w:r>
+        <w:t xml:space="preserve">een stijlronde over het hele boek.</w:t>
+      </w:r>
+      <w:r>
+        <w:t xml:space="preserve"> </w:t>
+      </w:r>
+      <w:r>
+        <w:t xml:space="preserve">- Resultaat: ongeveer 59.000 woorden, zo’n 218 bladzijden van 6 x 9 inch.</w:t>
+      </w:r>
+      <w:r>
+        <w:t xml:space="preserve"> </w:t>
+      </w:r>
+      <w:r>
+        <w:t xml:space="preserve">-</w:t>
+      </w:r>
+      <w:r>
+        <w:t xml:space="preserve"> </w:t>
+      </w:r>
+      <w:r>
+        <w:t xml:space="preserve">“</w:t>
+      </w:r>
+      <w:r>
+        <w:t xml:space="preserve">Metalig</w:t>
+      </w:r>
+      <w:r>
+        <w:t xml:space="preserve">”</w:t>
+      </w:r>
+      <w:r>
+        <w:t xml:space="preserve"> </w:t>
+      </w:r>
+      <w:r>
+        <w:t xml:space="preserve">en</w:t>
+      </w:r>
+      <w:r>
+        <w:t xml:space="preserve"> </w:t>
+      </w:r>
+      <w:r>
+        <w:t xml:space="preserve">“</w:t>
+      </w:r>
+      <w:r>
+        <w:t xml:space="preserve">Hij zei niets</w:t>
+      </w:r>
+      <w:r>
+        <w:t xml:space="preserve">”</w:t>
+      </w:r>
+      <w:r>
+        <w:t xml:space="preserve"> </w:t>
+      </w:r>
+      <w:r>
+        <w:t xml:space="preserve">worden uitgedund.</w:t>
+      </w:r>
+      <w:r>
+        <w:t xml:space="preserve"> </w:t>
+      </w:r>
+      <w:r>
+        <w:t xml:space="preserve">- Het lied wordt na hoofdstuk 10 korter vermeld.</w:t>
+      </w:r>
+      <w:r>
+        <w:t xml:space="preserve"> </w:t>
+      </w:r>
+      <w:r>
+        <w:t xml:space="preserve">-</w:t>
+      </w:r>
+      <w:r>
+        <w:t xml:space="preserve"> </w:t>
+      </w:r>
+      <w:r>
+        <w:t xml:space="preserve">“</w:t>
+      </w:r>
+      <w:r>
+        <w:t xml:space="preserve">Ge</w:t>
+      </w:r>
+      <w:r>
+        <w:t xml:space="preserve">”</w:t>
+      </w:r>
+      <w:r>
+        <w:t xml:space="preserve"> </w:t>
+      </w:r>
+      <w:r>
+        <w:t xml:space="preserve">en</w:t>
+      </w:r>
+      <w:r>
+        <w:t xml:space="preserve"> </w:t>
+      </w:r>
+      <w:r>
+        <w:t xml:space="preserve">“</w:t>
+      </w:r>
+      <w:r>
+        <w:t xml:space="preserve">gij</w:t>
+      </w:r>
+      <w:r>
+        <w:t xml:space="preserve">”</w:t>
+      </w:r>
+      <w:r>
+        <w:t xml:space="preserve"> </w:t>
+      </w:r>
+      <w:r>
+        <w:t xml:space="preserve">worden consequent gebruikt.</w:t>
+      </w:r>
+    </w:p>
+    <w:bookmarkEnd w:id="119"/>
     <w:sectPr/>
   </w:body>
 </w:document>

</xml_diff>

<commit_message>
Zij koos mij: publicatieklaar
Correctorsronde tweede helft, KDP-binnenwerk 6x9 (215 bladzijden),
proef-PDF, EPUB, definitief manuscript en story bible v9.

Co-Authored-By: Claude Opus 5.5 <noreply@anthropic.com>
Claude-Session: https://claude.ai/code/session_011xXeHb7kuJsamVtPUp8TTz
</commit_message>
<xml_diff>
--- a/tara-een-hondenleven/story-bible/Story_Bible_Tara_een_Hondenleven.docx
+++ b/tara-een-hondenleven/story-bible/Story_Bible_Tara_een_Hondenleven.docx
@@ -7,7 +7,45 @@
         <w:pStyle w:val="Title"/>
       </w:pPr>
       <w:r>
-        <w:t xml:space="preserve">Tara,</w:t>
+        <w:t xml:space="preserve">Zij</w:t>
+      </w:r>
+      <w:r>
+        <w:t xml:space="preserve"> </w:t>
+      </w:r>
+      <w:r>
+        <w:t xml:space="preserve">koos</w:t>
+      </w:r>
+      <w:r>
+        <w:t xml:space="preserve"> </w:t>
+      </w:r>
+      <w:r>
+        <w:t xml:space="preserve">mij</w:t>
+      </w:r>
+    </w:p>
+    <w:p>
+      <w:pPr>
+        <w:pStyle w:val="Subtitle"/>
+      </w:pPr>
+      <w:r>
+        <w:t xml:space="preserve">Het</w:t>
+      </w:r>
+      <w:r>
+        <w:t xml:space="preserve"> </w:t>
+      </w:r>
+      <w:r>
+        <w:t xml:space="preserve">geheime</w:t>
+      </w:r>
+      <w:r>
+        <w:t xml:space="preserve"> </w:t>
+      </w:r>
+      <w:r>
+        <w:t xml:space="preserve">onderzoeksrapport</w:t>
+      </w:r>
+      <w:r>
+        <w:t xml:space="preserve"> </w:t>
+      </w:r>
+      <w:r>
+        <w:t xml:space="preserve">van</w:t>
       </w:r>
       <w:r>
         <w:t xml:space="preserve"> </w:t>
@@ -19,13 +57,11 @@
         <w:t xml:space="preserve"> </w:t>
       </w:r>
       <w:r>
-        <w:t xml:space="preserve">Hondenleven</w:t>
-      </w:r>
-    </w:p>
-    <w:p>
-      <w:pPr>
-        <w:pStyle w:val="Subtitle"/>
-      </w:pPr>
+        <w:t xml:space="preserve">Labrador.</w:t>
+      </w:r>
+      <w:r>
+        <w:t xml:space="preserve"> </w:t>
+      </w:r>
       <w:r>
         <w:t xml:space="preserve">Story</w:t>
       </w:r>
@@ -45,7 +81,7 @@
         <w:t xml:space="preserve"> </w:t>
       </w:r>
       <w:r>
-        <w:t xml:space="preserve">8</w:t>
+        <w:t xml:space="preserve">9</w:t>
       </w:r>
       <w:r>
         <w:t xml:space="preserve"> </w:t>
@@ -15842,6 +15878,198 @@
       </w:r>
     </w:p>
     <w:bookmarkEnd w:id="119"/>
+    <w:bookmarkStart w:id="120" w:name="versie-9-titel-en-publicatie"/>
+    <w:p>
+      <w:pPr>
+        <w:pStyle w:val="Heading1"/>
+      </w:pPr>
+      <w:r>
+        <w:t xml:space="preserve">24. Versie 9: titel en publicatie</w:t>
+      </w:r>
+    </w:p>
+    <w:p>
+      <w:pPr>
+        <w:pStyle w:val="FirstParagraph"/>
+      </w:pPr>
+      <w:r>
+        <w:rPr>
+          <w:bCs/>
+          <w:b/>
+        </w:rPr>
+        <w:t xml:space="preserve">Titel</w:t>
+      </w:r>
+      <w:r>
+        <w:t xml:space="preserve"> </w:t>
+      </w:r>
+      <w:r>
+        <w:t xml:space="preserve">- De definitieve titel is</w:t>
+      </w:r>
+      <w:r>
+        <w:t xml:space="preserve"> </w:t>
+      </w:r>
+      <w:r>
+        <w:rPr>
+          <w:iCs/>
+          <w:i/>
+        </w:rPr>
+        <w:t xml:space="preserve">Zij koos mij</w:t>
+      </w:r>
+      <w:r>
+        <w:t xml:space="preserve">, met als ondertitel</w:t>
+      </w:r>
+      <w:r>
+        <w:t xml:space="preserve"> </w:t>
+      </w:r>
+      <w:r>
+        <w:rPr>
+          <w:iCs/>
+          <w:i/>
+        </w:rPr>
+        <w:t xml:space="preserve">Het geheime onderzoeksrapport van een Labrador</w:t>
+      </w:r>
+      <w:r>
+        <w:t xml:space="preserve">. De auteur heeft die gekozen.</w:t>
+      </w:r>
+      <w:r>
+        <w:t xml:space="preserve"> </w:t>
+      </w:r>
+      <w:r>
+        <w:t xml:space="preserve">-</w:t>
+      </w:r>
+      <w:r>
+        <w:t xml:space="preserve"> </w:t>
+      </w:r>
+      <w:r>
+        <w:rPr>
+          <w:iCs/>
+          <w:i/>
+        </w:rPr>
+        <w:t xml:space="preserve">Tara, een Hondenleven</w:t>
+      </w:r>
+      <w:r>
+        <w:t xml:space="preserve"> </w:t>
+      </w:r>
+      <w:r>
+        <w:t xml:space="preserve">is de werktitel. Die viel af, omdat</w:t>
+      </w:r>
+      <w:r>
+        <w:t xml:space="preserve"> </w:t>
+      </w:r>
+      <w:r>
+        <w:t xml:space="preserve">“</w:t>
+      </w:r>
+      <w:r>
+        <w:t xml:space="preserve">een hondenleven</w:t>
+      </w:r>
+      <w:r>
+        <w:t xml:space="preserve">”</w:t>
+      </w:r>
+      <w:r>
+        <w:t xml:space="preserve"> </w:t>
+      </w:r>
+      <w:r>
+        <w:t xml:space="preserve">in het Nederlands ook</w:t>
+      </w:r>
+      <w:r>
+        <w:t xml:space="preserve"> </w:t>
+      </w:r>
+      <w:r>
+        <w:t xml:space="preserve">“</w:t>
+      </w:r>
+      <w:r>
+        <w:t xml:space="preserve">een ellendig leven</w:t>
+      </w:r>
+      <w:r>
+        <w:t xml:space="preserve">”</w:t>
+      </w:r>
+      <w:r>
+        <w:t xml:space="preserve"> </w:t>
+      </w:r>
+      <w:r>
+        <w:t xml:space="preserve">betekent.</w:t>
+      </w:r>
+    </w:p>
+    <w:p>
+      <w:pPr>
+        <w:pStyle w:val="BodyText"/>
+      </w:pPr>
+      <w:r>
+        <w:rPr>
+          <w:bCs/>
+          <w:b/>
+        </w:rPr>
+        <w:t xml:space="preserve">Afgerond</w:t>
+      </w:r>
+      <w:r>
+        <w:t xml:space="preserve"> </w:t>
+      </w:r>
+      <w:r>
+        <w:t xml:space="preserve">- Een correctorsronde over het hele boek, met 50 correcties.</w:t>
+      </w:r>
+      <w:r>
+        <w:t xml:space="preserve"> </w:t>
+      </w:r>
+      <w:r>
+        <w:t xml:space="preserve">- Het KDP-binnenwerk van 6 x 9 inch: ongeveer 215 bladzijden, met titelpagina, colofon, motto, inhoudsopgave en paginanummers.</w:t>
+      </w:r>
+      <w:r>
+        <w:t xml:space="preserve"> </w:t>
+      </w:r>
+      <w:r>
+        <w:t xml:space="preserve">- Een EPUB.</w:t>
+      </w:r>
+      <w:r>
+        <w:t xml:space="preserve"> </w:t>
+      </w:r>
+      <w:r>
+        <w:t xml:space="preserve">- De publicatieteksten: achterflap, KDP-beschrijving, trefwoorden, categorieën en een coverbriefing.</w:t>
+      </w:r>
+    </w:p>
+    <w:p>
+      <w:pPr>
+        <w:pStyle w:val="BodyText"/>
+      </w:pPr>
+      <w:r>
+        <w:t xml:space="preserve">Alles staat in de map publicatie/.</w:t>
+      </w:r>
+    </w:p>
+    <w:p>
+      <w:pPr>
+        <w:pStyle w:val="BodyText"/>
+      </w:pPr>
+      <w:r>
+        <w:rPr>
+          <w:bCs/>
+          <w:b/>
+        </w:rPr>
+        <w:t xml:space="preserve">Nog door de auteur te bevestigen of te regelen</w:t>
+      </w:r>
+      <w:r>
+        <w:t xml:space="preserve"> </w:t>
+      </w:r>
+      <w:r>
+        <w:t xml:space="preserve">- De auteursnaam. Voorlopig staat er Patrik Verstraelen, overgenomen van het vorige boek.</w:t>
+      </w:r>
+      <w:r>
+        <w:t xml:space="preserve"> </w:t>
+      </w:r>
+      <w:r>
+        <w:t xml:space="preserve">- Een ISBN.</w:t>
+      </w:r>
+      <w:r>
+        <w:t xml:space="preserve"> </w:t>
+      </w:r>
+      <w:r>
+        <w:t xml:space="preserve">- De cover.</w:t>
+      </w:r>
+      <w:r>
+        <w:t xml:space="preserve"> </w:t>
+      </w:r>
+      <w:r>
+        <w:t xml:space="preserve">- Eventueel een opdracht.</w:t>
+      </w:r>
+    </w:p>
+    <w:bookmarkEnd w:id="120"/>
     <w:sectPr/>
   </w:body>
 </w:document>

</xml_diff>